<commit_message>
Requisitos v1.1: documentación ordenada y análisis de brechas
- docs/requisitos_v1.1.md (+ Word) y borrador v0.1 en docs/word/historico/.
- docs/brechas-requisitos-v1.1.md: matriz de cobertura RF/RNF/CU/MOD,
  diferencias código-documento, decisiones y plan de sesiones.
- Prompt de trabajo en docs/prompts/.
- generar_word.py: fechas fijas dentro del ZIP (Word reproducibles).

Co-Authored-By: Claude Opus 5.5 <noreply@anthropic.com>
</commit_message>
<xml_diff>
--- a/docs/word/Guia-tecnica.docx
+++ b/docs/word/Guia-tecnica.docx
@@ -422,7 +422,16 @@
         <w:rPr>
           <w:rStyle w:val="VerbatimChar"/>
         </w:rPr>
-        <w:t xml:space="preserve">├── docs/                 Esta guía + notas de cada sesión de trabajo</w:t>
+        <w:t xml:space="preserve">├── docs/                 Esta guía, requisitos v1.1, análisis de brechas, notas de sesión,</w:t>
+      </w:r>
+      <w:r>
+        <w:br/>
+      </w:r>
+      <w:r>
+        <w:rPr>
+          <w:rStyle w:val="VerbatimChar"/>
+        </w:rPr>
+        <w:t xml:space="preserve">│                         prompts de trabajo (docs/prompts/) y versiones Word (docs/word/)</w:t>
       </w:r>
       <w:r>
         <w:br/>
@@ -7654,7 +7663,13 @@
         <w:t xml:space="preserve"> </w:t>
       </w:r>
       <w:r>
-        <w:t xml:space="preserve">el Word sale idéntico y git no lo marca como modificado.</w:t>
+        <w:t xml:space="preserve">el Word sale idéntico y git no lo marca como modificado. Como pandoc no aplica esa fecha a las</w:t>
+      </w:r>
+      <w:r>
+        <w:t xml:space="preserve"> </w:t>
+      </w:r>
+      <w:r>
+        <w:t xml:space="preserve">partes que copia de la plantilla, el script reescribe el ZIP con la misma fecha en todas las entradas.</w:t>
       </w:r>
     </w:p>
     <w:p>
@@ -8322,6 +8337,41 @@
             </w:pPr>
             <w:r>
               <w:t xml:space="preserve">2, 3.9, 11</w:t>
+            </w:r>
+          </w:p>
+        </w:tc>
+      </w:tr>
+      <w:tr>
+        <w:tc>
+          <w:tcPr/>
+          <w:p>
+            <w:pPr>
+              <w:pStyle w:val="Compact"/>
+            </w:pPr>
+            <w:r>
+              <w:t xml:space="preserve">2026-10-26</w:t>
+            </w:r>
+          </w:p>
+        </w:tc>
+        <w:tc>
+          <w:tcPr/>
+          <w:p>
+            <w:pPr>
+              <w:pStyle w:val="Compact"/>
+            </w:pPr>
+            <w:r>
+              <w:t xml:space="preserve">Incorporación del documento de requisitos v1.1 y del análisis de brechas (cobertura, decisiones pendientes y plan de sesiones). Sin cambios de código.</w:t>
+            </w:r>
+          </w:p>
+        </w:tc>
+        <w:tc>
+          <w:tcPr/>
+          <w:p>
+            <w:pPr>
+              <w:pStyle w:val="Compact"/>
+            </w:pPr>
+            <w:r>
+              <w:t xml:space="preserve">1</w:t>
             </w:r>
           </w:p>
         </w:tc>

</xml_diff>

<commit_message>
Sesión 6: usuarios, roles, permisos, login y auditoría
CU-17 · RF-20 (usuario que resuelve), RF-53, RF-55, RNF-03 · MOD-13

- Módulo usuarios: roles ROL-01 a ROL-07 y matriz de permisos por módulo
  (lectura/escritura) según las secciones 7 y 12 del documento.
- Contraseñas con hash Argon2 detrás del puerto HasherContrasenas.
- Login en el panel con cookie de sesión firmada; token Bearer para la API;
  401/403 en la API y redirección a /login o página 403 en el panel.
- Menú según el rol; páginas Usuarios, Auditoría y Mi cuenta.
- Auditoría de cargas, cotizaciones, alertas y usuarios (valor anterior y
  nuevo en JSONB); el actor viaja con la unidad de trabajo.
- HTMX: resolver una alerta reemplaza sólo su fila.
- Comando flota crear-usuario; datos-demo crea un usuario por rol.
- Migración probada en PostgreSQL y SQLite. Tests: de 90 a 112.

Co-Authored-By: Claude Opus 5.5 <noreply@anthropic.com>
</commit_message>
<xml_diff>
--- a/docs/word/Guia-tecnica.docx
+++ b/docs/word/Guia-tecnica.docx
@@ -564,6 +564,15 @@
         <w:rPr>
           <w:rStyle w:val="VerbatimChar"/>
         </w:rPr>
+        <w:t xml:space="preserve">    ├── usuarios/         MOD-13 Usuarios, roles, permisos, login y auditoría</w:t>
+      </w:r>
+      <w:r>
+        <w:br/>
+      </w:r>
+      <w:r>
+        <w:rPr>
+          <w:rStyle w:val="VerbatimChar"/>
+        </w:rPr>
         <w:t xml:space="preserve">    ├── web/              Plantillas, estilos y utilidades del panel</w:t>
       </w:r>
       <w:r>
@@ -6251,7 +6260,7 @@
     </w:p>
     <w:bookmarkEnd w:id="29"/>
     <w:bookmarkEnd w:id="30"/>
-    <w:bookmarkStart w:id="38" w:name="X6c7afff8b1a7319f42942bf1ba28a411de11d76"/>
+    <w:bookmarkStart w:id="40" w:name="X6c7afff8b1a7319f42942bf1ba28a411de11d76"/>
     <w:p>
       <w:pPr>
         <w:pStyle w:val="Heading1"/>
@@ -8195,6 +8204,1010 @@
         <w:t xml:space="preserve">, …).</w:t>
       </w:r>
     </w:p>
+    <w:bookmarkEnd w:id="37"/>
+    <w:bookmarkStart w:id="38" w:name="Xed9e7de7e8825f4471482bbe3b6708910ac39d0"/>
+    <w:p>
+      <w:pPr>
+        <w:pStyle w:val="Heading2"/>
+      </w:pPr>
+      <w:r>
+        <w:t xml:space="preserve">4.8 Seguridad: contraseñas, sesiones y permisos (RF-53, RNF-03)</w:t>
+      </w:r>
+    </w:p>
+    <w:p>
+      <w:pPr>
+        <w:pStyle w:val="FirstParagraph"/>
+      </w:pPr>
+      <w:r>
+        <w:rPr>
+          <w:b/>
+          <w:bCs/>
+        </w:rPr>
+        <w:t xml:space="preserve">Contraseñas —</w:t>
+      </w:r>
+      <w:r>
+        <w:rPr>
+          <w:b/>
+          <w:bCs/>
+        </w:rPr>
+        <w:t xml:space="preserve"> </w:t>
+      </w:r>
+      <w:r>
+        <w:rPr>
+          <w:rStyle w:val="VerbatimChar"/>
+          <w:b/>
+          <w:bCs/>
+        </w:rPr>
+        <w:t xml:space="preserve">argon2-cffi</w:t>
+      </w:r>
+      <w:r>
+        <w:t xml:space="preserve"> </w:t>
+      </w:r>
+      <w:r>
+        <w:t xml:space="preserve">(usuarios/infrastructure/repositorios.py):</w:t>
+      </w:r>
+      <w:r>
+        <w:t xml:space="preserve"> </w:t>
+      </w:r>
+      <w:r>
+        <w:t xml:space="preserve">nunca se guarda la contraseña, sólo su</w:t>
+      </w:r>
+      <w:r>
+        <w:t xml:space="preserve"> </w:t>
+      </w:r>
+      <w:r>
+        <w:rPr>
+          <w:b/>
+          <w:bCs/>
+        </w:rPr>
+        <w:t xml:space="preserve">hash</w:t>
+      </w:r>
+      <w:r>
+        <w:t xml:space="preserve"> </w:t>
+      </w:r>
+      <w:r>
+        <w:t xml:space="preserve">Argon2: una "huella" irreversible que incluye una</w:t>
+      </w:r>
+      <w:r>
+        <w:t xml:space="preserve"> </w:t>
+      </w:r>
+      <w:r>
+        <w:t xml:space="preserve">sal aleatoria. Para verificar, se vuelve a calcular y se compara. Argon2 es lento a propósito: probar</w:t>
+      </w:r>
+      <w:r>
+        <w:t xml:space="preserve"> </w:t>
+      </w:r>
+      <w:r>
+        <w:t xml:space="preserve">millones de contraseñas lleva demasiado tiempo. El dominio no sabe qué algoritmo se usa: depende del</w:t>
+      </w:r>
+      <w:r>
+        <w:t xml:space="preserve"> </w:t>
+      </w:r>
+      <w:r>
+        <w:t xml:space="preserve">puerto</w:t>
+      </w:r>
+      <w:r>
+        <w:t xml:space="preserve"> </w:t>
+      </w:r>
+      <w:r>
+        <w:rPr>
+          <w:rStyle w:val="VerbatimChar"/>
+        </w:rPr>
+        <w:t xml:space="preserve">HasherContrasenas</w:t>
+      </w:r>
+      <w:r>
+        <w:t xml:space="preserve"> </w:t>
+      </w:r>
+      <w:r>
+        <w:t xml:space="preserve">(en los tests se usa</w:t>
+      </w:r>
+      <w:r>
+        <w:t xml:space="preserve"> </w:t>
+      </w:r>
+      <w:r>
+        <w:rPr>
+          <w:rStyle w:val="VerbatimChar"/>
+        </w:rPr>
+        <w:t xml:space="preserve">HasherFake</w:t>
+      </w:r>
+      <w:r>
+        <w:t xml:space="preserve">, instantáneo).</w:t>
+      </w:r>
+    </w:p>
+    <w:p>
+      <w:pPr>
+        <w:pStyle w:val="BodyText"/>
+      </w:pPr>
+      <w:r>
+        <w:rPr>
+          <w:b/>
+          <w:bCs/>
+        </w:rPr>
+        <w:t xml:space="preserve">Sesión del panel —</w:t>
+      </w:r>
+      <w:r>
+        <w:rPr>
+          <w:b/>
+          <w:bCs/>
+        </w:rPr>
+        <w:t xml:space="preserve"> </w:t>
+      </w:r>
+      <w:r>
+        <w:rPr>
+          <w:rStyle w:val="VerbatimChar"/>
+          <w:b/>
+          <w:bCs/>
+        </w:rPr>
+        <w:t xml:space="preserve">SessionMiddleware</w:t>
+      </w:r>
+      <w:r>
+        <w:rPr>
+          <w:b/>
+          <w:bCs/>
+        </w:rPr>
+        <w:t xml:space="preserve"> </w:t>
+      </w:r>
+      <w:r>
+        <w:rPr>
+          <w:b/>
+          <w:bCs/>
+        </w:rPr>
+        <w:t xml:space="preserve">+</w:t>
+      </w:r>
+      <w:r>
+        <w:rPr>
+          <w:b/>
+          <w:bCs/>
+        </w:rPr>
+        <w:t xml:space="preserve"> </w:t>
+      </w:r>
+      <w:r>
+        <w:rPr>
+          <w:rStyle w:val="VerbatimChar"/>
+          <w:b/>
+          <w:bCs/>
+        </w:rPr>
+        <w:t xml:space="preserve">itsdangerous</w:t>
+      </w:r>
+      <w:r>
+        <w:t xml:space="preserve"> </w:t>
+      </w:r>
+      <w:r>
+        <w:t xml:space="preserve">(main.py):</w:t>
+      </w:r>
+      <w:r>
+        <w:t xml:space="preserve"> </w:t>
+      </w:r>
+      <w:r>
+        <w:t xml:space="preserve">un</w:t>
+      </w:r>
+      <w:r>
+        <w:t xml:space="preserve"> </w:t>
+      </w:r>
+      <w:r>
+        <w:rPr>
+          <w:i/>
+          <w:iCs/>
+        </w:rPr>
+        <w:t xml:space="preserve">middleware</w:t>
+      </w:r>
+      <w:r>
+        <w:t xml:space="preserve"> </w:t>
+      </w:r>
+      <w:r>
+        <w:t xml:space="preserve">es código que envuelve TODOS los pedidos. Éste guarda</w:t>
+      </w:r>
+      <w:r>
+        <w:t xml:space="preserve"> </w:t>
+      </w:r>
+      <w:r>
+        <w:rPr>
+          <w:rStyle w:val="VerbatimChar"/>
+        </w:rPr>
+        <w:t xml:space="preserve">request.session</w:t>
+      </w:r>
+      <w:r>
+        <w:t xml:space="preserve"> </w:t>
+      </w:r>
+      <w:r>
+        <w:t xml:space="preserve">en una</w:t>
+      </w:r>
+      <w:r>
+        <w:t xml:space="preserve"> </w:t>
+      </w:r>
+      <w:r>
+        <w:t xml:space="preserve">cookie</w:t>
+      </w:r>
+      <w:r>
+        <w:t xml:space="preserve"> </w:t>
+      </w:r>
+      <w:r>
+        <w:rPr>
+          <w:b/>
+          <w:bCs/>
+        </w:rPr>
+        <w:t xml:space="preserve">firmada</w:t>
+      </w:r>
+      <w:r>
+        <w:t xml:space="preserve"> </w:t>
+      </w:r>
+      <w:r>
+        <w:t xml:space="preserve">con</w:t>
+      </w:r>
+      <w:r>
+        <w:t xml:space="preserve"> </w:t>
+      </w:r>
+      <w:r>
+        <w:rPr>
+          <w:rStyle w:val="VerbatimChar"/>
+        </w:rPr>
+        <w:t xml:space="preserve">SECRET_KEY</w:t>
+      </w:r>
+      <w:r>
+        <w:t xml:space="preserve">: el navegador la ve pero no puede cambiarla sin invalidar la</w:t>
+      </w:r>
+      <w:r>
+        <w:t xml:space="preserve"> </w:t>
+      </w:r>
+      <w:r>
+        <w:t xml:space="preserve">firma.</w:t>
+      </w:r>
+      <w:r>
+        <w:t xml:space="preserve"> </w:t>
+      </w:r>
+      <w:r>
+        <w:rPr>
+          <w:rStyle w:val="VerbatimChar"/>
+        </w:rPr>
+        <w:t xml:space="preserve">same_site="lax"</w:t>
+      </w:r>
+      <w:r>
+        <w:t xml:space="preserve"> </w:t>
+      </w:r>
+      <w:r>
+        <w:t xml:space="preserve">evita que otro sitio envíe formularios con la sesión del usuario (CSRF).</w:t>
+      </w:r>
+    </w:p>
+    <w:p>
+      <w:pPr>
+        <w:pStyle w:val="BodyText"/>
+      </w:pPr>
+      <w:r>
+        <w:rPr>
+          <w:b/>
+          <w:bCs/>
+        </w:rPr>
+        <w:t xml:space="preserve">Token de la API</w:t>
+      </w:r>
+      <w:r>
+        <w:t xml:space="preserve"> </w:t>
+      </w:r>
+      <w:r>
+        <w:t xml:space="preserve">(usuarios/presentation/seguridad.py):</w:t>
+      </w:r>
+      <w:r>
+        <w:t xml:space="preserve"> </w:t>
+      </w:r>
+      <w:r>
+        <w:rPr>
+          <w:rStyle w:val="VerbatimChar"/>
+        </w:rPr>
+        <w:t xml:space="preserve">POST /api/v1/auth/token</w:t>
+      </w:r>
+      <w:r>
+        <w:t xml:space="preserve"> </w:t>
+      </w:r>
+      <w:r>
+        <w:t xml:space="preserve">devuelve un texto firmado con</w:t>
+      </w:r>
+      <w:r>
+        <w:t xml:space="preserve"> </w:t>
+      </w:r>
+      <w:r>
+        <w:rPr>
+          <w:rStyle w:val="VerbatimChar"/>
+        </w:rPr>
+        <w:t xml:space="preserve">URLSafeTimedSerializer</w:t>
+      </w:r>
+      <w:r>
+        <w:t xml:space="preserve"> </w:t>
+      </w:r>
+      <w:r>
+        <w:t xml:space="preserve">que vence en 12 h;</w:t>
+      </w:r>
+      <w:r>
+        <w:t xml:space="preserve"> </w:t>
+      </w:r>
+      <w:r>
+        <w:t xml:space="preserve">se envía como</w:t>
+      </w:r>
+      <w:r>
+        <w:t xml:space="preserve"> </w:t>
+      </w:r>
+      <w:r>
+        <w:rPr>
+          <w:rStyle w:val="VerbatimChar"/>
+        </w:rPr>
+        <w:t xml:space="preserve">Authorization: Bearer &lt;token&gt;</w:t>
+      </w:r>
+      <w:r>
+        <w:t xml:space="preserve">.</w:t>
+      </w:r>
+    </w:p>
+    <w:p>
+      <w:pPr>
+        <w:pStyle w:val="BodyText"/>
+      </w:pPr>
+      <w:r>
+        <w:rPr>
+          <w:b/>
+          <w:bCs/>
+        </w:rPr>
+        <w:t xml:space="preserve">Permisos — dependencias de FastAPI:</w:t>
+      </w:r>
+    </w:p>
+    <w:p>
+      <w:pPr>
+        <w:pStyle w:val="SourceCode"/>
+      </w:pPr>
+      <w:r>
+        <w:rPr>
+          <w:rStyle w:val="NormalTok"/>
+        </w:rPr>
+        <w:t xml:space="preserve">router </w:t>
+      </w:r>
+      <w:r>
+        <w:rPr>
+          <w:rStyle w:val="OperatorTok"/>
+        </w:rPr>
+        <w:t xml:space="preserve">=</w:t>
+      </w:r>
+      <w:r>
+        <w:rPr>
+          <w:rStyle w:val="NormalTok"/>
+        </w:rPr>
+        <w:t xml:space="preserve"> APIRouter(dependencies</w:t>
+      </w:r>
+      <w:r>
+        <w:rPr>
+          <w:rStyle w:val="OperatorTok"/>
+        </w:rPr>
+        <w:t xml:space="preserve">=</w:t>
+      </w:r>
+      <w:r>
+        <w:rPr>
+          <w:rStyle w:val="NormalTok"/>
+        </w:rPr>
+        <w:t xml:space="preserve">requiere(Modulo.COMBUSTIBLE))   </w:t>
+      </w:r>
+      <w:r>
+        <w:rPr>
+          <w:rStyle w:val="CommentTok"/>
+        </w:rPr>
+        <w:t xml:space="preserve"># todo el router</w:t>
+      </w:r>
+      <w:r>
+        <w:br/>
+      </w:r>
+      <w:r>
+        <w:br/>
+      </w:r>
+      <w:r>
+        <w:rPr>
+          <w:rStyle w:val="KeywordTok"/>
+        </w:rPr>
+        <w:t xml:space="preserve">class</w:t>
+      </w:r>
+      <w:r>
+        <w:rPr>
+          <w:rStyle w:val="NormalTok"/>
+        </w:rPr>
+        <w:t xml:space="preserve"> Permiso:</w:t>
+      </w:r>
+      <w:r>
+        <w:br/>
+      </w:r>
+      <w:r>
+        <w:rPr>
+          <w:rStyle w:val="NormalTok"/>
+        </w:rPr>
+        <w:t xml:space="preserve">    </w:t>
+      </w:r>
+      <w:r>
+        <w:rPr>
+          <w:rStyle w:val="KeywordTok"/>
+        </w:rPr>
+        <w:t xml:space="preserve">def</w:t>
+      </w:r>
+      <w:r>
+        <w:rPr>
+          <w:rStyle w:val="NormalTok"/>
+        </w:rPr>
+        <w:t xml:space="preserve"> </w:t>
+      </w:r>
+      <w:r>
+        <w:rPr>
+          <w:rStyle w:val="FunctionTok"/>
+        </w:rPr>
+        <w:t xml:space="preserve">__call__</w:t>
+      </w:r>
+      <w:r>
+        <w:rPr>
+          <w:rStyle w:val="NormalTok"/>
+        </w:rPr>
+        <w:t xml:space="preserve">(</w:t>
+      </w:r>
+      <w:r>
+        <w:rPr>
+          <w:rStyle w:val="VariableTok"/>
+        </w:rPr>
+        <w:t xml:space="preserve">self</w:t>
+      </w:r>
+      <w:r>
+        <w:rPr>
+          <w:rStyle w:val="NormalTok"/>
+        </w:rPr>
+        <w:t xml:space="preserve">, request: Request, usuario: UsuarioActual) </w:t>
+      </w:r>
+      <w:r>
+        <w:rPr>
+          <w:rStyle w:val="OperatorTok"/>
+        </w:rPr>
+        <w:t xml:space="preserve">-&gt;</w:t>
+      </w:r>
+      <w:r>
+        <w:rPr>
+          <w:rStyle w:val="NormalTok"/>
+        </w:rPr>
+        <w:t xml:space="preserve"> Usuario:   </w:t>
+      </w:r>
+      <w:r>
+        <w:rPr>
+          <w:rStyle w:val="CommentTok"/>
+        </w:rPr>
+        <w:t xml:space="preserve"># un objeto "llamable"</w:t>
+      </w:r>
+      <w:r>
+        <w:br/>
+      </w:r>
+      <w:r>
+        <w:rPr>
+          <w:rStyle w:val="NormalTok"/>
+        </w:rPr>
+        <w:t xml:space="preserve">        nivel </w:t>
+      </w:r>
+      <w:r>
+        <w:rPr>
+          <w:rStyle w:val="OperatorTok"/>
+        </w:rPr>
+        <w:t xml:space="preserve">=</w:t>
+      </w:r>
+      <w:r>
+        <w:rPr>
+          <w:rStyle w:val="NormalTok"/>
+        </w:rPr>
+        <w:t xml:space="preserve"> Nivel.LECTURA </w:t>
+      </w:r>
+      <w:r>
+        <w:rPr>
+          <w:rStyle w:val="ControlFlowTok"/>
+        </w:rPr>
+        <w:t xml:space="preserve">if</w:t>
+      </w:r>
+      <w:r>
+        <w:rPr>
+          <w:rStyle w:val="NormalTok"/>
+        </w:rPr>
+        <w:t xml:space="preserve"> request.method </w:t>
+      </w:r>
+      <w:r>
+        <w:rPr>
+          <w:rStyle w:val="KeywordTok"/>
+        </w:rPr>
+        <w:t xml:space="preserve">in</w:t>
+      </w:r>
+      <w:r>
+        <w:rPr>
+          <w:rStyle w:val="NormalTok"/>
+        </w:rPr>
+        <w:t xml:space="preserve"> METODOS_DE_LECTURA </w:t>
+      </w:r>
+      <w:r>
+        <w:rPr>
+          <w:rStyle w:val="ControlFlowTok"/>
+        </w:rPr>
+        <w:t xml:space="preserve">else</w:t>
+      </w:r>
+      <w:r>
+        <w:rPr>
+          <w:rStyle w:val="NormalTok"/>
+        </w:rPr>
+        <w:t xml:space="preserve"> Nivel.ESCRITURA</w:t>
+      </w:r>
+      <w:r>
+        <w:br/>
+      </w:r>
+      <w:r>
+        <w:rPr>
+          <w:rStyle w:val="NormalTok"/>
+        </w:rPr>
+        <w:t xml:space="preserve">        usuario.exigir(</w:t>
+      </w:r>
+      <w:r>
+        <w:rPr>
+          <w:rStyle w:val="VariableTok"/>
+        </w:rPr>
+        <w:t xml:space="preserve">self</w:t>
+      </w:r>
+      <w:r>
+        <w:rPr>
+          <w:rStyle w:val="NormalTok"/>
+        </w:rPr>
+        <w:t xml:space="preserve">.modulo, nivel)</w:t>
+      </w:r>
+    </w:p>
+    <w:p>
+      <w:pPr>
+        <w:pStyle w:val="Compact"/>
+        <w:numPr>
+          <w:ilvl w:val="0"/>
+          <w:numId w:val="1015"/>
+        </w:numPr>
+      </w:pPr>
+      <w:r>
+        <w:t xml:space="preserve">Una clase con</w:t>
+      </w:r>
+      <w:r>
+        <w:t xml:space="preserve"> </w:t>
+      </w:r>
+      <w:r>
+        <w:rPr>
+          <w:rStyle w:val="VerbatimChar"/>
+        </w:rPr>
+        <w:t xml:space="preserve">__call__</w:t>
+      </w:r>
+      <w:r>
+        <w:t xml:space="preserve"> </w:t>
+      </w:r>
+      <w:r>
+        <w:t xml:space="preserve">se usa como función:</w:t>
+      </w:r>
+      <w:r>
+        <w:t xml:space="preserve"> </w:t>
+      </w:r>
+      <w:r>
+        <w:rPr>
+          <w:rStyle w:val="VerbatimChar"/>
+        </w:rPr>
+        <w:t xml:space="preserve">Permiso(Modulo.X)</w:t>
+      </w:r>
+      <w:r>
+        <w:t xml:space="preserve"> </w:t>
+      </w:r>
+      <w:r>
+        <w:rPr>
+          <w:b/>
+          <w:bCs/>
+        </w:rPr>
+        <w:t xml:space="preserve">configura</w:t>
+      </w:r>
+      <w:r>
+        <w:t xml:space="preserve"> </w:t>
+      </w:r>
+      <w:r>
+        <w:t xml:space="preserve">la dependencia y</w:t>
+      </w:r>
+      <w:r>
+        <w:t xml:space="preserve"> </w:t>
+      </w:r>
+      <w:r>
+        <w:t xml:space="preserve">FastAPI la</w:t>
+      </w:r>
+      <w:r>
+        <w:t xml:space="preserve"> </w:t>
+      </w:r>
+      <w:r>
+        <w:rPr>
+          <w:b/>
+          <w:bCs/>
+        </w:rPr>
+        <w:t xml:space="preserve">llama</w:t>
+      </w:r>
+      <w:r>
+        <w:t xml:space="preserve"> </w:t>
+      </w:r>
+      <w:r>
+        <w:t xml:space="preserve">en cada pedido.</w:t>
+      </w:r>
+    </w:p>
+    <w:p>
+      <w:pPr>
+        <w:pStyle w:val="Compact"/>
+        <w:numPr>
+          <w:ilvl w:val="0"/>
+          <w:numId w:val="1015"/>
+        </w:numPr>
+      </w:pPr>
+      <w:r>
+        <w:t xml:space="preserve">Las dependencias se encadenan:</w:t>
+      </w:r>
+      <w:r>
+        <w:t xml:space="preserve"> </w:t>
+      </w:r>
+      <w:r>
+        <w:rPr>
+          <w:rStyle w:val="VerbatimChar"/>
+        </w:rPr>
+        <w:t xml:space="preserve">Permiso</w:t>
+      </w:r>
+      <w:r>
+        <w:t xml:space="preserve"> </w:t>
+      </w:r>
+      <w:r>
+        <w:t xml:space="preserve">necesita</w:t>
+      </w:r>
+      <w:r>
+        <w:t xml:space="preserve"> </w:t>
+      </w:r>
+      <w:r>
+        <w:rPr>
+          <w:rStyle w:val="VerbatimChar"/>
+        </w:rPr>
+        <w:t xml:space="preserve">usuario_actual</w:t>
+      </w:r>
+      <w:r>
+        <w:t xml:space="preserve">, que necesita la unidad de</w:t>
+      </w:r>
+      <w:r>
+        <w:t xml:space="preserve"> </w:t>
+      </w:r>
+      <w:r>
+        <w:t xml:space="preserve">trabajo. FastAPI resuelve el árbol y</w:t>
+      </w:r>
+      <w:r>
+        <w:t xml:space="preserve"> </w:t>
+      </w:r>
+      <w:r>
+        <w:rPr>
+          <w:b/>
+          <w:bCs/>
+        </w:rPr>
+        <w:t xml:space="preserve">reutiliza</w:t>
+      </w:r>
+      <w:r>
+        <w:t xml:space="preserve"> </w:t>
+      </w:r>
+      <w:r>
+        <w:t xml:space="preserve">cada dependencia dentro del mismo pedido: por eso</w:t>
+      </w:r>
+      <w:r>
+        <w:t xml:space="preserve"> </w:t>
+      </w:r>
+      <w:r>
+        <w:rPr>
+          <w:rStyle w:val="VerbatimChar"/>
+        </w:rPr>
+        <w:t xml:space="preserve">usuario_actual</w:t>
+      </w:r>
+      <w:r>
+        <w:t xml:space="preserve"> </w:t>
+      </w:r>
+      <w:r>
+        <w:t xml:space="preserve">puede fijar</w:t>
+      </w:r>
+      <w:r>
+        <w:t xml:space="preserve"> </w:t>
+      </w:r>
+      <w:r>
+        <w:rPr>
+          <w:rStyle w:val="VerbatimChar"/>
+        </w:rPr>
+        <w:t xml:space="preserve">uow.actor</w:t>
+      </w:r>
+      <w:r>
+        <w:t xml:space="preserve"> </w:t>
+      </w:r>
+      <w:r>
+        <w:t xml:space="preserve">y el caso de uso de la ruta usa esa misma unidad de trabajo.</w:t>
+      </w:r>
+    </w:p>
+    <w:p>
+      <w:pPr>
+        <w:pStyle w:val="Compact"/>
+        <w:numPr>
+          <w:ilvl w:val="0"/>
+          <w:numId w:val="1015"/>
+        </w:numPr>
+      </w:pPr>
+      <w:r>
+        <w:t xml:space="preserve">La matriz de permisos está en el</w:t>
+      </w:r>
+      <w:r>
+        <w:t xml:space="preserve"> </w:t>
+      </w:r>
+      <w:r>
+        <w:rPr>
+          <w:b/>
+          <w:bCs/>
+        </w:rPr>
+        <w:t xml:space="preserve">dominio</w:t>
+      </w:r>
+      <w:r>
+        <w:t xml:space="preserve"> </w:t>
+      </w:r>
+      <w:r>
+        <w:t xml:space="preserve">(usuarios/domain/entidades.py,</w:t>
+      </w:r>
+      <w:r>
+        <w:t xml:space="preserve"> </w:t>
+      </w:r>
+      <w:r>
+        <w:rPr>
+          <w:rStyle w:val="VerbatimChar"/>
+        </w:rPr>
+        <w:t xml:space="preserve">PERMISOS</w:t>
+      </w:r>
+      <w:r>
+        <w:t xml:space="preserve">):</w:t>
+      </w:r>
+      <w:r>
+        <w:t xml:space="preserve"> </w:t>
+      </w:r>
+      <w:r>
+        <w:t xml:space="preserve">GET exige lectura; POST/PUT, escritura.</w:t>
+      </w:r>
+    </w:p>
+    <w:p>
+      <w:pPr>
+        <w:pStyle w:val="Compact"/>
+        <w:numPr>
+          <w:ilvl w:val="0"/>
+          <w:numId w:val="1015"/>
+        </w:numPr>
+      </w:pPr>
+      <w:r>
+        <w:rPr>
+          <w:rStyle w:val="VerbatimChar"/>
+        </w:rPr>
+        <w:t xml:space="preserve">NoAutenticado</w:t>
+      </w:r>
+      <w:r>
+        <w:t xml:space="preserve"> </w:t>
+      </w:r>
+      <w:r>
+        <w:t xml:space="preserve">→ 401 en la API y redirección a</w:t>
+      </w:r>
+      <w:r>
+        <w:t xml:space="preserve"> </w:t>
+      </w:r>
+      <w:r>
+        <w:rPr>
+          <w:rStyle w:val="VerbatimChar"/>
+        </w:rPr>
+        <w:t xml:space="preserve">/login</w:t>
+      </w:r>
+      <w:r>
+        <w:t xml:space="preserve"> </w:t>
+      </w:r>
+      <w:r>
+        <w:t xml:space="preserve">en el panel;</w:t>
+      </w:r>
+      <w:r>
+        <w:t xml:space="preserve"> </w:t>
+      </w:r>
+      <w:r>
+        <w:rPr>
+          <w:rStyle w:val="VerbatimChar"/>
+        </w:rPr>
+        <w:t xml:space="preserve">SinPermiso</w:t>
+      </w:r>
+      <w:r>
+        <w:t xml:space="preserve"> </w:t>
+      </w:r>
+      <w:r>
+        <w:t xml:space="preserve">→ 403.</w:t>
+      </w:r>
+    </w:p>
+    <w:bookmarkEnd w:id="38"/>
+    <w:bookmarkStart w:id="39" w:name="Xa398356d059aa23adc4ed6eb72e7ff90008920b"/>
+    <w:p>
+      <w:pPr>
+        <w:pStyle w:val="Heading2"/>
+      </w:pPr>
+      <w:r>
+        <w:t xml:space="preserve">4.9 HTMX — actualizar partes de la página sin JavaScript propio</w:t>
+      </w:r>
+    </w:p>
+    <w:p>
+      <w:pPr>
+        <w:pStyle w:val="FirstParagraph"/>
+      </w:pPr>
+      <w:r>
+        <w:t xml:space="preserve">En _fila_alerta.html:</w:t>
+      </w:r>
+    </w:p>
+    <w:p>
+      <w:pPr>
+        <w:pStyle w:val="SourceCode"/>
+      </w:pPr>
+      <w:r>
+        <w:rPr>
+          <w:rStyle w:val="DataTypeTok"/>
+        </w:rPr>
+        <w:t xml:space="preserve">&lt;</w:t>
+      </w:r>
+      <w:r>
+        <w:rPr>
+          <w:rStyle w:val="KeywordTok"/>
+        </w:rPr>
+        <w:t xml:space="preserve">form</w:t>
+      </w:r>
+      <w:r>
+        <w:rPr>
+          <w:rStyle w:val="OtherTok"/>
+        </w:rPr>
+        <w:t xml:space="preserve"> method</w:t>
+      </w:r>
+      <w:r>
+        <w:rPr>
+          <w:rStyle w:val="OperatorTok"/>
+        </w:rPr>
+        <w:t xml:space="preserve">=</w:t>
+      </w:r>
+      <w:r>
+        <w:rPr>
+          <w:rStyle w:val="StringTok"/>
+        </w:rPr>
+        <w:t xml:space="preserve">"post"</w:t>
+      </w:r>
+      <w:r>
+        <w:rPr>
+          <w:rStyle w:val="OtherTok"/>
+        </w:rPr>
+        <w:t xml:space="preserve"> action</w:t>
+      </w:r>
+      <w:r>
+        <w:rPr>
+          <w:rStyle w:val="OperatorTok"/>
+        </w:rPr>
+        <w:t xml:space="preserve">=</w:t>
+      </w:r>
+      <w:r>
+        <w:rPr>
+          <w:rStyle w:val="StringTok"/>
+        </w:rPr>
+        <w:t xml:space="preserve">"/alertas/{{ a.id }}"</w:t>
+      </w:r>
+      <w:r>
+        <w:br/>
+      </w:r>
+      <w:r>
+        <w:rPr>
+          <w:rStyle w:val="OtherTok"/>
+        </w:rPr>
+        <w:t xml:space="preserve">      hx-post</w:t>
+      </w:r>
+      <w:r>
+        <w:rPr>
+          <w:rStyle w:val="OperatorTok"/>
+        </w:rPr>
+        <w:t xml:space="preserve">=</w:t>
+      </w:r>
+      <w:r>
+        <w:rPr>
+          <w:rStyle w:val="StringTok"/>
+        </w:rPr>
+        <w:t xml:space="preserve">"/alertas/{{ a.id }}"</w:t>
+      </w:r>
+      <w:r>
+        <w:rPr>
+          <w:rStyle w:val="OtherTok"/>
+        </w:rPr>
+        <w:t xml:space="preserve"> hx-target</w:t>
+      </w:r>
+      <w:r>
+        <w:rPr>
+          <w:rStyle w:val="OperatorTok"/>
+        </w:rPr>
+        <w:t xml:space="preserve">=</w:t>
+      </w:r>
+      <w:r>
+        <w:rPr>
+          <w:rStyle w:val="StringTok"/>
+        </w:rPr>
+        <w:t xml:space="preserve">"closest tr"</w:t>
+      </w:r>
+      <w:r>
+        <w:rPr>
+          <w:rStyle w:val="OtherTok"/>
+        </w:rPr>
+        <w:t xml:space="preserve"> hx-swap</w:t>
+      </w:r>
+      <w:r>
+        <w:rPr>
+          <w:rStyle w:val="OperatorTok"/>
+        </w:rPr>
+        <w:t xml:space="preserve">=</w:t>
+      </w:r>
+      <w:r>
+        <w:rPr>
+          <w:rStyle w:val="StringTok"/>
+        </w:rPr>
+        <w:t xml:space="preserve">"outerHTML"</w:t>
+      </w:r>
+      <w:r>
+        <w:rPr>
+          <w:rStyle w:val="DataTypeTok"/>
+        </w:rPr>
+        <w:t xml:space="preserve">&gt;</w:t>
+      </w:r>
+    </w:p>
+    <w:p>
+      <w:pPr>
+        <w:pStyle w:val="FirstParagraph"/>
+      </w:pPr>
+      <w:r>
+        <w:t xml:space="preserve">HTMX (una librería de 14 KB) lee los atributos</w:t>
+      </w:r>
+      <w:r>
+        <w:t xml:space="preserve"> </w:t>
+      </w:r>
+      <w:r>
+        <w:rPr>
+          <w:rStyle w:val="VerbatimChar"/>
+        </w:rPr>
+        <w:t xml:space="preserve">hx-*</w:t>
+      </w:r>
+      <w:r>
+        <w:t xml:space="preserve">: envía el formulario por detrás y reemplaza</w:t>
+      </w:r>
+      <w:r>
+        <w:t xml:space="preserve"> </w:t>
+      </w:r>
+      <w:r>
+        <w:rPr>
+          <w:b/>
+          <w:bCs/>
+        </w:rPr>
+        <w:t xml:space="preserve">sólo la fila</w:t>
+      </w:r>
+      <w:r>
+        <w:t xml:space="preserve"> </w:t>
+      </w:r>
+      <w:r>
+        <w:t xml:space="preserve">con el HTML que devuelve el servidor. La ruta detecta el encabezado</w:t>
+      </w:r>
+      <w:r>
+        <w:t xml:space="preserve"> </w:t>
+      </w:r>
+      <w:r>
+        <w:rPr>
+          <w:rStyle w:val="VerbatimChar"/>
+        </w:rPr>
+        <w:t xml:space="preserve">HX-Request</w:t>
+      </w:r>
+      <w:r>
+        <w:t xml:space="preserve"> </w:t>
+      </w:r>
+      <w:r>
+        <w:t xml:space="preserve">y responde con el fragmento (</w:t>
+      </w:r>
+      <w:r>
+        <w:rPr>
+          <w:rStyle w:val="VerbatimChar"/>
+        </w:rPr>
+        <w:t xml:space="preserve">fragmento(...)</w:t>
+      </w:r>
+      <w:r>
+        <w:t xml:space="preserve">); sin HTMX, el mismo formulario funciona con</w:t>
+      </w:r>
+      <w:r>
+        <w:t xml:space="preserve"> </w:t>
+      </w:r>
+      <w:r>
+        <w:t xml:space="preserve">Post/Redirect/Get. Es la decisión 4.1 del análisis de brechas: interactividad sin React.</w:t>
+      </w:r>
+    </w:p>
     <w:p>
       <w:r>
         <w:pict>
@@ -8202,9 +9215,9 @@
         </w:pict>
       </w:r>
     </w:p>
-    <w:bookmarkEnd w:id="37"/>
-    <w:bookmarkEnd w:id="38"/>
-    <w:bookmarkStart w:id="42" w:name="X344a4ce861fddb2bdbe703c388d899c32578c6d"/>
+    <w:bookmarkEnd w:id="39"/>
+    <w:bookmarkEnd w:id="40"/>
+    <w:bookmarkStart w:id="44" w:name="X344a4ce861fddb2bdbe703c388d899c32578c6d"/>
     <w:p>
       <w:pPr>
         <w:pStyle w:val="Heading1"/>
@@ -9382,8 +10395,104 @@
           </w:p>
         </w:tc>
       </w:tr>
+      <w:tr>
+        <w:tc>
+          <w:tcPr/>
+          <w:p>
+            <w:pPr>
+              <w:pStyle w:val="Compact"/>
+            </w:pPr>
+            <w:r>
+              <w:rPr>
+                <w:b/>
+                <w:bCs/>
+              </w:rPr>
+              <w:t xml:space="preserve">Contexto de la operación (actor)</w:t>
+            </w:r>
+          </w:p>
+        </w:tc>
+        <w:tc>
+          <w:tcPr/>
+          <w:p>
+            <w:pPr>
+              <w:pStyle w:val="Compact"/>
+            </w:pPr>
+            <w:r>
+              <w:rPr>
+                <w:rStyle w:val="VerbatimChar"/>
+              </w:rPr>
+              <w:t xml:space="preserve">uow.actor</w:t>
+            </w:r>
+            <w:r>
+              <w:t xml:space="preserve">,</w:t>
+            </w:r>
+            <w:r>
+              <w:t xml:space="preserve"> </w:t>
+            </w:r>
+            <w:r>
+              <w:rPr>
+                <w:rStyle w:val="VerbatimChar"/>
+              </w:rPr>
+              <w:t xml:space="preserve">uow.auditar(...)</w:t>
+            </w:r>
+          </w:p>
+        </w:tc>
+        <w:tc>
+          <w:tcPr/>
+          <w:p>
+            <w:pPr>
+              <w:pStyle w:val="Compact"/>
+            </w:pPr>
+            <w:r>
+              <w:t xml:space="preserve">Quién opera viaja con la unidad de trabajo: la auditoría lo registra sin pasarlo por parámetro.</w:t>
+            </w:r>
+          </w:p>
+        </w:tc>
+      </w:tr>
+      <w:tr>
+        <w:tc>
+          <w:tcPr/>
+          <w:p>
+            <w:pPr>
+              <w:pStyle w:val="Compact"/>
+            </w:pPr>
+            <w:r>
+              <w:rPr>
+                <w:b/>
+                <w:bCs/>
+              </w:rPr>
+              <w:t xml:space="preserve">Middleware</w:t>
+            </w:r>
+          </w:p>
+        </w:tc>
+        <w:tc>
+          <w:tcPr/>
+          <w:p>
+            <w:pPr>
+              <w:pStyle w:val="Compact"/>
+            </w:pPr>
+            <w:r>
+              <w:rPr>
+                <w:rStyle w:val="VerbatimChar"/>
+              </w:rPr>
+              <w:t xml:space="preserve">SessionMiddleware</w:t>
+            </w:r>
+          </w:p>
+        </w:tc>
+        <w:tc>
+          <w:tcPr/>
+          <w:p>
+            <w:pPr>
+              <w:pStyle w:val="Compact"/>
+            </w:pPr>
+            <w:r>
+              <w:t xml:space="preserve">Código que envuelve todos los pedidos (sesión).</w:t>
+            </w:r>
+          </w:p>
+        </w:tc>
+      </w:tr>
     </w:tbl>
-    <w:bookmarkStart w:id="39" w:name="Xe5ed2e1e66776987859c3ac158c5e8db4558dd3"/>
+    <w:bookmarkStart w:id="41" w:name="Xe5ed2e1e66776987859c3ac158c5e8db4558dd3"/>
     <w:p>
       <w:pPr>
         <w:pStyle w:val="Heading2"/>
@@ -9428,185 +10537,6 @@
           <w:rStyle w:val="VerbatimChar"/>
         </w:rPr>
         <w:t xml:space="preserve">                                   BusEventos ──► alertas: EvaluarAlertasViaje (su propia transacción)</w:t>
-      </w:r>
-    </w:p>
-    <w:p>
-      <w:pPr>
-        <w:pStyle w:val="Compact"/>
-        <w:numPr>
-          <w:ilvl w:val="0"/>
-          <w:numId w:val="1015"/>
-        </w:numPr>
-      </w:pPr>
-      <w:r>
-        <w:t xml:space="preserve">El caso de uso</w:t>
-      </w:r>
-      <w:r>
-        <w:t xml:space="preserve"> </w:t>
-      </w:r>
-      <w:r>
-        <w:rPr>
-          <w:b/>
-          <w:bCs/>
-        </w:rPr>
-        <w:t xml:space="preserve">registra</w:t>
-      </w:r>
-      <w:r>
-        <w:t xml:space="preserve"> </w:t>
-      </w:r>
-      <w:r>
-        <w:t xml:space="preserve">el evento en la unidad de trabajo (</w:t>
-      </w:r>
-      <w:r>
-        <w:rPr>
-          <w:rStyle w:val="VerbatimChar"/>
-        </w:rPr>
-        <w:t xml:space="preserve">uow.registrar_evento(...)</w:t>
-      </w:r>
-      <w:r>
-        <w:t xml:space="preserve">).</w:t>
-      </w:r>
-    </w:p>
-    <w:p>
-      <w:pPr>
-        <w:pStyle w:val="Compact"/>
-        <w:numPr>
-          <w:ilvl w:val="0"/>
-          <w:numId w:val="1015"/>
-        </w:numPr>
-      </w:pPr>
-      <w:r>
-        <w:rPr>
-          <w:rStyle w:val="VerbatimChar"/>
-        </w:rPr>
-        <w:t xml:space="preserve">commit()</w:t>
-      </w:r>
-      <w:r>
-        <w:t xml:space="preserve"> </w:t>
-      </w:r>
-      <w:r>
-        <w:t xml:space="preserve">confirma la transacción y</w:t>
-      </w:r>
-      <w:r>
-        <w:t xml:space="preserve"> </w:t>
-      </w:r>
-      <w:r>
-        <w:rPr>
-          <w:b/>
-          <w:bCs/>
-        </w:rPr>
-        <w:t xml:space="preserve">recién después</w:t>
-      </w:r>
-      <w:r>
-        <w:t xml:space="preserve"> </w:t>
-      </w:r>
-      <w:r>
-        <w:t xml:space="preserve">publica los eventos: si algo falla antes</w:t>
-      </w:r>
-      <w:r>
-        <w:t xml:space="preserve"> </w:t>
-      </w:r>
-      <w:r>
-        <w:t xml:space="preserve">del commit, no se avisa nada que no ocurrió.</w:t>
-      </w:r>
-    </w:p>
-    <w:p>
-      <w:pPr>
-        <w:pStyle w:val="Compact"/>
-        <w:numPr>
-          <w:ilvl w:val="0"/>
-          <w:numId w:val="1015"/>
-        </w:numPr>
-      </w:pPr>
-      <w:r>
-        <w:t xml:space="preserve">bootstrap.py arma el bus y suscribe los manejadores de cada módulo.</w:t>
-      </w:r>
-    </w:p>
-    <w:p>
-      <w:pPr>
-        <w:pStyle w:val="Compact"/>
-        <w:numPr>
-          <w:ilvl w:val="0"/>
-          <w:numId w:val="1015"/>
-        </w:numPr>
-      </w:pPr>
-      <w:r>
-        <w:t xml:space="preserve">Si un manejador falla, el error se registra y la operación original igual queda guardada.</w:t>
-      </w:r>
-    </w:p>
-    <w:p>
-      <w:pPr>
-        <w:pStyle w:val="Compact"/>
-        <w:numPr>
-          <w:ilvl w:val="0"/>
-          <w:numId w:val="1015"/>
-        </w:numPr>
-      </w:pPr>
-      <w:r>
-        <w:t xml:space="preserve">Así</w:t>
-      </w:r>
-      <w:r>
-        <w:t xml:space="preserve"> </w:t>
-      </w:r>
-      <w:r>
-        <w:rPr>
-          <w:rStyle w:val="VerbatimChar"/>
-        </w:rPr>
-        <w:t xml:space="preserve">viajes</w:t>
-      </w:r>
-      <w:r>
-        <w:t xml:space="preserve"> </w:t>
-      </w:r>
-      <w:r>
-        <w:t xml:space="preserve">y</w:t>
-      </w:r>
-      <w:r>
-        <w:t xml:space="preserve"> </w:t>
-      </w:r>
-      <w:r>
-        <w:rPr>
-          <w:rStyle w:val="VerbatimChar"/>
-        </w:rPr>
-        <w:t xml:space="preserve">combustible</w:t>
-      </w:r>
-      <w:r>
-        <w:t xml:space="preserve"> </w:t>
-      </w:r>
-      <w:r>
-        <w:t xml:space="preserve">no importan a</w:t>
-      </w:r>
-      <w:r>
-        <w:t xml:space="preserve"> </w:t>
-      </w:r>
-      <w:r>
-        <w:rPr>
-          <w:rStyle w:val="VerbatimChar"/>
-        </w:rPr>
-        <w:t xml:space="preserve">alertas</w:t>
-      </w:r>
-      <w:r>
-        <w:t xml:space="preserve"> </w:t>
-      </w:r>
-      <w:r>
-        <w:t xml:space="preserve">(que depende de ellos): no hay ciclos.</w:t>
-      </w:r>
-    </w:p>
-    <w:bookmarkEnd w:id="39"/>
-    <w:bookmarkStart w:id="40" w:name="X935b6c72f65704dddf0099554b6692ef1b815da"/>
-    <w:p>
-      <w:pPr>
-        <w:pStyle w:val="Heading2"/>
-      </w:pPr>
-      <w:r>
-        <w:t xml:space="preserve">Regla de negocio destacada: referencia de consumo (RF-11, RF-13, RF-16)</w:t>
-      </w:r>
-    </w:p>
-    <w:p>
-      <w:pPr>
-        <w:pStyle w:val="FirstParagraph"/>
-      </w:pPr>
-      <w:r>
-        <w:t xml:space="preserve">Para cada tramo, consumo.py elige la referencia así:</w:t>
       </w:r>
     </w:p>
     <w:p>
@@ -9618,7 +10548,7 @@
         </w:numPr>
       </w:pPr>
       <w:r>
-        <w:t xml:space="preserve">la</w:t>
+        <w:t xml:space="preserve">El caso de uso</w:t>
       </w:r>
       <w:r>
         <w:t xml:space="preserve"> </w:t>
@@ -9628,13 +10558,22 @@
           <w:b/>
           <w:bCs/>
         </w:rPr>
-        <w:t xml:space="preserve">configurada en la ruta</w:t>
-      </w:r>
-      <w:r>
-        <w:t xml:space="preserve"> </w:t>
-      </w:r>
-      <w:r>
-        <w:t xml:space="preserve">para ese estado de carga;</w:t>
+        <w:t xml:space="preserve">registra</w:t>
+      </w:r>
+      <w:r>
+        <w:t xml:space="preserve"> </w:t>
+      </w:r>
+      <w:r>
+        <w:t xml:space="preserve">el evento en la unidad de trabajo (</w:t>
+      </w:r>
+      <w:r>
+        <w:rPr>
+          <w:rStyle w:val="VerbatimChar"/>
+        </w:rPr>
+        <w:t xml:space="preserve">uow.registrar_evento(...)</w:t>
+      </w:r>
+      <w:r>
+        <w:t xml:space="preserve">).</w:t>
       </w:r>
     </w:p>
     <w:p>
@@ -9646,7 +10585,16 @@
         </w:numPr>
       </w:pPr>
       <w:r>
-        <w:t xml:space="preserve">si no hay, el</w:t>
+        <w:rPr>
+          <w:rStyle w:val="VerbatimChar"/>
+        </w:rPr>
+        <w:t xml:space="preserve">commit()</w:t>
+      </w:r>
+      <w:r>
+        <w:t xml:space="preserve"> </w:t>
+      </w:r>
+      <w:r>
+        <w:t xml:space="preserve">confirma la transacción y</w:t>
       </w:r>
       <w:r>
         <w:t xml:space="preserve"> </w:t>
@@ -9656,13 +10604,19 @@
           <w:b/>
           <w:bCs/>
         </w:rPr>
-        <w:t xml:space="preserve">promedio histórico</w:t>
-      </w:r>
-      <w:r>
-        <w:t xml:space="preserve"> </w:t>
-      </w:r>
-      <w:r>
-        <w:t xml:space="preserve">de la ruta (con 3 viajes o más);</w:t>
+        <w:t xml:space="preserve">recién después</w:t>
+      </w:r>
+      <w:r>
+        <w:t xml:space="preserve"> </w:t>
+      </w:r>
+      <w:r>
+        <w:t xml:space="preserve">publica los eventos: si algo falla antes</w:t>
+      </w:r>
+      <w:r>
+        <w:t xml:space="preserve"> </w:t>
+      </w:r>
+      <w:r>
+        <w:t xml:space="preserve">del commit, no se avisa nada que no ocurrió.</w:t>
       </w:r>
     </w:p>
     <w:p>
@@ -9674,23 +10628,86 @@
         </w:numPr>
       </w:pPr>
       <w:r>
-        <w:t xml:space="preserve">si tampoco, la</w:t>
-      </w:r>
-      <w:r>
-        <w:t xml:space="preserve"> </w:t>
-      </w:r>
-      <w:r>
-        <w:rPr>
-          <w:b/>
-          <w:bCs/>
-        </w:rPr>
-        <w:t xml:space="preserve">referencia general del camión</w:t>
-      </w:r>
-      <w:r>
-        <w:t xml:space="preserve"> </w:t>
-      </w:r>
-      <w:r>
-        <w:t xml:space="preserve">(respaldo).</w:t>
+        <w:t xml:space="preserve">bootstrap.py arma el bus y suscribe los manejadores de cada módulo.</w:t>
+      </w:r>
+    </w:p>
+    <w:p>
+      <w:pPr>
+        <w:pStyle w:val="Compact"/>
+        <w:numPr>
+          <w:ilvl w:val="0"/>
+          <w:numId w:val="1016"/>
+        </w:numPr>
+      </w:pPr>
+      <w:r>
+        <w:t xml:space="preserve">Si un manejador falla, el error se registra y la operación original igual queda guardada.</w:t>
+      </w:r>
+    </w:p>
+    <w:p>
+      <w:pPr>
+        <w:pStyle w:val="Compact"/>
+        <w:numPr>
+          <w:ilvl w:val="0"/>
+          <w:numId w:val="1016"/>
+        </w:numPr>
+      </w:pPr>
+      <w:r>
+        <w:t xml:space="preserve">Así</w:t>
+      </w:r>
+      <w:r>
+        <w:t xml:space="preserve"> </w:t>
+      </w:r>
+      <w:r>
+        <w:rPr>
+          <w:rStyle w:val="VerbatimChar"/>
+        </w:rPr>
+        <w:t xml:space="preserve">viajes</w:t>
+      </w:r>
+      <w:r>
+        <w:t xml:space="preserve"> </w:t>
+      </w:r>
+      <w:r>
+        <w:t xml:space="preserve">y</w:t>
+      </w:r>
+      <w:r>
+        <w:t xml:space="preserve"> </w:t>
+      </w:r>
+      <w:r>
+        <w:rPr>
+          <w:rStyle w:val="VerbatimChar"/>
+        </w:rPr>
+        <w:t xml:space="preserve">combustible</w:t>
+      </w:r>
+      <w:r>
+        <w:t xml:space="preserve"> </w:t>
+      </w:r>
+      <w:r>
+        <w:t xml:space="preserve">no importan a</w:t>
+      </w:r>
+      <w:r>
+        <w:t xml:space="preserve"> </w:t>
+      </w:r>
+      <w:r>
+        <w:rPr>
+          <w:rStyle w:val="VerbatimChar"/>
+        </w:rPr>
+        <w:t xml:space="preserve">alertas</w:t>
+      </w:r>
+      <w:r>
+        <w:t xml:space="preserve"> </w:t>
+      </w:r>
+      <w:r>
+        <w:t xml:space="preserve">(que depende de ellos): no hay ciclos.</w:t>
+      </w:r>
+    </w:p>
+    <w:bookmarkEnd w:id="41"/>
+    <w:bookmarkStart w:id="42" w:name="X935b6c72f65704dddf0099554b6692ef1b815da"/>
+    <w:p>
+      <w:pPr>
+        <w:pStyle w:val="Heading2"/>
+      </w:pPr>
+      <w:r>
+        <w:t xml:space="preserve">Regla de negocio destacada: referencia de consumo (RF-11, RF-13, RF-16)</w:t>
       </w:r>
     </w:p>
     <w:p>
@@ -9698,141 +10715,7 @@
         <w:pStyle w:val="FirstParagraph"/>
       </w:pPr>
       <w:r>
-        <w:t xml:space="preserve">Hay alerta si el consumo supera la referencia en más del umbral (15 %),</w:t>
-      </w:r>
-      <w:r>
-        <w:t xml:space="preserve"> </w:t>
-      </w:r>
-      <w:r>
-        <w:rPr>
-          <w:b/>
-          <w:bCs/>
-        </w:rPr>
-        <w:t xml:space="preserve">sólo</w:t>
-      </w:r>
-      <w:r>
-        <w:t xml:space="preserve"> </w:t>
-      </w:r>
-      <w:r>
-        <w:t xml:space="preserve">si la referencia</w:t>
-      </w:r>
-      <w:r>
-        <w:t xml:space="preserve"> </w:t>
-      </w:r>
-      <w:r>
-        <w:t xml:space="preserve">es de la ruta: la del camión es una sola para cargado y vacío y daría falsas alarmas.</w:t>
-      </w:r>
-    </w:p>
-    <w:bookmarkEnd w:id="40"/>
-    <w:bookmarkStart w:id="41" w:name="Xd0b75b0b0fd54070363d0e8077ffa2c9531a50b"/>
-    <w:p>
-      <w:pPr>
-        <w:pStyle w:val="Heading2"/>
-      </w:pPr>
-      <w:r>
-        <w:t xml:space="preserve">Regla de negocio destacada: conversión de moneda (RF-40, RF-41)</w:t>
-      </w:r>
-    </w:p>
-    <w:p>
-      <w:pPr>
-        <w:pStyle w:val="FirstParagraph"/>
-      </w:pPr>
-      <w:r>
-        <w:t xml:space="preserve">monedas/domain/entidades.py,</w:t>
-      </w:r>
-      <w:r>
-        <w:t xml:space="preserve"> </w:t>
-      </w:r>
-      <w:r>
-        <w:rPr>
-          <w:rStyle w:val="VerbatimChar"/>
-        </w:rPr>
-        <w:t xml:space="preserve">convertir_a_pesos</w:t>
-      </w:r>
-      <w:r>
-        <w:t xml:space="preserve">:</w:t>
-      </w:r>
-      <w:r>
-        <w:t xml:space="preserve"> </w:t>
-      </w:r>
-      <w:r>
-        <w:t xml:space="preserve">un gasto en CLP se convierte con la cotización de</w:t>
-      </w:r>
-      <w:r>
-        <w:t xml:space="preserve"> </w:t>
-      </w:r>
-      <w:r>
-        <w:rPr>
-          <w:b/>
-          <w:bCs/>
-        </w:rPr>
-        <w:t xml:space="preserve">su fecha</w:t>
-      </w:r>
-      <w:r>
-        <w:t xml:space="preserve">; si no hay, con la última anterior y</w:t>
-      </w:r>
-      <w:r>
-        <w:t xml:space="preserve"> </w:t>
-      </w:r>
-      <w:r>
-        <w:t xml:space="preserve">el gasto queda marcado "a revisar". El gasto guarda la cotización aplicada: corregir la tabla de</w:t>
-      </w:r>
-      <w:r>
-        <w:t xml:space="preserve"> </w:t>
-      </w:r>
-      <w:r>
-        <w:t xml:space="preserve">tipos de cambio después</w:t>
-      </w:r>
-      <w:r>
-        <w:t xml:space="preserve"> </w:t>
-      </w:r>
-      <w:r>
-        <w:rPr>
-          <w:b/>
-          <w:bCs/>
-        </w:rPr>
-        <w:t xml:space="preserve">no</w:t>
-      </w:r>
-      <w:r>
-        <w:t xml:space="preserve"> </w:t>
-      </w:r>
-      <w:r>
-        <w:t xml:space="preserve">cambia gastos ya registrados.</w:t>
-      </w:r>
-    </w:p>
-    <w:p>
-      <w:r>
-        <w:pict>
-          <v:rect style="width:0;height:1.5pt" o:hralign="center" o:hrstd="t" o:hr="t"/>
-        </w:pict>
-      </w:r>
-    </w:p>
-    <w:bookmarkEnd w:id="41"/>
-    <w:bookmarkEnd w:id="42"/>
-    <w:bookmarkStart w:id="43" w:name="X4b46113437fd9dd95b2987ab9030b35bc89b010"/>
-    <w:p>
-      <w:pPr>
-        <w:pStyle w:val="Heading1"/>
-      </w:pPr>
-      <w:r>
-        <w:t xml:space="preserve">6. Recorrido de una petición de punta a punta</w:t>
-      </w:r>
-    </w:p>
-    <w:p>
-      <w:pPr>
-        <w:pStyle w:val="FirstParagraph"/>
-      </w:pPr>
-      <w:r>
-        <w:rPr>
-          <w:rStyle w:val="VerbatimChar"/>
-        </w:rPr>
-        <w:t xml:space="preserve">POST /api/v1/viajes/{id}/tramos</w:t>
-      </w:r>
-      <w:r>
-        <w:t xml:space="preserve"> </w:t>
-      </w:r>
-      <w:r>
-        <w:t xml:space="preserve">(registrar la descarga: empieza el regreso vacío):</w:t>
+        <w:t xml:space="preserve">Para cada tramo, consumo.py elige la referencia así:</w:t>
       </w:r>
     </w:p>
     <w:p>
@@ -9844,30 +10727,23 @@
         </w:numPr>
       </w:pPr>
       <w:r>
+        <w:t xml:space="preserve">la</w:t>
+      </w:r>
+      <w:r>
+        <w:t xml:space="preserve"> </w:t>
+      </w:r>
+      <w:r>
         <w:rPr>
           <w:b/>
           <w:bCs/>
         </w:rPr>
-        <w:t xml:space="preserve">Uvicorn</w:t>
-      </w:r>
-      <w:r>
-        <w:t xml:space="preserve"> </w:t>
-      </w:r>
-      <w:r>
-        <w:t xml:space="preserve">recibe el HTTP y se lo pasa a</w:t>
-      </w:r>
-      <w:r>
-        <w:t xml:space="preserve"> </w:t>
-      </w:r>
-      <w:r>
-        <w:rPr>
-          <w:b/>
-          <w:bCs/>
-        </w:rPr>
-        <w:t xml:space="preserve">FastAPI</w:t>
-      </w:r>
-      <w:r>
-        <w:t xml:space="preserve">.</w:t>
+        <w:t xml:space="preserve">configurada en la ruta</w:t>
+      </w:r>
+      <w:r>
+        <w:t xml:space="preserve"> </w:t>
+      </w:r>
+      <w:r>
+        <w:t xml:space="preserve">para ese estado de carga;</w:t>
       </w:r>
     </w:p>
     <w:p>
@@ -9879,26 +10755,23 @@
         </w:numPr>
       </w:pPr>
       <w:r>
+        <w:t xml:space="preserve">si no hay, el</w:t>
+      </w:r>
+      <w:r>
+        <w:t xml:space="preserve"> </w:t>
+      </w:r>
+      <w:r>
         <w:rPr>
           <w:b/>
           <w:bCs/>
         </w:rPr>
-        <w:t xml:space="preserve">Pydantic</w:t>
-      </w:r>
-      <w:r>
-        <w:t xml:space="preserve"> </w:t>
-      </w:r>
-      <w:r>
-        <w:t xml:space="preserve">(</w:t>
-      </w:r>
-      <w:r>
-        <w:rPr>
-          <w:rStyle w:val="VerbatimChar"/>
-        </w:rPr>
-        <w:t xml:space="preserve">CambioEstadoCarga</w:t>
-      </w:r>
-      <w:r>
-        <w:t xml:space="preserve">) valida el JSON: fecha, km y nuevo estado.</w:t>
+        <w:t xml:space="preserve">promedio histórico</w:t>
+      </w:r>
+      <w:r>
+        <w:t xml:space="preserve"> </w:t>
+      </w:r>
+      <w:r>
+        <w:t xml:space="preserve">de la ruta (con 3 viajes o más);</w:t>
       </w:r>
     </w:p>
     <w:p>
@@ -9910,16 +10783,7 @@
         </w:numPr>
       </w:pPr>
       <w:r>
-        <w:rPr>
-          <w:rStyle w:val="VerbatimChar"/>
-        </w:rPr>
-        <w:t xml:space="preserve">Depends</w:t>
-      </w:r>
-      <w:r>
-        <w:t xml:space="preserve"> </w:t>
-      </w:r>
-      <w:r>
-        <w:t xml:space="preserve">arma la</w:t>
+        <w:t xml:space="preserve">si tampoco, la</w:t>
       </w:r>
       <w:r>
         <w:t xml:space="preserve"> </w:t>
@@ -9929,25 +10793,155 @@
           <w:b/>
           <w:bCs/>
         </w:rPr>
-        <w:t xml:space="preserve">unidad de trabajo</w:t>
-      </w:r>
-      <w:r>
-        <w:t xml:space="preserve"> </w:t>
-      </w:r>
-      <w:r>
-        <w:t xml:space="preserve">real (vía</w:t>
-      </w:r>
-      <w:r>
-        <w:t xml:space="preserve"> </w:t>
-      </w:r>
-      <w:r>
-        <w:rPr>
-          <w:rStyle w:val="VerbatimChar"/>
-        </w:rPr>
-        <w:t xml:space="preserve">bootstrap.py</w:t>
-      </w:r>
-      <w:r>
-        <w:t xml:space="preserve">).</w:t>
+        <w:t xml:space="preserve">referencia general del camión</w:t>
+      </w:r>
+      <w:r>
+        <w:t xml:space="preserve"> </w:t>
+      </w:r>
+      <w:r>
+        <w:t xml:space="preserve">(respaldo).</w:t>
+      </w:r>
+    </w:p>
+    <w:p>
+      <w:pPr>
+        <w:pStyle w:val="FirstParagraph"/>
+      </w:pPr>
+      <w:r>
+        <w:t xml:space="preserve">Hay alerta si el consumo supera la referencia en más del umbral (15 %),</w:t>
+      </w:r>
+      <w:r>
+        <w:t xml:space="preserve"> </w:t>
+      </w:r>
+      <w:r>
+        <w:rPr>
+          <w:b/>
+          <w:bCs/>
+        </w:rPr>
+        <w:t xml:space="preserve">sólo</w:t>
+      </w:r>
+      <w:r>
+        <w:t xml:space="preserve"> </w:t>
+      </w:r>
+      <w:r>
+        <w:t xml:space="preserve">si la referencia</w:t>
+      </w:r>
+      <w:r>
+        <w:t xml:space="preserve"> </w:t>
+      </w:r>
+      <w:r>
+        <w:t xml:space="preserve">es de la ruta: la del camión es una sola para cargado y vacío y daría falsas alarmas.</w:t>
+      </w:r>
+    </w:p>
+    <w:bookmarkEnd w:id="42"/>
+    <w:bookmarkStart w:id="43" w:name="Xd0b75b0b0fd54070363d0e8077ffa2c9531a50b"/>
+    <w:p>
+      <w:pPr>
+        <w:pStyle w:val="Heading2"/>
+      </w:pPr>
+      <w:r>
+        <w:t xml:space="preserve">Regla de negocio destacada: conversión de moneda (RF-40, RF-41)</w:t>
+      </w:r>
+    </w:p>
+    <w:p>
+      <w:pPr>
+        <w:pStyle w:val="FirstParagraph"/>
+      </w:pPr>
+      <w:r>
+        <w:t xml:space="preserve">monedas/domain/entidades.py,</w:t>
+      </w:r>
+      <w:r>
+        <w:t xml:space="preserve"> </w:t>
+      </w:r>
+      <w:r>
+        <w:rPr>
+          <w:rStyle w:val="VerbatimChar"/>
+        </w:rPr>
+        <w:t xml:space="preserve">convertir_a_pesos</w:t>
+      </w:r>
+      <w:r>
+        <w:t xml:space="preserve">:</w:t>
+      </w:r>
+      <w:r>
+        <w:t xml:space="preserve"> </w:t>
+      </w:r>
+      <w:r>
+        <w:t xml:space="preserve">un gasto en CLP se convierte con la cotización de</w:t>
+      </w:r>
+      <w:r>
+        <w:t xml:space="preserve"> </w:t>
+      </w:r>
+      <w:r>
+        <w:rPr>
+          <w:b/>
+          <w:bCs/>
+        </w:rPr>
+        <w:t xml:space="preserve">su fecha</w:t>
+      </w:r>
+      <w:r>
+        <w:t xml:space="preserve">; si no hay, con la última anterior y</w:t>
+      </w:r>
+      <w:r>
+        <w:t xml:space="preserve"> </w:t>
+      </w:r>
+      <w:r>
+        <w:t xml:space="preserve">el gasto queda marcado "a revisar". El gasto guarda la cotización aplicada: corregir la tabla de</w:t>
+      </w:r>
+      <w:r>
+        <w:t xml:space="preserve"> </w:t>
+      </w:r>
+      <w:r>
+        <w:t xml:space="preserve">tipos de cambio después</w:t>
+      </w:r>
+      <w:r>
+        <w:t xml:space="preserve"> </w:t>
+      </w:r>
+      <w:r>
+        <w:rPr>
+          <w:b/>
+          <w:bCs/>
+        </w:rPr>
+        <w:t xml:space="preserve">no</w:t>
+      </w:r>
+      <w:r>
+        <w:t xml:space="preserve"> </w:t>
+      </w:r>
+      <w:r>
+        <w:t xml:space="preserve">cambia gastos ya registrados.</w:t>
+      </w:r>
+    </w:p>
+    <w:p>
+      <w:r>
+        <w:pict>
+          <v:rect style="width:0;height:1.5pt" o:hralign="center" o:hrstd="t" o:hr="t"/>
+        </w:pict>
+      </w:r>
+    </w:p>
+    <w:bookmarkEnd w:id="43"/>
+    <w:bookmarkEnd w:id="44"/>
+    <w:bookmarkStart w:id="45" w:name="X4b46113437fd9dd95b2987ab9030b35bc89b010"/>
+    <w:p>
+      <w:pPr>
+        <w:pStyle w:val="Heading1"/>
+      </w:pPr>
+      <w:r>
+        <w:t xml:space="preserve">6. Recorrido de una petición de punta a punta</w:t>
+      </w:r>
+    </w:p>
+    <w:p>
+      <w:pPr>
+        <w:pStyle w:val="FirstParagraph"/>
+      </w:pPr>
+      <w:r>
+        <w:rPr>
+          <w:rStyle w:val="VerbatimChar"/>
+        </w:rPr>
+        <w:t xml:space="preserve">POST /api/v1/viajes/{id}/tramos</w:t>
+      </w:r>
+      <w:r>
+        <w:t xml:space="preserve"> </w:t>
+      </w:r>
+      <w:r>
+        <w:t xml:space="preserve">(registrar la descarga: empieza el regreso vacío):</w:t>
       </w:r>
     </w:p>
     <w:p>
@@ -9955,26 +10949,34 @@
         <w:pStyle w:val="Compact"/>
         <w:numPr>
           <w:ilvl w:val="0"/>
-          <w:numId w:val="1017"/>
+          <w:numId w:val="1018"/>
         </w:numPr>
       </w:pPr>
       <w:r>
-        <w:t xml:space="preserve">La ruta llama a</w:t>
-      </w:r>
-      <w:r>
-        <w:t xml:space="preserve"> </w:t>
-      </w:r>
-      <w:r>
-        <w:rPr>
-          <w:rStyle w:val="VerbatimChar"/>
-        </w:rPr>
-        <w:t xml:space="preserve">CambiarEstadoCarga(uow).ejecutar(...)</w:t>
-      </w:r>
-      <w:r>
-        <w:t xml:space="preserve"> </w:t>
-      </w:r>
-      <w:r>
-        <w:t xml:space="preserve">(viajes/application/casos_de_uso.py).</w:t>
+        <w:rPr>
+          <w:b/>
+          <w:bCs/>
+        </w:rPr>
+        <w:t xml:space="preserve">Uvicorn</w:t>
+      </w:r>
+      <w:r>
+        <w:t xml:space="preserve"> </w:t>
+      </w:r>
+      <w:r>
+        <w:t xml:space="preserve">recibe el HTTP y se lo pasa a</w:t>
+      </w:r>
+      <w:r>
+        <w:t xml:space="preserve"> </w:t>
+      </w:r>
+      <w:r>
+        <w:rPr>
+          <w:b/>
+          <w:bCs/>
+        </w:rPr>
+        <w:t xml:space="preserve">FastAPI</w:t>
+      </w:r>
+      <w:r>
+        <w:t xml:space="preserve">.</w:t>
       </w:r>
     </w:p>
     <w:p>
@@ -9982,75 +10984,30 @@
         <w:pStyle w:val="Compact"/>
         <w:numPr>
           <w:ilvl w:val="0"/>
-          <w:numId w:val="1017"/>
+          <w:numId w:val="1018"/>
         </w:numPr>
       </w:pPr>
-      <w:r>
-        <w:t xml:space="preserve">El caso de uso lee el viaje (con sus tramos) y le pide a la</w:t>
-      </w:r>
-      <w:r>
-        <w:t xml:space="preserve"> </w:t>
-      </w:r>
       <w:r>
         <w:rPr>
           <w:b/>
           <w:bCs/>
         </w:rPr>
-        <w:t xml:space="preserve">entidad</w:t>
-      </w:r>
-      <w:r>
-        <w:t xml:space="preserve"> </w:t>
-      </w:r>
-      <w:r>
-        <w:t xml:space="preserve">que cambie de estado:</w:t>
-      </w:r>
-      <w:r>
-        <w:t xml:space="preserve"> </w:t>
-      </w:r>
-      <w:r>
-        <w:rPr>
-          <w:rStyle w:val="VerbatimChar"/>
-        </w:rPr>
-        <w:t xml:space="preserve">viaje.cambiar_estado_carga(...)</w:t>
-      </w:r>
-      <w:r>
-        <w:t xml:space="preserve"> </w:t>
-      </w:r>
-      <w:r>
-        <w:t xml:space="preserve">cierra el tramo cargado y abre uno vacío. Si el viaje ya terminó</w:t>
-      </w:r>
-      <w:r>
-        <w:t xml:space="preserve"> </w:t>
-      </w:r>
-      <w:r>
-        <w:t xml:space="preserve">o el odómetro no avanza, la entidad lanza</w:t>
-      </w:r>
-      <w:r>
-        <w:t xml:space="preserve"> </w:t>
-      </w:r>
-      <w:r>
-        <w:rPr>
-          <w:rStyle w:val="VerbatimChar"/>
-        </w:rPr>
-        <w:t xml:space="preserve">ReglaNegocioViolada</w:t>
-      </w:r>
-      <w:r>
-        <w:t xml:space="preserve"> </w:t>
-      </w:r>
-      <w:r>
-        <w:t xml:space="preserve">/</w:t>
-      </w:r>
-      <w:r>
-        <w:t xml:space="preserve"> </w:t>
-      </w:r>
-      <w:r>
-        <w:rPr>
-          <w:rStyle w:val="VerbatimChar"/>
-        </w:rPr>
-        <w:t xml:space="preserve">DatosInvalidos</w:t>
-      </w:r>
-      <w:r>
-        <w:t xml:space="preserve">.</w:t>
+        <w:t xml:space="preserve">Pydantic</w:t>
+      </w:r>
+      <w:r>
+        <w:t xml:space="preserve"> </w:t>
+      </w:r>
+      <w:r>
+        <w:t xml:space="preserve">(</w:t>
+      </w:r>
+      <w:r>
+        <w:rPr>
+          <w:rStyle w:val="VerbatimChar"/>
+        </w:rPr>
+        <w:t xml:space="preserve">CambioEstadoCarga</w:t>
+      </w:r>
+      <w:r>
+        <w:t xml:space="preserve">) valida el JSON: fecha, km y nuevo estado.</w:t>
       </w:r>
     </w:p>
     <w:p>
@@ -10058,83 +11015,48 @@
         <w:pStyle w:val="Compact"/>
         <w:numPr>
           <w:ilvl w:val="0"/>
-          <w:numId w:val="1017"/>
+          <w:numId w:val="1018"/>
         </w:numPr>
       </w:pPr>
       <w:r>
-        <w:t xml:space="preserve">El repositorio convierte</w:t>
-      </w:r>
-      <w:r>
-        <w:t xml:space="preserve"> </w:t>
-      </w:r>
-      <w:r>
-        <w:rPr>
-          <w:rStyle w:val="VerbatimChar"/>
-        </w:rPr>
-        <w:t xml:space="preserve">Viaje</w:t>
-      </w:r>
-      <w:r>
-        <w:t xml:space="preserve"> </w:t>
-      </w:r>
-      <w:r>
-        <w:t xml:space="preserve">→</w:t>
-      </w:r>
-      <w:r>
-        <w:t xml:space="preserve"> </w:t>
-      </w:r>
-      <w:r>
-        <w:rPr>
-          <w:rStyle w:val="VerbatimChar"/>
-        </w:rPr>
-        <w:t xml:space="preserve">ViajeModel</w:t>
-      </w:r>
-      <w:r>
-        <w:t xml:space="preserve"> </w:t>
-      </w:r>
-      <w:r>
-        <w:t xml:space="preserve">(+</w:t>
-      </w:r>
-      <w:r>
-        <w:t xml:space="preserve"> </w:t>
-      </w:r>
-      <w:r>
-        <w:rPr>
-          <w:rStyle w:val="VerbatimChar"/>
-        </w:rPr>
-        <w:t xml:space="preserve">TramoViajeModel</w:t>
-      </w:r>
-      <w:r>
-        <w:t xml:space="preserve">) y SQLAlchemy hace el</w:t>
-      </w:r>
-      <w:r>
-        <w:t xml:space="preserve"> </w:t>
-      </w:r>
-      <w:r>
-        <w:rPr>
-          <w:rStyle w:val="VerbatimChar"/>
-        </w:rPr>
-        <w:t xml:space="preserve">UPDATE</w:t>
-      </w:r>
-      <w:r>
-        <w:t xml:space="preserve"> </w:t>
-      </w:r>
-      <w:r>
-        <w:t xml:space="preserve">del viaje y el</w:t>
-      </w:r>
-      <w:r>
-        <w:t xml:space="preserve"> </w:t>
-      </w:r>
-      <w:r>
-        <w:rPr>
-          <w:rStyle w:val="VerbatimChar"/>
-        </w:rPr>
-        <w:t xml:space="preserve">INSERT</w:t>
-      </w:r>
-      <w:r>
-        <w:t xml:space="preserve"> </w:t>
-      </w:r>
-      <w:r>
-        <w:t xml:space="preserve">del tramo nuevo.</w:t>
+        <w:rPr>
+          <w:rStyle w:val="VerbatimChar"/>
+        </w:rPr>
+        <w:t xml:space="preserve">Depends</w:t>
+      </w:r>
+      <w:r>
+        <w:t xml:space="preserve"> </w:t>
+      </w:r>
+      <w:r>
+        <w:t xml:space="preserve">arma la</w:t>
+      </w:r>
+      <w:r>
+        <w:t xml:space="preserve"> </w:t>
+      </w:r>
+      <w:r>
+        <w:rPr>
+          <w:b/>
+          <w:bCs/>
+        </w:rPr>
+        <w:t xml:space="preserve">unidad de trabajo</w:t>
+      </w:r>
+      <w:r>
+        <w:t xml:space="preserve"> </w:t>
+      </w:r>
+      <w:r>
+        <w:t xml:space="preserve">real (vía</w:t>
+      </w:r>
+      <w:r>
+        <w:t xml:space="preserve"> </w:t>
+      </w:r>
+      <w:r>
+        <w:rPr>
+          <w:rStyle w:val="VerbatimChar"/>
+        </w:rPr>
+        <w:t xml:space="preserve">bootstrap.py</w:t>
+      </w:r>
+      <w:r>
+        <w:t xml:space="preserve">).</w:t>
       </w:r>
     </w:p>
     <w:p>
@@ -10142,7 +11064,194 @@
         <w:pStyle w:val="Compact"/>
         <w:numPr>
           <w:ilvl w:val="0"/>
-          <w:numId w:val="1017"/>
+          <w:numId w:val="1018"/>
+        </w:numPr>
+      </w:pPr>
+      <w:r>
+        <w:t xml:space="preserve">La ruta llama a</w:t>
+      </w:r>
+      <w:r>
+        <w:t xml:space="preserve"> </w:t>
+      </w:r>
+      <w:r>
+        <w:rPr>
+          <w:rStyle w:val="VerbatimChar"/>
+        </w:rPr>
+        <w:t xml:space="preserve">CambiarEstadoCarga(uow).ejecutar(...)</w:t>
+      </w:r>
+      <w:r>
+        <w:t xml:space="preserve"> </w:t>
+      </w:r>
+      <w:r>
+        <w:t xml:space="preserve">(viajes/application/casos_de_uso.py).</w:t>
+      </w:r>
+    </w:p>
+    <w:p>
+      <w:pPr>
+        <w:pStyle w:val="Compact"/>
+        <w:numPr>
+          <w:ilvl w:val="0"/>
+          <w:numId w:val="1018"/>
+        </w:numPr>
+      </w:pPr>
+      <w:r>
+        <w:t xml:space="preserve">El caso de uso lee el viaje (con sus tramos) y le pide a la</w:t>
+      </w:r>
+      <w:r>
+        <w:t xml:space="preserve"> </w:t>
+      </w:r>
+      <w:r>
+        <w:rPr>
+          <w:b/>
+          <w:bCs/>
+        </w:rPr>
+        <w:t xml:space="preserve">entidad</w:t>
+      </w:r>
+      <w:r>
+        <w:t xml:space="preserve"> </w:t>
+      </w:r>
+      <w:r>
+        <w:t xml:space="preserve">que cambie de estado:</w:t>
+      </w:r>
+      <w:r>
+        <w:t xml:space="preserve"> </w:t>
+      </w:r>
+      <w:r>
+        <w:rPr>
+          <w:rStyle w:val="VerbatimChar"/>
+        </w:rPr>
+        <w:t xml:space="preserve">viaje.cambiar_estado_carga(...)</w:t>
+      </w:r>
+      <w:r>
+        <w:t xml:space="preserve"> </w:t>
+      </w:r>
+      <w:r>
+        <w:t xml:space="preserve">cierra el tramo cargado y abre uno vacío. Si el viaje ya terminó</w:t>
+      </w:r>
+      <w:r>
+        <w:t xml:space="preserve"> </w:t>
+      </w:r>
+      <w:r>
+        <w:t xml:space="preserve">o el odómetro no avanza, la entidad lanza</w:t>
+      </w:r>
+      <w:r>
+        <w:t xml:space="preserve"> </w:t>
+      </w:r>
+      <w:r>
+        <w:rPr>
+          <w:rStyle w:val="VerbatimChar"/>
+        </w:rPr>
+        <w:t xml:space="preserve">ReglaNegocioViolada</w:t>
+      </w:r>
+      <w:r>
+        <w:t xml:space="preserve"> </w:t>
+      </w:r>
+      <w:r>
+        <w:t xml:space="preserve">/</w:t>
+      </w:r>
+      <w:r>
+        <w:t xml:space="preserve"> </w:t>
+      </w:r>
+      <w:r>
+        <w:rPr>
+          <w:rStyle w:val="VerbatimChar"/>
+        </w:rPr>
+        <w:t xml:space="preserve">DatosInvalidos</w:t>
+      </w:r>
+      <w:r>
+        <w:t xml:space="preserve">.</w:t>
+      </w:r>
+    </w:p>
+    <w:p>
+      <w:pPr>
+        <w:pStyle w:val="Compact"/>
+        <w:numPr>
+          <w:ilvl w:val="0"/>
+          <w:numId w:val="1018"/>
+        </w:numPr>
+      </w:pPr>
+      <w:r>
+        <w:t xml:space="preserve">El repositorio convierte</w:t>
+      </w:r>
+      <w:r>
+        <w:t xml:space="preserve"> </w:t>
+      </w:r>
+      <w:r>
+        <w:rPr>
+          <w:rStyle w:val="VerbatimChar"/>
+        </w:rPr>
+        <w:t xml:space="preserve">Viaje</w:t>
+      </w:r>
+      <w:r>
+        <w:t xml:space="preserve"> </w:t>
+      </w:r>
+      <w:r>
+        <w:t xml:space="preserve">→</w:t>
+      </w:r>
+      <w:r>
+        <w:t xml:space="preserve"> </w:t>
+      </w:r>
+      <w:r>
+        <w:rPr>
+          <w:rStyle w:val="VerbatimChar"/>
+        </w:rPr>
+        <w:t xml:space="preserve">ViajeModel</w:t>
+      </w:r>
+      <w:r>
+        <w:t xml:space="preserve"> </w:t>
+      </w:r>
+      <w:r>
+        <w:t xml:space="preserve">(+</w:t>
+      </w:r>
+      <w:r>
+        <w:t xml:space="preserve"> </w:t>
+      </w:r>
+      <w:r>
+        <w:rPr>
+          <w:rStyle w:val="VerbatimChar"/>
+        </w:rPr>
+        <w:t xml:space="preserve">TramoViajeModel</w:t>
+      </w:r>
+      <w:r>
+        <w:t xml:space="preserve">) y SQLAlchemy hace el</w:t>
+      </w:r>
+      <w:r>
+        <w:t xml:space="preserve"> </w:t>
+      </w:r>
+      <w:r>
+        <w:rPr>
+          <w:rStyle w:val="VerbatimChar"/>
+        </w:rPr>
+        <w:t xml:space="preserve">UPDATE</w:t>
+      </w:r>
+      <w:r>
+        <w:t xml:space="preserve"> </w:t>
+      </w:r>
+      <w:r>
+        <w:t xml:space="preserve">del viaje y el</w:t>
+      </w:r>
+      <w:r>
+        <w:t xml:space="preserve"> </w:t>
+      </w:r>
+      <w:r>
+        <w:rPr>
+          <w:rStyle w:val="VerbatimChar"/>
+        </w:rPr>
+        <w:t xml:space="preserve">INSERT</w:t>
+      </w:r>
+      <w:r>
+        <w:t xml:space="preserve"> </w:t>
+      </w:r>
+      <w:r>
+        <w:t xml:space="preserve">del tramo nuevo.</w:t>
+      </w:r>
+    </w:p>
+    <w:p>
+      <w:pPr>
+        <w:pStyle w:val="Compact"/>
+        <w:numPr>
+          <w:ilvl w:val="0"/>
+          <w:numId w:val="1018"/>
         </w:numPr>
       </w:pPr>
       <w:r>
@@ -10192,8 +11301,8 @@
         </w:pict>
       </w:r>
     </w:p>
-    <w:bookmarkEnd w:id="43"/>
-    <w:bookmarkStart w:id="44" w:name="X057e0a70ef2db6a0c901b7c96dcf81059b975fc"/>
+    <w:bookmarkEnd w:id="45"/>
+    <w:bookmarkStart w:id="46" w:name="X057e0a70ef2db6a0c901b7c96dcf81059b975fc"/>
     <w:p>
       <w:pPr>
         <w:pStyle w:val="Heading1"/>
@@ -10362,7 +11471,7 @@
         <w:pStyle w:val="Compact"/>
         <w:numPr>
           <w:ilvl w:val="0"/>
-          <w:numId w:val="1018"/>
+          <w:numId w:val="1019"/>
         </w:numPr>
       </w:pPr>
       <w:r>
@@ -10407,451 +11516,6 @@
       </w:r>
       <w:r>
         <w:t xml:space="preserve">), para que cada test muestre sólo lo que importa.</w:t>
-      </w:r>
-    </w:p>
-    <w:p>
-      <w:pPr>
-        <w:pStyle w:val="Compact"/>
-        <w:numPr>
-          <w:ilvl w:val="0"/>
-          <w:numId w:val="1018"/>
-        </w:numPr>
-      </w:pPr>
-      <w:r>
-        <w:rPr>
-          <w:b/>
-          <w:bCs/>
-        </w:rPr>
-        <w:t xml:space="preserve">Fixtures</w:t>
-      </w:r>
-      <w:r>
-        <w:t xml:space="preserve"> </w:t>
-      </w:r>
-      <w:r>
-        <w:t xml:space="preserve">(</w:t>
-      </w:r>
-      <w:r>
-        <w:rPr>
-          <w:rStyle w:val="VerbatimChar"/>
-        </w:rPr>
-        <w:t xml:space="preserve">@pytest.fixture</w:t>
-      </w:r>
-      <w:r>
-        <w:t xml:space="preserve">): objetos que pytest prepara y entrega a cada test que los pide por nombre.</w:t>
-      </w:r>
-    </w:p>
-    <w:p>
-      <w:pPr>
-        <w:pStyle w:val="Compact"/>
-        <w:numPr>
-          <w:ilvl w:val="0"/>
-          <w:numId w:val="1018"/>
-        </w:numPr>
-      </w:pPr>
-      <w:r>
-        <w:t xml:space="preserve">Los nombres de los tests describen la regla:</w:t>
-      </w:r>
-      <w:r>
-        <w:t xml:space="preserve"> </w:t>
-      </w:r>
-      <w:r>
-        <w:rPr>
-          <w:rStyle w:val="VerbatimChar"/>
-        </w:rPr>
-        <w:t xml:space="preserve">test_la_referencia_del_camion_informa_el_desvio_pero_no_alerta</w:t>
-      </w:r>
-      <w:r>
-        <w:t xml:space="preserve">.</w:t>
-      </w:r>
-    </w:p>
-    <w:p>
-      <w:pPr>
-        <w:pStyle w:val="SourceCode"/>
-      </w:pPr>
-      <w:r>
-        <w:rPr>
-          <w:rStyle w:val="NormalTok"/>
-        </w:rPr>
-        <w:t xml:space="preserve">uv run pytest              </w:t>
-      </w:r>
-      <w:r>
-        <w:rPr>
-          <w:rStyle w:val="CommentTok"/>
-        </w:rPr>
-        <w:t xml:space="preserve"># todos</w:t>
-      </w:r>
-      <w:r>
-        <w:br/>
-      </w:r>
-      <w:r>
-        <w:rPr>
-          <w:rStyle w:val="NormalTok"/>
-        </w:rPr>
-        <w:t xml:space="preserve">uv run pytest tests</w:t>
-      </w:r>
-      <w:r>
-        <w:rPr>
-          <w:rStyle w:val="OperatorTok"/>
-        </w:rPr>
-        <w:t xml:space="preserve">/</w:t>
-      </w:r>
-      <w:r>
-        <w:rPr>
-          <w:rStyle w:val="NormalTok"/>
-        </w:rPr>
-        <w:t xml:space="preserve">unit   </w:t>
-      </w:r>
-      <w:r>
-        <w:rPr>
-          <w:rStyle w:val="CommentTok"/>
-        </w:rPr>
-        <w:t xml:space="preserve"># sólo unitarios</w:t>
-      </w:r>
-      <w:r>
-        <w:br/>
-      </w:r>
-      <w:r>
-        <w:rPr>
-          <w:rStyle w:val="NormalTok"/>
-        </w:rPr>
-        <w:t xml:space="preserve">uv run pytest </w:t>
-      </w:r>
-      <w:r>
-        <w:rPr>
-          <w:rStyle w:val="OperatorTok"/>
-        </w:rPr>
-        <w:t xml:space="preserve">-</w:t>
-      </w:r>
-      <w:r>
-        <w:rPr>
-          <w:rStyle w:val="NormalTok"/>
-        </w:rPr>
-        <w:t xml:space="preserve">k tramo     </w:t>
-      </w:r>
-      <w:r>
-        <w:rPr>
-          <w:rStyle w:val="CommentTok"/>
-        </w:rPr>
-        <w:t xml:space="preserve"># sólo los que contienen "tramo" en el nombre</w:t>
-      </w:r>
-      <w:r>
-        <w:br/>
-      </w:r>
-      <w:r>
-        <w:rPr>
-          <w:rStyle w:val="NormalTok"/>
-        </w:rPr>
-        <w:t xml:space="preserve">uv run pytest </w:t>
-      </w:r>
-      <w:r>
-        <w:rPr>
-          <w:rStyle w:val="OperatorTok"/>
-        </w:rPr>
-        <w:t xml:space="preserve">-</w:t>
-      </w:r>
-      <w:r>
-        <w:rPr>
-          <w:rStyle w:val="NormalTok"/>
-        </w:rPr>
-        <w:t xml:space="preserve">x </w:t>
-      </w:r>
-      <w:r>
-        <w:rPr>
-          <w:rStyle w:val="OperatorTok"/>
-        </w:rPr>
-        <w:t xml:space="preserve">-</w:t>
-      </w:r>
-      <w:r>
-        <w:rPr>
-          <w:rStyle w:val="NormalTok"/>
-        </w:rPr>
-        <w:t xml:space="preserve">v        </w:t>
-      </w:r>
-      <w:r>
-        <w:rPr>
-          <w:rStyle w:val="CommentTok"/>
-        </w:rPr>
-        <w:t xml:space="preserve"># detenerse en el primer fallo, con detalle</w:t>
-      </w:r>
-    </w:p>
-    <w:p>
-      <w:r>
-        <w:pict>
-          <v:rect style="width:0;height:1.5pt" o:hralign="center" o:hrstd="t" o:hr="t"/>
-        </w:pict>
-      </w:r>
-    </w:p>
-    <w:bookmarkEnd w:id="44"/>
-    <w:bookmarkStart w:id="45" w:name="Xe5b9ca0edd62c85c4b69fc58d4dbf323c98dc91"/>
-    <w:p>
-      <w:pPr>
-        <w:pStyle w:val="Heading1"/>
-      </w:pPr>
-      <w:r>
-        <w:t xml:space="preserve">8. Ejecutar el proyecto en local</w:t>
-      </w:r>
-    </w:p>
-    <w:p>
-      <w:pPr>
-        <w:pStyle w:val="FirstParagraph"/>
-      </w:pPr>
-      <w:r>
-        <w:rPr>
-          <w:b/>
-          <w:bCs/>
-        </w:rPr>
-        <w:t xml:space="preserve">Con PostgreSQL</w:t>
-      </w:r>
-      <w:r>
-        <w:t xml:space="preserve"> </w:t>
-      </w:r>
-      <w:r>
-        <w:t xml:space="preserve">(requiere</w:t>
-      </w:r>
-      <w:r>
-        <w:t xml:space="preserve"> </w:t>
-      </w:r>
-      <w:r>
-        <w:rPr>
-          <w:rStyle w:val="VerbatimChar"/>
-        </w:rPr>
-        <w:t xml:space="preserve">DB_PASSWORD</w:t>
-      </w:r>
-      <w:r>
-        <w:t xml:space="preserve"> </w:t>
-      </w:r>
-      <w:r>
-        <w:t xml:space="preserve">en</w:t>
-      </w:r>
-      <w:r>
-        <w:t xml:space="preserve"> </w:t>
-      </w:r>
-      <w:r>
-        <w:rPr>
-          <w:rStyle w:val="VerbatimChar"/>
-        </w:rPr>
-        <w:t xml:space="preserve">.env</w:t>
-      </w:r>
-      <w:r>
-        <w:t xml:space="preserve">):</w:t>
-      </w:r>
-    </w:p>
-    <w:p>
-      <w:pPr>
-        <w:pStyle w:val="SourceCode"/>
-      </w:pPr>
-      <w:r>
-        <w:rPr>
-          <w:rStyle w:val="NormalTok"/>
-        </w:rPr>
-        <w:t xml:space="preserve">uv run flota crear-db</w:t>
-      </w:r>
-      <w:r>
-        <w:br/>
-      </w:r>
-      <w:r>
-        <w:rPr>
-          <w:rStyle w:val="NormalTok"/>
-        </w:rPr>
-        <w:t xml:space="preserve">uv run alembic upgrade head</w:t>
-      </w:r>
-      <w:r>
-        <w:br/>
-      </w:r>
-      <w:r>
-        <w:rPr>
-          <w:rStyle w:val="NormalTok"/>
-        </w:rPr>
-        <w:t xml:space="preserve">uv run flota datos-demo        </w:t>
-      </w:r>
-      <w:r>
-        <w:rPr>
-          <w:rStyle w:val="CommentTok"/>
-        </w:rPr>
-        <w:t xml:space="preserve"># opcional: 2 camiones, 2 rutas, 8 viajes ida cargado / regreso vacío</w:t>
-      </w:r>
-      <w:r>
-        <w:br/>
-      </w:r>
-      <w:r>
-        <w:rPr>
-          <w:rStyle w:val="NormalTok"/>
-        </w:rPr>
-        <w:t xml:space="preserve">uv run flota servidor          </w:t>
-      </w:r>
-      <w:r>
-        <w:rPr>
-          <w:rStyle w:val="CommentTok"/>
-        </w:rPr>
-        <w:t xml:space="preserve"># http://127.0.0.1:8000 · API en /docs</w:t>
-      </w:r>
-    </w:p>
-    <w:p>
-      <w:pPr>
-        <w:pStyle w:val="FirstParagraph"/>
-      </w:pPr>
-      <w:r>
-        <w:rPr>
-          <w:b/>
-          <w:bCs/>
-        </w:rPr>
-        <w:t xml:space="preserve">Con SQLite, para probar rápido</w:t>
-      </w:r>
-      <w:r>
-        <w:t xml:space="preserve"> </w:t>
-      </w:r>
-      <w:r>
-        <w:t xml:space="preserve">(sin contraseña, base en un archivo):</w:t>
-      </w:r>
-    </w:p>
-    <w:p>
-      <w:pPr>
-        <w:pStyle w:val="SourceCode"/>
-      </w:pPr>
-      <w:r>
-        <w:rPr>
-          <w:rStyle w:val="VariableTok"/>
-        </w:rPr>
-        <w:t xml:space="preserve">$env</w:t>
-      </w:r>
-      <w:r>
-        <w:rPr>
-          <w:rStyle w:val="OperatorTok"/>
-        </w:rPr>
-        <w:t xml:space="preserve">:</w:t>
-      </w:r>
-      <w:r>
-        <w:rPr>
-          <w:rStyle w:val="VariableTok"/>
-        </w:rPr>
-        <w:t xml:space="preserve">DATABASE_URL</w:t>
-      </w:r>
-      <w:r>
-        <w:rPr>
-          <w:rStyle w:val="NormalTok"/>
-        </w:rPr>
-        <w:t xml:space="preserve"> </w:t>
-      </w:r>
-      <w:r>
-        <w:rPr>
-          <w:rStyle w:val="OperatorTok"/>
-        </w:rPr>
-        <w:t xml:space="preserve">=</w:t>
-      </w:r>
-      <w:r>
-        <w:rPr>
-          <w:rStyle w:val="NormalTok"/>
-        </w:rPr>
-        <w:t xml:space="preserve"> </w:t>
-      </w:r>
-      <w:r>
-        <w:rPr>
-          <w:rStyle w:val="StringTok"/>
-        </w:rPr>
-        <w:t xml:space="preserve">"sqlite:///flota-prueba.db"</w:t>
-      </w:r>
-      <w:r>
-        <w:br/>
-      </w:r>
-      <w:r>
-        <w:rPr>
-          <w:rStyle w:val="NormalTok"/>
-        </w:rPr>
-        <w:t xml:space="preserve">uv run alembic upgrade head</w:t>
-      </w:r>
-      <w:r>
-        <w:br/>
-      </w:r>
-      <w:r>
-        <w:rPr>
-          <w:rStyle w:val="NormalTok"/>
-        </w:rPr>
-        <w:t xml:space="preserve">uv run flota datos-demo</w:t>
-      </w:r>
-      <w:r>
-        <w:br/>
-      </w:r>
-      <w:r>
-        <w:rPr>
-          <w:rStyle w:val="NormalTok"/>
-        </w:rPr>
-        <w:t xml:space="preserve">uv run flota servidor</w:t>
-      </w:r>
-    </w:p>
-    <w:p>
-      <w:pPr>
-        <w:pStyle w:val="BlockText"/>
-      </w:pPr>
-      <w:r>
-        <w:t xml:space="preserve">El archivo</w:t>
-      </w:r>
-      <w:r>
-        <w:t xml:space="preserve"> </w:t>
-      </w:r>
-      <w:r>
-        <w:rPr>
-          <w:rStyle w:val="VerbatimChar"/>
-        </w:rPr>
-        <w:t xml:space="preserve">.db</w:t>
-      </w:r>
-      <w:r>
-        <w:t xml:space="preserve"> </w:t>
-      </w:r>
-      <w:r>
-        <w:t xml:space="preserve">está en</w:t>
-      </w:r>
-      <w:r>
-        <w:t xml:space="preserve"> </w:t>
-      </w:r>
-      <w:r>
-        <w:rPr>
-          <w:rStyle w:val="VerbatimChar"/>
-        </w:rPr>
-        <w:t xml:space="preserve">.gitignore</w:t>
-      </w:r>
-      <w:r>
-        <w:t xml:space="preserve"> </w:t>
-      </w:r>
-      <w:r>
-        <w:t xml:space="preserve">(no se sube). Los datos de SQLite no pasan a PostgreSQL.</w:t>
-      </w:r>
-    </w:p>
-    <w:p>
-      <w:r>
-        <w:pict>
-          <v:rect style="width:0;height:1.5pt" o:hralign="center" o:hrstd="t" o:hr="t"/>
-        </w:pict>
-      </w:r>
-    </w:p>
-    <w:bookmarkEnd w:id="45"/>
-    <w:bookmarkStart w:id="46" w:name="X56571861d2af40b24359ed2f824d150b144acc0"/>
-    <w:p>
-      <w:pPr>
-        <w:pStyle w:val="Heading1"/>
-      </w:pPr>
-      <w:r>
-        <w:t xml:space="preserve">9. Cómo agregar una funcionalidad nueva</w:t>
-      </w:r>
-    </w:p>
-    <w:p>
-      <w:pPr>
-        <w:pStyle w:val="FirstParagraph"/>
-      </w:pPr>
-      <w:r>
-        <w:t xml:space="preserve">Casi todo requerimiento sigue el mismo camino, de adentro hacia afuera,</w:t>
-      </w:r>
-      <w:r>
-        <w:t xml:space="preserve"> </w:t>
-      </w:r>
-      <w:r>
-        <w:rPr>
-          <w:b/>
-          <w:bCs/>
-        </w:rPr>
-        <w:t xml:space="preserve">dentro de su módulo</w:t>
-      </w:r>
-      <w:r>
-        <w:t xml:space="preserve">:</w:t>
       </w:r>
     </w:p>
     <w:p>
@@ -10867,7 +11531,7 @@
           <w:b/>
           <w:bCs/>
         </w:rPr>
-        <w:t xml:space="preserve">Dominio</w:t>
+        <w:t xml:space="preserve">Fixtures</w:t>
       </w:r>
       <w:r>
         <w:t xml:space="preserve"> </w:t>
@@ -10879,10 +11543,10 @@
         <w:rPr>
           <w:rStyle w:val="VerbatimChar"/>
         </w:rPr>
-        <w:t xml:space="preserve">&lt;modulo&gt;/domain/</w:t>
-      </w:r>
-      <w:r>
-        <w:t xml:space="preserve">): entidad, campo o regla + test unitario.</w:t>
+        <w:t xml:space="preserve">@pytest.fixture</w:t>
+      </w:r>
+      <w:r>
+        <w:t xml:space="preserve">): objetos que pytest prepara y entrega a cada test que los pide por nombre.</w:t>
       </w:r>
     </w:p>
     <w:p>
@@ -10894,93 +11558,16 @@
         </w:numPr>
       </w:pPr>
       <w:r>
-        <w:rPr>
-          <w:b/>
-          <w:bCs/>
-        </w:rPr>
-        <w:t xml:space="preserve">Aplicación</w:t>
-      </w:r>
-      <w:r>
-        <w:t xml:space="preserve"> </w:t>
-      </w:r>
-      <w:r>
-        <w:t xml:space="preserve">(</w:t>
-      </w:r>
-      <w:r>
-        <w:rPr>
-          <w:rStyle w:val="VerbatimChar"/>
-        </w:rPr>
-        <w:t xml:space="preserve">&lt;modulo&gt;/application/</w:t>
-      </w:r>
-      <w:r>
-        <w:t xml:space="preserve">): caso de uso (con su código CU/RF en el docstring) +</w:t>
-      </w:r>
-      <w:r>
-        <w:t xml:space="preserve"> </w:t>
-      </w:r>
-      <w:r>
-        <w:t xml:space="preserve">test con fakes. Si necesita un repositorio nuevo, agregarlo al</w:t>
-      </w:r>
-      <w:r>
-        <w:t xml:space="preserve"> </w:t>
-      </w:r>
-      <w:r>
-        <w:rPr>
-          <w:rStyle w:val="VerbatimChar"/>
-        </w:rPr>
-        <w:t xml:space="preserve">UoW&lt;Modulo&gt;</w:t>
-      </w:r>
-      <w:r>
-        <w:t xml:space="preserve"> </w:t>
-      </w:r>
-      <w:r>
-        <w:t xml:space="preserve">del módulo.</w:t>
-      </w:r>
-      <w:r>
-        <w:t xml:space="preserve"> </w:t>
-      </w:r>
-      <w:r>
-        <w:t xml:space="preserve">Si otro módulo tiene que reaccionar, publicar un</w:t>
-      </w:r>
-      <w:r>
-        <w:t xml:space="preserve"> </w:t>
-      </w:r>
-      <w:r>
-        <w:rPr>
-          <w:b/>
-          <w:bCs/>
-        </w:rPr>
-        <w:t xml:space="preserve">evento</w:t>
-      </w:r>
-      <w:r>
-        <w:t xml:space="preserve"> </w:t>
-      </w:r>
-      <w:r>
-        <w:t xml:space="preserve">(</w:t>
-      </w:r>
-      <w:r>
-        <w:rPr>
-          <w:rStyle w:val="VerbatimChar"/>
-        </w:rPr>
-        <w:t xml:space="preserve">uow.registrar_evento(...)</w:t>
-      </w:r>
-      <w:r>
-        <w:t xml:space="preserve">) en</w:t>
-      </w:r>
-      <w:r>
-        <w:t xml:space="preserve"> </w:t>
-      </w:r>
-      <w:r>
-        <w:t xml:space="preserve">lugar de llamarlo directamente, y suscribir el manejador en</w:t>
-      </w:r>
-      <w:r>
-        <w:t xml:space="preserve"> </w:t>
-      </w:r>
-      <w:r>
-        <w:rPr>
-          <w:rStyle w:val="VerbatimChar"/>
-        </w:rPr>
-        <w:t xml:space="preserve">bootstrap.py</w:t>
+        <w:t xml:space="preserve">Los nombres de los tests describen la regla:</w:t>
+      </w:r>
+      <w:r>
+        <w:t xml:space="preserve"> </w:t>
+      </w:r>
+      <w:r>
+        <w:rPr>
+          <w:rStyle w:val="VerbatimChar"/>
+        </w:rPr>
+        <w:t xml:space="preserve">test_la_referencia_del_camion_informa_el_desvio_pero_no_alerta</w:t>
       </w:r>
       <w:r>
         <w:t xml:space="preserve">.</w:t>
@@ -10988,223 +11575,112 @@
     </w:p>
     <w:p>
       <w:pPr>
-        <w:pStyle w:val="Compact"/>
-        <w:numPr>
-          <w:ilvl w:val="0"/>
-          <w:numId w:val="1019"/>
-        </w:numPr>
-      </w:pPr>
-      <w:r>
-        <w:rPr>
-          <w:b/>
-          <w:bCs/>
-        </w:rPr>
-        <w:t xml:space="preserve">Infraestructura</w:t>
-      </w:r>
-      <w:r>
-        <w:t xml:space="preserve"> </w:t>
-      </w:r>
-      <w:r>
-        <w:t xml:space="preserve">(</w:t>
-      </w:r>
-      <w:r>
-        <w:rPr>
-          <w:rStyle w:val="VerbatimChar"/>
-        </w:rPr>
-        <w:t xml:space="preserve">&lt;modulo&gt;/infrastructure/</w:t>
-      </w:r>
-      <w:r>
-        <w:t xml:space="preserve">): tabla en</w:t>
-      </w:r>
-      <w:r>
-        <w:t xml:space="preserve"> </w:t>
-      </w:r>
-      <w:r>
-        <w:rPr>
-          <w:rStyle w:val="VerbatimChar"/>
-        </w:rPr>
-        <w:t xml:space="preserve">modelos.py</w:t>
-      </w:r>
-      <w:r>
-        <w:t xml:space="preserve">, repositorio SQL; registrarlo</w:t>
-      </w:r>
-      <w:r>
-        <w:t xml:space="preserve"> </w:t>
-      </w:r>
-      <w:r>
-        <w:t xml:space="preserve">en unidad_de_trabajo.py y el módulo de modelos en</w:t>
-      </w:r>
-      <w:r>
-        <w:t xml:space="preserve"> </w:t>
-      </w:r>
-      <w:r>
-        <w:t xml:space="preserve">modelos.py. Migración con Alembic (revisar el borrador; probar</w:t>
-      </w:r>
-      <w:r>
-        <w:t xml:space="preserve"> </w:t>
-      </w:r>
-      <w:r>
-        <w:rPr>
-          <w:rStyle w:val="VerbatimChar"/>
-        </w:rPr>
-        <w:t xml:space="preserve">upgrade</w:t>
-      </w:r>
-      <w:r>
-        <w:t xml:space="preserve">,</w:t>
-      </w:r>
-      <w:r>
-        <w:t xml:space="preserve"> </w:t>
-      </w:r>
-      <w:r>
-        <w:rPr>
-          <w:rStyle w:val="VerbatimChar"/>
-        </w:rPr>
-        <w:t xml:space="preserve">downgrade</w:t>
-      </w:r>
-      <w:r>
-        <w:t xml:space="preserve"> </w:t>
-      </w:r>
-      <w:r>
-        <w:t xml:space="preserve">y</w:t>
-      </w:r>
-      <w:r>
-        <w:t xml:space="preserve"> </w:t>
-      </w:r>
-      <w:r>
-        <w:rPr>
-          <w:rStyle w:val="VerbatimChar"/>
-        </w:rPr>
-        <w:t xml:space="preserve">check</w:t>
-      </w:r>
-      <w:r>
-        <w:t xml:space="preserve">).</w:t>
-      </w:r>
-    </w:p>
-    <w:p>
-      <w:pPr>
-        <w:pStyle w:val="Compact"/>
-        <w:numPr>
-          <w:ilvl w:val="0"/>
-          <w:numId w:val="1019"/>
-        </w:numPr>
-      </w:pPr>
-      <w:r>
-        <w:rPr>
-          <w:b/>
-          <w:bCs/>
-        </w:rPr>
-        <w:t xml:space="preserve">Presentación</w:t>
-      </w:r>
-      <w:r>
-        <w:t xml:space="preserve"> </w:t>
-      </w:r>
-      <w:r>
-        <w:t xml:space="preserve">(</w:t>
-      </w:r>
-      <w:r>
-        <w:rPr>
-          <w:rStyle w:val="VerbatimChar"/>
-        </w:rPr>
-        <w:t xml:space="preserve">&lt;modulo&gt;/presentation/</w:t>
-      </w:r>
-      <w:r>
-        <w:t xml:space="preserve">): esquema Pydantic +</w:t>
-      </w:r>
-      <w:r>
-        <w:t xml:space="preserve"> </w:t>
-      </w:r>
-      <w:r>
-        <w:rPr>
-          <w:rStyle w:val="VerbatimChar"/>
-        </w:rPr>
-        <w:t xml:space="preserve">api.py</w:t>
-      </w:r>
-      <w:r>
-        <w:t xml:space="preserve"> </w:t>
-      </w:r>
-      <w:r>
-        <w:t xml:space="preserve">y/o</w:t>
-      </w:r>
-      <w:r>
-        <w:t xml:space="preserve"> </w:t>
-      </w:r>
-      <w:r>
-        <w:rPr>
-          <w:rStyle w:val="VerbatimChar"/>
-        </w:rPr>
-        <w:t xml:space="preserve">web.py</w:t>
-      </w:r>
-      <w:r>
-        <w:t xml:space="preserve">; registrar</w:t>
-      </w:r>
-      <w:r>
-        <w:t xml:space="preserve"> </w:t>
-      </w:r>
-      <w:r>
-        <w:t xml:space="preserve">el router en main.py + test de integración.</w:t>
-      </w:r>
-    </w:p>
-    <w:p>
-      <w:pPr>
-        <w:pStyle w:val="Compact"/>
-        <w:numPr>
-          <w:ilvl w:val="0"/>
-          <w:numId w:val="1019"/>
-        </w:numPr>
-      </w:pPr>
-      <w:r>
-        <w:rPr>
-          <w:rStyle w:val="VerbatimChar"/>
-        </w:rPr>
-        <w:t xml:space="preserve">uv run pytest</w:t>
-      </w:r>
-      <w:r>
-        <w:t xml:space="preserve"> </w:t>
-      </w:r>
-      <w:r>
-        <w:t xml:space="preserve">y</w:t>
-      </w:r>
-      <w:r>
-        <w:t xml:space="preserve"> </w:t>
-      </w:r>
-      <w:r>
-        <w:rPr>
-          <w:rStyle w:val="VerbatimChar"/>
-        </w:rPr>
-        <w:t xml:space="preserve">uv run ruff check .</w:t>
-      </w:r>
-      <w:r>
-        <w:t xml:space="preserve"> </w:t>
-      </w:r>
-      <w:r>
-        <w:t xml:space="preserve">en verde; nota de la sesión en</w:t>
-      </w:r>
-      <w:r>
-        <w:t xml:space="preserve"> </w:t>
-      </w:r>
-      <w:r>
-        <w:rPr>
-          <w:rStyle w:val="VerbatimChar"/>
-        </w:rPr>
-        <w:t xml:space="preserve">docs/sesiones/</w:t>
-      </w:r>
-      <w:r>
-        <w:t xml:space="preserve">; actualizar</w:t>
-      </w:r>
-      <w:r>
-        <w:t xml:space="preserve"> </w:t>
-      </w:r>
-      <w:r>
-        <w:t xml:space="preserve">esta guía y regenerar los Word (</w:t>
-      </w:r>
-      <w:r>
-        <w:rPr>
-          <w:rStyle w:val="VerbatimChar"/>
-        </w:rPr>
-        <w:t xml:space="preserve">uv run python scripts/generar_word.py</w:t>
-      </w:r>
-      <w:r>
-        <w:t xml:space="preserve">).</w:t>
+        <w:pStyle w:val="SourceCode"/>
+      </w:pPr>
+      <w:r>
+        <w:rPr>
+          <w:rStyle w:val="NormalTok"/>
+        </w:rPr>
+        <w:t xml:space="preserve">uv run pytest              </w:t>
+      </w:r>
+      <w:r>
+        <w:rPr>
+          <w:rStyle w:val="CommentTok"/>
+        </w:rPr>
+        <w:t xml:space="preserve"># todos</w:t>
+      </w:r>
+      <w:r>
+        <w:br/>
+      </w:r>
+      <w:r>
+        <w:rPr>
+          <w:rStyle w:val="NormalTok"/>
+        </w:rPr>
+        <w:t xml:space="preserve">uv run pytest tests</w:t>
+      </w:r>
+      <w:r>
+        <w:rPr>
+          <w:rStyle w:val="OperatorTok"/>
+        </w:rPr>
+        <w:t xml:space="preserve">/</w:t>
+      </w:r>
+      <w:r>
+        <w:rPr>
+          <w:rStyle w:val="NormalTok"/>
+        </w:rPr>
+        <w:t xml:space="preserve">unit   </w:t>
+      </w:r>
+      <w:r>
+        <w:rPr>
+          <w:rStyle w:val="CommentTok"/>
+        </w:rPr>
+        <w:t xml:space="preserve"># sólo unitarios</w:t>
+      </w:r>
+      <w:r>
+        <w:br/>
+      </w:r>
+      <w:r>
+        <w:rPr>
+          <w:rStyle w:val="NormalTok"/>
+        </w:rPr>
+        <w:t xml:space="preserve">uv run pytest </w:t>
+      </w:r>
+      <w:r>
+        <w:rPr>
+          <w:rStyle w:val="OperatorTok"/>
+        </w:rPr>
+        <w:t xml:space="preserve">-</w:t>
+      </w:r>
+      <w:r>
+        <w:rPr>
+          <w:rStyle w:val="NormalTok"/>
+        </w:rPr>
+        <w:t xml:space="preserve">k tramo     </w:t>
+      </w:r>
+      <w:r>
+        <w:rPr>
+          <w:rStyle w:val="CommentTok"/>
+        </w:rPr>
+        <w:t xml:space="preserve"># sólo los que contienen "tramo" en el nombre</w:t>
+      </w:r>
+      <w:r>
+        <w:br/>
+      </w:r>
+      <w:r>
+        <w:rPr>
+          <w:rStyle w:val="NormalTok"/>
+        </w:rPr>
+        <w:t xml:space="preserve">uv run pytest </w:t>
+      </w:r>
+      <w:r>
+        <w:rPr>
+          <w:rStyle w:val="OperatorTok"/>
+        </w:rPr>
+        <w:t xml:space="preserve">-</w:t>
+      </w:r>
+      <w:r>
+        <w:rPr>
+          <w:rStyle w:val="NormalTok"/>
+        </w:rPr>
+        <w:t xml:space="preserve">x </w:t>
+      </w:r>
+      <w:r>
+        <w:rPr>
+          <w:rStyle w:val="OperatorTok"/>
+        </w:rPr>
+        <w:t xml:space="preserve">-</w:t>
+      </w:r>
+      <w:r>
+        <w:rPr>
+          <w:rStyle w:val="NormalTok"/>
+        </w:rPr>
+        <w:t xml:space="preserve">v        </w:t>
+      </w:r>
+      <w:r>
+        <w:rPr>
+          <w:rStyle w:val="CommentTok"/>
+        </w:rPr>
+        <w:t xml:space="preserve"># detenerse en el primer fallo, con detalle</w:t>
       </w:r>
     </w:p>
     <w:p>
@@ -11215,13 +11691,13 @@
       </w:r>
     </w:p>
     <w:bookmarkEnd w:id="46"/>
-    <w:bookmarkStart w:id="47" w:name="X09bcc076eb5122c50326e7c228eb7775fb4a6ab"/>
+    <w:bookmarkStart w:id="47" w:name="Xe5b9ca0edd62c85c4b69fc58d4dbf323c98dc91"/>
     <w:p>
       <w:pPr>
         <w:pStyle w:val="Heading1"/>
       </w:pPr>
       <w:r>
-        <w:t xml:space="preserve">10. Ruta de estudio sugerida</w:t>
+        <w:t xml:space="preserve">8. Ejecutar el proyecto en local</w:t>
       </w:r>
     </w:p>
     <w:p>
@@ -11229,7 +11705,400 @@
         <w:pStyle w:val="FirstParagraph"/>
       </w:pPr>
       <w:r>
-        <w:t xml:space="preserve">De lo más puro a lo más técnico:</w:t>
+        <w:t xml:space="preserve">Desde la Sesión 6 el panel pide</w:t>
+      </w:r>
+      <w:r>
+        <w:t xml:space="preserve"> </w:t>
+      </w:r>
+      <w:r>
+        <w:rPr>
+          <w:b/>
+          <w:bCs/>
+        </w:rPr>
+        <w:t xml:space="preserve">usuario y contraseña</w:t>
+      </w:r>
+      <w:r>
+        <w:t xml:space="preserve">. Para empezar hay que crear el primer</w:t>
+      </w:r>
+      <w:r>
+        <w:t xml:space="preserve"> </w:t>
+      </w:r>
+      <w:r>
+        <w:t xml:space="preserve">Administrador de sistema (</w:t>
+      </w:r>
+      <w:r>
+        <w:rPr>
+          <w:rStyle w:val="VerbatimChar"/>
+        </w:rPr>
+        <w:t xml:space="preserve">flota crear-usuario</w:t>
+      </w:r>
+      <w:r>
+        <w:t xml:space="preserve">), o cargar los datos de ejemplo, que traen un</w:t>
+      </w:r>
+      <w:r>
+        <w:t xml:space="preserve"> </w:t>
+      </w:r>
+      <w:r>
+        <w:t xml:space="preserve">usuario por rol con la contraseña</w:t>
+      </w:r>
+      <w:r>
+        <w:t xml:space="preserve"> </w:t>
+      </w:r>
+      <w:r>
+        <w:rPr>
+          <w:rStyle w:val="VerbatimChar"/>
+        </w:rPr>
+        <w:t xml:space="preserve">demo1234</w:t>
+      </w:r>
+      <w:r>
+        <w:t xml:space="preserve"> </w:t>
+      </w:r>
+      <w:r>
+        <w:t xml:space="preserve">(</w:t>
+      </w:r>
+      <w:r>
+        <w:rPr>
+          <w:rStyle w:val="VerbatimChar"/>
+        </w:rPr>
+        <w:t xml:space="preserve">admin@hidalgo.demo</w:t>
+      </w:r>
+      <w:r>
+        <w:t xml:space="preserve">,</w:t>
+      </w:r>
+      <w:r>
+        <w:t xml:space="preserve"> </w:t>
+      </w:r>
+      <w:r>
+        <w:rPr>
+          <w:rStyle w:val="VerbatimChar"/>
+        </w:rPr>
+        <w:t xml:space="preserve">gerencia@hidalgo.demo</w:t>
+      </w:r>
+      <w:r>
+        <w:t xml:space="preserve">, …).</w:t>
+      </w:r>
+    </w:p>
+    <w:p>
+      <w:pPr>
+        <w:pStyle w:val="BodyText"/>
+      </w:pPr>
+      <w:r>
+        <w:rPr>
+          <w:b/>
+          <w:bCs/>
+        </w:rPr>
+        <w:t xml:space="preserve">Con PostgreSQL</w:t>
+      </w:r>
+      <w:r>
+        <w:t xml:space="preserve"> </w:t>
+      </w:r>
+      <w:r>
+        <w:t xml:space="preserve">(requiere</w:t>
+      </w:r>
+      <w:r>
+        <w:t xml:space="preserve"> </w:t>
+      </w:r>
+      <w:r>
+        <w:rPr>
+          <w:rStyle w:val="VerbatimChar"/>
+        </w:rPr>
+        <w:t xml:space="preserve">DB_PASSWORD</w:t>
+      </w:r>
+      <w:r>
+        <w:t xml:space="preserve"> </w:t>
+      </w:r>
+      <w:r>
+        <w:t xml:space="preserve">y</w:t>
+      </w:r>
+      <w:r>
+        <w:t xml:space="preserve"> </w:t>
+      </w:r>
+      <w:r>
+        <w:rPr>
+          <w:rStyle w:val="VerbatimChar"/>
+        </w:rPr>
+        <w:t xml:space="preserve">SECRET_KEY</w:t>
+      </w:r>
+      <w:r>
+        <w:t xml:space="preserve"> </w:t>
+      </w:r>
+      <w:r>
+        <w:t xml:space="preserve">en</w:t>
+      </w:r>
+      <w:r>
+        <w:t xml:space="preserve"> </w:t>
+      </w:r>
+      <w:r>
+        <w:rPr>
+          <w:rStyle w:val="VerbatimChar"/>
+        </w:rPr>
+        <w:t xml:space="preserve">.env</w:t>
+      </w:r>
+      <w:r>
+        <w:t xml:space="preserve">):</w:t>
+      </w:r>
+    </w:p>
+    <w:p>
+      <w:pPr>
+        <w:pStyle w:val="SourceCode"/>
+      </w:pPr>
+      <w:r>
+        <w:rPr>
+          <w:rStyle w:val="NormalTok"/>
+        </w:rPr>
+        <w:t xml:space="preserve">uv run flota crear-db</w:t>
+      </w:r>
+      <w:r>
+        <w:br/>
+      </w:r>
+      <w:r>
+        <w:rPr>
+          <w:rStyle w:val="NormalTok"/>
+        </w:rPr>
+        <w:t xml:space="preserve">uv run alembic upgrade head</w:t>
+      </w:r>
+      <w:r>
+        <w:br/>
+      </w:r>
+      <w:r>
+        <w:rPr>
+          <w:rStyle w:val="NormalTok"/>
+        </w:rPr>
+        <w:t xml:space="preserve">uv run flota crear-usuario admin@empresa</w:t>
+      </w:r>
+      <w:r>
+        <w:rPr>
+          <w:rStyle w:val="OperatorTok"/>
+        </w:rPr>
+        <w:t xml:space="preserve">.</w:t>
+      </w:r>
+      <w:r>
+        <w:rPr>
+          <w:rStyle w:val="FunctionTok"/>
+        </w:rPr>
+        <w:t xml:space="preserve">com</w:t>
+      </w:r>
+      <w:r>
+        <w:rPr>
+          <w:rStyle w:val="NormalTok"/>
+        </w:rPr>
+        <w:t xml:space="preserve"> </w:t>
+      </w:r>
+      <w:r>
+        <w:rPr>
+          <w:rStyle w:val="StringTok"/>
+        </w:rPr>
+        <w:t xml:space="preserve">"Nombre"</w:t>
+      </w:r>
+      <w:r>
+        <w:rPr>
+          <w:rStyle w:val="NormalTok"/>
+        </w:rPr>
+        <w:t xml:space="preserve">   </w:t>
+      </w:r>
+      <w:r>
+        <w:rPr>
+          <w:rStyle w:val="CommentTok"/>
+        </w:rPr>
+        <w:t xml:space="preserve"># pide la contraseña (ROL-07)</w:t>
+      </w:r>
+      <w:r>
+        <w:br/>
+      </w:r>
+      <w:r>
+        <w:rPr>
+          <w:rStyle w:val="NormalTok"/>
+        </w:rPr>
+        <w:t xml:space="preserve">uv run flota datos-demo        </w:t>
+      </w:r>
+      <w:r>
+        <w:rPr>
+          <w:rStyle w:val="CommentTok"/>
+        </w:rPr>
+        <w:t xml:space="preserve"># opcional: 2 camiones, 2 rutas, 8 viajes ida cargado / regreso vacío</w:t>
+      </w:r>
+      <w:r>
+        <w:br/>
+      </w:r>
+      <w:r>
+        <w:rPr>
+          <w:rStyle w:val="NormalTok"/>
+        </w:rPr>
+        <w:t xml:space="preserve">uv run flota servidor          </w:t>
+      </w:r>
+      <w:r>
+        <w:rPr>
+          <w:rStyle w:val="CommentTok"/>
+        </w:rPr>
+        <w:t xml:space="preserve"># http://127.0.0.1:8000 · API en /docs</w:t>
+      </w:r>
+    </w:p>
+    <w:p>
+      <w:pPr>
+        <w:pStyle w:val="FirstParagraph"/>
+      </w:pPr>
+      <w:r>
+        <w:rPr>
+          <w:b/>
+          <w:bCs/>
+        </w:rPr>
+        <w:t xml:space="preserve">Con SQLite, para probar rápido</w:t>
+      </w:r>
+      <w:r>
+        <w:t xml:space="preserve"> </w:t>
+      </w:r>
+      <w:r>
+        <w:t xml:space="preserve">(sin contraseña, base en un archivo):</w:t>
+      </w:r>
+    </w:p>
+    <w:p>
+      <w:pPr>
+        <w:pStyle w:val="SourceCode"/>
+      </w:pPr>
+      <w:r>
+        <w:rPr>
+          <w:rStyle w:val="VariableTok"/>
+        </w:rPr>
+        <w:t xml:space="preserve">$env</w:t>
+      </w:r>
+      <w:r>
+        <w:rPr>
+          <w:rStyle w:val="OperatorTok"/>
+        </w:rPr>
+        <w:t xml:space="preserve">:</w:t>
+      </w:r>
+      <w:r>
+        <w:rPr>
+          <w:rStyle w:val="VariableTok"/>
+        </w:rPr>
+        <w:t xml:space="preserve">DATABASE_URL</w:t>
+      </w:r>
+      <w:r>
+        <w:rPr>
+          <w:rStyle w:val="NormalTok"/>
+        </w:rPr>
+        <w:t xml:space="preserve"> </w:t>
+      </w:r>
+      <w:r>
+        <w:rPr>
+          <w:rStyle w:val="OperatorTok"/>
+        </w:rPr>
+        <w:t xml:space="preserve">=</w:t>
+      </w:r>
+      <w:r>
+        <w:rPr>
+          <w:rStyle w:val="NormalTok"/>
+        </w:rPr>
+        <w:t xml:space="preserve"> </w:t>
+      </w:r>
+      <w:r>
+        <w:rPr>
+          <w:rStyle w:val="StringTok"/>
+        </w:rPr>
+        <w:t xml:space="preserve">"sqlite:///flota-prueba.db"</w:t>
+      </w:r>
+      <w:r>
+        <w:br/>
+      </w:r>
+      <w:r>
+        <w:rPr>
+          <w:rStyle w:val="NormalTok"/>
+        </w:rPr>
+        <w:t xml:space="preserve">uv run alembic upgrade head</w:t>
+      </w:r>
+      <w:r>
+        <w:br/>
+      </w:r>
+      <w:r>
+        <w:rPr>
+          <w:rStyle w:val="NormalTok"/>
+        </w:rPr>
+        <w:t xml:space="preserve">uv run flota datos-demo</w:t>
+      </w:r>
+      <w:r>
+        <w:br/>
+      </w:r>
+      <w:r>
+        <w:rPr>
+          <w:rStyle w:val="NormalTok"/>
+        </w:rPr>
+        <w:t xml:space="preserve">uv run flota servidor</w:t>
+      </w:r>
+    </w:p>
+    <w:p>
+      <w:pPr>
+        <w:pStyle w:val="BlockText"/>
+      </w:pPr>
+      <w:r>
+        <w:t xml:space="preserve">El archivo</w:t>
+      </w:r>
+      <w:r>
+        <w:t xml:space="preserve"> </w:t>
+      </w:r>
+      <w:r>
+        <w:rPr>
+          <w:rStyle w:val="VerbatimChar"/>
+        </w:rPr>
+        <w:t xml:space="preserve">.db</w:t>
+      </w:r>
+      <w:r>
+        <w:t xml:space="preserve"> </w:t>
+      </w:r>
+      <w:r>
+        <w:t xml:space="preserve">está en</w:t>
+      </w:r>
+      <w:r>
+        <w:t xml:space="preserve"> </w:t>
+      </w:r>
+      <w:r>
+        <w:rPr>
+          <w:rStyle w:val="VerbatimChar"/>
+        </w:rPr>
+        <w:t xml:space="preserve">.gitignore</w:t>
+      </w:r>
+      <w:r>
+        <w:t xml:space="preserve"> </w:t>
+      </w:r>
+      <w:r>
+        <w:t xml:space="preserve">(no se sube). Los datos de SQLite no pasan a PostgreSQL.</w:t>
+      </w:r>
+    </w:p>
+    <w:p>
+      <w:r>
+        <w:pict>
+          <v:rect style="width:0;height:1.5pt" o:hralign="center" o:hrstd="t" o:hr="t"/>
+        </w:pict>
+      </w:r>
+    </w:p>
+    <w:bookmarkEnd w:id="47"/>
+    <w:bookmarkStart w:id="48" w:name="X56571861d2af40b24359ed2f824d150b144acc0"/>
+    <w:p>
+      <w:pPr>
+        <w:pStyle w:val="Heading1"/>
+      </w:pPr>
+      <w:r>
+        <w:t xml:space="preserve">9. Cómo agregar una funcionalidad nueva</w:t>
+      </w:r>
+    </w:p>
+    <w:p>
+      <w:pPr>
+        <w:pStyle w:val="FirstParagraph"/>
+      </w:pPr>
+      <w:r>
+        <w:t xml:space="preserve">Casi todo requerimiento sigue el mismo camino, de adentro hacia afuera,</w:t>
+      </w:r>
+      <w:r>
+        <w:t xml:space="preserve"> </w:t>
+      </w:r>
+      <w:r>
+        <w:rPr>
+          <w:b/>
+          <w:bCs/>
+        </w:rPr>
+        <w:t xml:space="preserve">dentro de su módulo</w:t>
+      </w:r>
+      <w:r>
+        <w:t xml:space="preserve">:</w:t>
       </w:r>
     </w:p>
     <w:p>
@@ -11241,7 +12110,26 @@
         </w:numPr>
       </w:pPr>
       <w:r>
-        <w:t xml:space="preserve">shared/domain/ → catalogo/domain/entidades.py</w:t>
+        <w:rPr>
+          <w:b/>
+          <w:bCs/>
+        </w:rPr>
+        <w:t xml:space="preserve">Dominio</w:t>
+      </w:r>
+      <w:r>
+        <w:t xml:space="preserve"> </w:t>
+      </w:r>
+      <w:r>
+        <w:t xml:space="preserve">(</w:t>
+      </w:r>
+      <w:r>
+        <w:rPr>
+          <w:rStyle w:val="VerbatimChar"/>
+        </w:rPr>
+        <w:t xml:space="preserve">&lt;modulo&gt;/domain/</w:t>
+      </w:r>
+      <w:r>
+        <w:t xml:space="preserve">): entidad, campo o regla + test unitario.</w:t>
       </w:r>
     </w:p>
     <w:p>
@@ -11253,7 +12141,96 @@
         </w:numPr>
       </w:pPr>
       <w:r>
-        <w:t xml:space="preserve">viajes/domain/entidades.py (agregado viaje + tramos) y su test test_viajes.py</w:t>
+        <w:rPr>
+          <w:b/>
+          <w:bCs/>
+        </w:rPr>
+        <w:t xml:space="preserve">Aplicación</w:t>
+      </w:r>
+      <w:r>
+        <w:t xml:space="preserve"> </w:t>
+      </w:r>
+      <w:r>
+        <w:t xml:space="preserve">(</w:t>
+      </w:r>
+      <w:r>
+        <w:rPr>
+          <w:rStyle w:val="VerbatimChar"/>
+        </w:rPr>
+        <w:t xml:space="preserve">&lt;modulo&gt;/application/</w:t>
+      </w:r>
+      <w:r>
+        <w:t xml:space="preserve">): caso de uso (con su código CU/RF en el docstring) +</w:t>
+      </w:r>
+      <w:r>
+        <w:t xml:space="preserve"> </w:t>
+      </w:r>
+      <w:r>
+        <w:t xml:space="preserve">test con fakes. Si necesita un repositorio nuevo, agregarlo al</w:t>
+      </w:r>
+      <w:r>
+        <w:t xml:space="preserve"> </w:t>
+      </w:r>
+      <w:r>
+        <w:rPr>
+          <w:rStyle w:val="VerbatimChar"/>
+        </w:rPr>
+        <w:t xml:space="preserve">UoW&lt;Modulo&gt;</w:t>
+      </w:r>
+      <w:r>
+        <w:t xml:space="preserve"> </w:t>
+      </w:r>
+      <w:r>
+        <w:t xml:space="preserve">del módulo.</w:t>
+      </w:r>
+      <w:r>
+        <w:t xml:space="preserve"> </w:t>
+      </w:r>
+      <w:r>
+        <w:t xml:space="preserve">Si otro módulo tiene que reaccionar, publicar un</w:t>
+      </w:r>
+      <w:r>
+        <w:t xml:space="preserve"> </w:t>
+      </w:r>
+      <w:r>
+        <w:rPr>
+          <w:b/>
+          <w:bCs/>
+        </w:rPr>
+        <w:t xml:space="preserve">evento</w:t>
+      </w:r>
+      <w:r>
+        <w:t xml:space="preserve"> </w:t>
+      </w:r>
+      <w:r>
+        <w:t xml:space="preserve">(</w:t>
+      </w:r>
+      <w:r>
+        <w:rPr>
+          <w:rStyle w:val="VerbatimChar"/>
+        </w:rPr>
+        <w:t xml:space="preserve">uow.registrar_evento(...)</w:t>
+      </w:r>
+      <w:r>
+        <w:t xml:space="preserve">) en</w:t>
+      </w:r>
+      <w:r>
+        <w:t xml:space="preserve"> </w:t>
+      </w:r>
+      <w:r>
+        <w:t xml:space="preserve">lugar de llamarlo directamente, y suscribir el manejador en</w:t>
+      </w:r>
+      <w:r>
+        <w:t xml:space="preserve"> </w:t>
+      </w:r>
+      <w:r>
+        <w:rPr>
+          <w:rStyle w:val="VerbatimChar"/>
+        </w:rPr>
+        <w:t xml:space="preserve">bootstrap.py</w:t>
+      </w:r>
+      <w:r>
+        <w:t xml:space="preserve">.</w:t>
       </w:r>
     </w:p>
     <w:p>
@@ -11265,7 +12242,89 @@
         </w:numPr>
       </w:pPr>
       <w:r>
-        <w:t xml:space="preserve">combustible/domain/consumo.py y test_consumo.py</w:t>
+        <w:rPr>
+          <w:b/>
+          <w:bCs/>
+        </w:rPr>
+        <w:t xml:space="preserve">Infraestructura</w:t>
+      </w:r>
+      <w:r>
+        <w:t xml:space="preserve"> </w:t>
+      </w:r>
+      <w:r>
+        <w:t xml:space="preserve">(</w:t>
+      </w:r>
+      <w:r>
+        <w:rPr>
+          <w:rStyle w:val="VerbatimChar"/>
+        </w:rPr>
+        <w:t xml:space="preserve">&lt;modulo&gt;/infrastructure/</w:t>
+      </w:r>
+      <w:r>
+        <w:t xml:space="preserve">): tabla en</w:t>
+      </w:r>
+      <w:r>
+        <w:t xml:space="preserve"> </w:t>
+      </w:r>
+      <w:r>
+        <w:rPr>
+          <w:rStyle w:val="VerbatimChar"/>
+        </w:rPr>
+        <w:t xml:space="preserve">modelos.py</w:t>
+      </w:r>
+      <w:r>
+        <w:t xml:space="preserve">, repositorio SQL; registrarlo</w:t>
+      </w:r>
+      <w:r>
+        <w:t xml:space="preserve"> </w:t>
+      </w:r>
+      <w:r>
+        <w:t xml:space="preserve">en unidad_de_trabajo.py y el módulo de modelos en</w:t>
+      </w:r>
+      <w:r>
+        <w:t xml:space="preserve"> </w:t>
+      </w:r>
+      <w:r>
+        <w:t xml:space="preserve">modelos.py. Migración con Alembic (revisar el borrador; probar</w:t>
+      </w:r>
+      <w:r>
+        <w:t xml:space="preserve"> </w:t>
+      </w:r>
+      <w:r>
+        <w:rPr>
+          <w:rStyle w:val="VerbatimChar"/>
+        </w:rPr>
+        <w:t xml:space="preserve">upgrade</w:t>
+      </w:r>
+      <w:r>
+        <w:t xml:space="preserve">,</w:t>
+      </w:r>
+      <w:r>
+        <w:t xml:space="preserve"> </w:t>
+      </w:r>
+      <w:r>
+        <w:rPr>
+          <w:rStyle w:val="VerbatimChar"/>
+        </w:rPr>
+        <w:t xml:space="preserve">downgrade</w:t>
+      </w:r>
+      <w:r>
+        <w:t xml:space="preserve"> </w:t>
+      </w:r>
+      <w:r>
+        <w:t xml:space="preserve">y</w:t>
+      </w:r>
+      <w:r>
+        <w:t xml:space="preserve"> </w:t>
+      </w:r>
+      <w:r>
+        <w:rPr>
+          <w:rStyle w:val="VerbatimChar"/>
+        </w:rPr>
+        <w:t xml:space="preserve">check</w:t>
+      </w:r>
+      <w:r>
+        <w:t xml:space="preserve">).</w:t>
       </w:r>
     </w:p>
     <w:p>
@@ -11277,7 +12336,59 @@
         </w:numPr>
       </w:pPr>
       <w:r>
-        <w:t xml:space="preserve">viajes/application/casos_de_uso.py → fakes.py → escenarios.py</w:t>
+        <w:rPr>
+          <w:b/>
+          <w:bCs/>
+        </w:rPr>
+        <w:t xml:space="preserve">Presentación</w:t>
+      </w:r>
+      <w:r>
+        <w:t xml:space="preserve"> </w:t>
+      </w:r>
+      <w:r>
+        <w:t xml:space="preserve">(</w:t>
+      </w:r>
+      <w:r>
+        <w:rPr>
+          <w:rStyle w:val="VerbatimChar"/>
+        </w:rPr>
+        <w:t xml:space="preserve">&lt;modulo&gt;/presentation/</w:t>
+      </w:r>
+      <w:r>
+        <w:t xml:space="preserve">): esquema Pydantic +</w:t>
+      </w:r>
+      <w:r>
+        <w:t xml:space="preserve"> </w:t>
+      </w:r>
+      <w:r>
+        <w:rPr>
+          <w:rStyle w:val="VerbatimChar"/>
+        </w:rPr>
+        <w:t xml:space="preserve">api.py</w:t>
+      </w:r>
+      <w:r>
+        <w:t xml:space="preserve"> </w:t>
+      </w:r>
+      <w:r>
+        <w:t xml:space="preserve">y/o</w:t>
+      </w:r>
+      <w:r>
+        <w:t xml:space="preserve"> </w:t>
+      </w:r>
+      <w:r>
+        <w:rPr>
+          <w:rStyle w:val="VerbatimChar"/>
+        </w:rPr>
+        <w:t xml:space="preserve">web.py</w:t>
+      </w:r>
+      <w:r>
+        <w:t xml:space="preserve">; registrar</w:t>
+      </w:r>
+      <w:r>
+        <w:t xml:space="preserve"> </w:t>
+      </w:r>
+      <w:r>
+        <w:t xml:space="preserve">el router en main.py + test de integración.</w:t>
       </w:r>
     </w:p>
     <w:p>
@@ -11289,7 +12400,83 @@
         </w:numPr>
       </w:pPr>
       <w:r>
-        <w:t xml:space="preserve">viajes/infrastructure/ y la migración de la Sesión 4</w:t>
+        <w:rPr>
+          <w:rStyle w:val="VerbatimChar"/>
+        </w:rPr>
+        <w:t xml:space="preserve">uv run pytest</w:t>
+      </w:r>
+      <w:r>
+        <w:t xml:space="preserve"> </w:t>
+      </w:r>
+      <w:r>
+        <w:t xml:space="preserve">y</w:t>
+      </w:r>
+      <w:r>
+        <w:t xml:space="preserve"> </w:t>
+      </w:r>
+      <w:r>
+        <w:rPr>
+          <w:rStyle w:val="VerbatimChar"/>
+        </w:rPr>
+        <w:t xml:space="preserve">uv run ruff check .</w:t>
+      </w:r>
+      <w:r>
+        <w:t xml:space="preserve"> </w:t>
+      </w:r>
+      <w:r>
+        <w:t xml:space="preserve">en verde; nota de la sesión en</w:t>
+      </w:r>
+      <w:r>
+        <w:t xml:space="preserve"> </w:t>
+      </w:r>
+      <w:r>
+        <w:rPr>
+          <w:rStyle w:val="VerbatimChar"/>
+        </w:rPr>
+        <w:t xml:space="preserve">docs/sesiones/</w:t>
+      </w:r>
+      <w:r>
+        <w:t xml:space="preserve">; actualizar</w:t>
+      </w:r>
+      <w:r>
+        <w:t xml:space="preserve"> </w:t>
+      </w:r>
+      <w:r>
+        <w:t xml:space="preserve">esta guía y regenerar los Word (</w:t>
+      </w:r>
+      <w:r>
+        <w:rPr>
+          <w:rStyle w:val="VerbatimChar"/>
+        </w:rPr>
+        <w:t xml:space="preserve">uv run python scripts/generar_word.py</w:t>
+      </w:r>
+      <w:r>
+        <w:t xml:space="preserve">).</w:t>
+      </w:r>
+    </w:p>
+    <w:p>
+      <w:r>
+        <w:pict>
+          <v:rect style="width:0;height:1.5pt" o:hralign="center" o:hrstd="t" o:hr="t"/>
+        </w:pict>
+      </w:r>
+    </w:p>
+    <w:bookmarkEnd w:id="48"/>
+    <w:bookmarkStart w:id="49" w:name="X09bcc076eb5122c50326e7c228eb7775fb4a6ab"/>
+    <w:p>
+      <w:pPr>
+        <w:pStyle w:val="Heading1"/>
+      </w:pPr>
+      <w:r>
+        <w:t xml:space="preserve">10. Ruta de estudio sugerida</w:t>
+      </w:r>
+    </w:p>
+    <w:p>
+      <w:pPr>
+        <w:pStyle w:val="FirstParagraph"/>
+      </w:pPr>
+      <w:r>
+        <w:t xml:space="preserve">De lo más puro a lo más técnico:</w:t>
       </w:r>
     </w:p>
     <w:p>
@@ -11297,7 +12484,67 @@
         <w:pStyle w:val="Compact"/>
         <w:numPr>
           <w:ilvl w:val="0"/>
-          <w:numId w:val="1020"/>
+          <w:numId w:val="1021"/>
+        </w:numPr>
+      </w:pPr>
+      <w:r>
+        <w:t xml:space="preserve">shared/domain/ → catalogo/domain/entidades.py</w:t>
+      </w:r>
+    </w:p>
+    <w:p>
+      <w:pPr>
+        <w:pStyle w:val="Compact"/>
+        <w:numPr>
+          <w:ilvl w:val="0"/>
+          <w:numId w:val="1021"/>
+        </w:numPr>
+      </w:pPr>
+      <w:r>
+        <w:t xml:space="preserve">viajes/domain/entidades.py (agregado viaje + tramos) y su test test_viajes.py</w:t>
+      </w:r>
+    </w:p>
+    <w:p>
+      <w:pPr>
+        <w:pStyle w:val="Compact"/>
+        <w:numPr>
+          <w:ilvl w:val="0"/>
+          <w:numId w:val="1021"/>
+        </w:numPr>
+      </w:pPr>
+      <w:r>
+        <w:t xml:space="preserve">combustible/domain/consumo.py y test_consumo.py</w:t>
+      </w:r>
+    </w:p>
+    <w:p>
+      <w:pPr>
+        <w:pStyle w:val="Compact"/>
+        <w:numPr>
+          <w:ilvl w:val="0"/>
+          <w:numId w:val="1021"/>
+        </w:numPr>
+      </w:pPr>
+      <w:r>
+        <w:t xml:space="preserve">viajes/application/casos_de_uso.py → fakes.py → escenarios.py</w:t>
+      </w:r>
+    </w:p>
+    <w:p>
+      <w:pPr>
+        <w:pStyle w:val="Compact"/>
+        <w:numPr>
+          <w:ilvl w:val="0"/>
+          <w:numId w:val="1021"/>
+        </w:numPr>
+      </w:pPr>
+      <w:r>
+        <w:t xml:space="preserve">viajes/infrastructure/ y la migración de la Sesión 4</w:t>
+      </w:r>
+    </w:p>
+    <w:p>
+      <w:pPr>
+        <w:pStyle w:val="Compact"/>
+        <w:numPr>
+          <w:ilvl w:val="0"/>
+          <w:numId w:val="1021"/>
         </w:numPr>
       </w:pPr>
       <w:r>
@@ -11334,8 +12581,8 @@
         </w:pict>
       </w:r>
     </w:p>
-    <w:bookmarkEnd w:id="47"/>
-    <w:bookmarkStart w:id="48" w:name="Xaff99713d53c8dd2217ee2bf0bf411d6bf29f1a"/>
+    <w:bookmarkEnd w:id="49"/>
+    <w:bookmarkStart w:id="50" w:name="Xaff99713d53c8dd2217ee2bf0bf411d6bf29f1a"/>
     <w:p>
       <w:pPr>
         <w:pStyle w:val="Heading1"/>
@@ -11548,7 +12795,7 @@
         <w:pStyle w:val="Compact"/>
         <w:numPr>
           <w:ilvl w:val="0"/>
-          <w:numId w:val="1021"/>
+          <w:numId w:val="1022"/>
         </w:numPr>
       </w:pPr>
       <w:r>
@@ -11626,109 +12873,6 @@
       </w:r>
       <w:r>
         <w:t xml:space="preserve">.</w:t>
-      </w:r>
-    </w:p>
-    <w:p>
-      <w:pPr>
-        <w:pStyle w:val="Compact"/>
-        <w:numPr>
-          <w:ilvl w:val="0"/>
-          <w:numId w:val="1021"/>
-        </w:numPr>
-      </w:pPr>
-      <w:r>
-        <w:rPr>
-          <w:b/>
-          <w:bCs/>
-        </w:rPr>
-        <w:t xml:space="preserve">pandoc</w:t>
-      </w:r>
-      <w:r>
-        <w:t xml:space="preserve"> </w:t>
-      </w:r>
-      <w:r>
-        <w:t xml:space="preserve">lee cada Markdown como un árbol de elementos y el</w:t>
-      </w:r>
-      <w:r>
-        <w:t xml:space="preserve"> </w:t>
-      </w:r>
-      <w:r>
-        <w:rPr>
-          <w:b/>
-          <w:bCs/>
-        </w:rPr>
-        <w:t xml:space="preserve">filtro Lua</w:t>
-      </w:r>
-      <w:r>
-        <w:t xml:space="preserve"> </w:t>
-      </w:r>
-      <w:r>
-        <w:t xml:space="preserve">lo ajusta: logo arriba,</w:t>
-      </w:r>
-      <w:r>
-        <w:t xml:space="preserve"> </w:t>
-      </w:r>
-      <w:r>
-        <w:t xml:space="preserve">primer título como título del documento, enlaces a archivos locales convertidos en texto.</w:t>
-      </w:r>
-    </w:p>
-    <w:p>
-      <w:pPr>
-        <w:pStyle w:val="Compact"/>
-        <w:numPr>
-          <w:ilvl w:val="0"/>
-          <w:numId w:val="1021"/>
-        </w:numPr>
-      </w:pPr>
-      <w:r>
-        <w:t xml:space="preserve">Escribe el</w:t>
-      </w:r>
-      <w:r>
-        <w:t xml:space="preserve"> </w:t>
-      </w:r>
-      <w:r>
-        <w:rPr>
-          <w:rStyle w:val="VerbatimChar"/>
-        </w:rPr>
-        <w:t xml:space="preserve">.docx</w:t>
-      </w:r>
-      <w:r>
-        <w:t xml:space="preserve"> </w:t>
-      </w:r>
-      <w:r>
-        <w:t xml:space="preserve">con fecha fija (</w:t>
-      </w:r>
-      <w:r>
-        <w:rPr>
-          <w:rStyle w:val="VerbatimChar"/>
-        </w:rPr>
-        <w:t xml:space="preserve">SOURCE_DATE_EPOCH</w:t>
-      </w:r>
-      <w:r>
-        <w:t xml:space="preserve"> </w:t>
-      </w:r>
-      <w:r>
-        <w:t xml:space="preserve">= último commit): si el texto no cambió,</w:t>
-      </w:r>
-      <w:r>
-        <w:t xml:space="preserve"> </w:t>
-      </w:r>
-      <w:r>
-        <w:t xml:space="preserve">el Word sale idéntico y git no lo marca como modificado. Como pandoc no aplica esa fecha a las</w:t>
-      </w:r>
-      <w:r>
-        <w:t xml:space="preserve"> </w:t>
-      </w:r>
-      <w:r>
-        <w:t xml:space="preserve">partes que copia de la plantilla, el script reescribe el ZIP con la misma fecha en todas las entradas.</w:t>
-      </w:r>
-    </w:p>
-    <w:p>
-      <w:pPr>
-        <w:pStyle w:val="FirstParagraph"/>
-      </w:pPr>
-      <w:r>
-        <w:t xml:space="preserve">Reglas:</w:t>
       </w:r>
     </w:p>
     <w:p>
@@ -11744,10 +12888,35 @@
           <w:b/>
           <w:bCs/>
         </w:rPr>
-        <w:t xml:space="preserve">Nunca editar los Word a mano</w:t>
-      </w:r>
-      <w:r>
-        <w:t xml:space="preserve">: se pisan al regenerar. Se edita el Markdown.</w:t>
+        <w:t xml:space="preserve">pandoc</w:t>
+      </w:r>
+      <w:r>
+        <w:t xml:space="preserve"> </w:t>
+      </w:r>
+      <w:r>
+        <w:t xml:space="preserve">lee cada Markdown como un árbol de elementos y el</w:t>
+      </w:r>
+      <w:r>
+        <w:t xml:space="preserve"> </w:t>
+      </w:r>
+      <w:r>
+        <w:rPr>
+          <w:b/>
+          <w:bCs/>
+        </w:rPr>
+        <w:t xml:space="preserve">filtro Lua</w:t>
+      </w:r>
+      <w:r>
+        <w:t xml:space="preserve"> </w:t>
+      </w:r>
+      <w:r>
+        <w:t xml:space="preserve">lo ajusta: logo arriba,</w:t>
+      </w:r>
+      <w:r>
+        <w:t xml:space="preserve"> </w:t>
+      </w:r>
+      <w:r>
+        <w:t xml:space="preserve">primer título como título del documento, enlaces a archivos locales convertidos en texto.</w:t>
       </w:r>
     </w:p>
     <w:p>
@@ -11759,6 +12928,84 @@
         </w:numPr>
       </w:pPr>
       <w:r>
+        <w:t xml:space="preserve">Escribe el</w:t>
+      </w:r>
+      <w:r>
+        <w:t xml:space="preserve"> </w:t>
+      </w:r>
+      <w:r>
+        <w:rPr>
+          <w:rStyle w:val="VerbatimChar"/>
+        </w:rPr>
+        <w:t xml:space="preserve">.docx</w:t>
+      </w:r>
+      <w:r>
+        <w:t xml:space="preserve"> </w:t>
+      </w:r>
+      <w:r>
+        <w:t xml:space="preserve">con fecha fija (</w:t>
+      </w:r>
+      <w:r>
+        <w:rPr>
+          <w:rStyle w:val="VerbatimChar"/>
+        </w:rPr>
+        <w:t xml:space="preserve">SOURCE_DATE_EPOCH</w:t>
+      </w:r>
+      <w:r>
+        <w:t xml:space="preserve"> </w:t>
+      </w:r>
+      <w:r>
+        <w:t xml:space="preserve">= último commit): si el texto no cambió,</w:t>
+      </w:r>
+      <w:r>
+        <w:t xml:space="preserve"> </w:t>
+      </w:r>
+      <w:r>
+        <w:t xml:space="preserve">el Word sale idéntico y git no lo marca como modificado. Como pandoc no aplica esa fecha a las</w:t>
+      </w:r>
+      <w:r>
+        <w:t xml:space="preserve"> </w:t>
+      </w:r>
+      <w:r>
+        <w:t xml:space="preserve">partes que copia de la plantilla, el script reescribe el ZIP con la misma fecha en todas las entradas.</w:t>
+      </w:r>
+    </w:p>
+    <w:p>
+      <w:pPr>
+        <w:pStyle w:val="FirstParagraph"/>
+      </w:pPr>
+      <w:r>
+        <w:t xml:space="preserve">Reglas:</w:t>
+      </w:r>
+    </w:p>
+    <w:p>
+      <w:pPr>
+        <w:pStyle w:val="Compact"/>
+        <w:numPr>
+          <w:ilvl w:val="0"/>
+          <w:numId w:val="1023"/>
+        </w:numPr>
+      </w:pPr>
+      <w:r>
+        <w:rPr>
+          <w:b/>
+          <w:bCs/>
+        </w:rPr>
+        <w:t xml:space="preserve">Nunca editar los Word a mano</w:t>
+      </w:r>
+      <w:r>
+        <w:t xml:space="preserve">: se pisan al regenerar. Se edita el Markdown.</w:t>
+      </w:r>
+    </w:p>
+    <w:p>
+      <w:pPr>
+        <w:pStyle w:val="Compact"/>
+        <w:numPr>
+          <w:ilvl w:val="0"/>
+          <w:numId w:val="1023"/>
+        </w:numPr>
+      </w:pPr>
+      <w:r>
         <w:t xml:space="preserve">Lo que va entre</w:t>
       </w:r>
       <w:r>
@@ -11799,8 +13046,8 @@
         </w:pict>
       </w:r>
     </w:p>
-    <w:bookmarkEnd w:id="48"/>
-    <w:bookmarkStart w:id="49" w:name="X1d363b18720bb914512b1a76520b6e503abdb90"/>
+    <w:bookmarkEnd w:id="50"/>
+    <w:bookmarkStart w:id="51" w:name="X1d363b18720bb914512b1a76520b6e503abdb90"/>
     <w:p>
       <w:pPr>
         <w:pStyle w:val="Heading1"/>
@@ -12423,6 +13670,155 @@
           </w:p>
         </w:tc>
       </w:tr>
+      <w:tr>
+        <w:tc>
+          <w:tcPr/>
+          <w:p>
+            <w:pPr>
+              <w:pStyle w:val="Compact"/>
+            </w:pPr>
+            <w:r>
+              <w:rPr>
+                <w:b/>
+                <w:bCs/>
+              </w:rPr>
+              <w:t xml:space="preserve">Hash</w:t>
+            </w:r>
+          </w:p>
+        </w:tc>
+        <w:tc>
+          <w:tcPr/>
+          <w:p>
+            <w:pPr>
+              <w:pStyle w:val="Compact"/>
+            </w:pPr>
+            <w:r>
+              <w:t xml:space="preserve">Huella irreversible de un dato; así se guardan las contraseñas.</w:t>
+            </w:r>
+          </w:p>
+        </w:tc>
+      </w:tr>
+      <w:tr>
+        <w:tc>
+          <w:tcPr/>
+          <w:p>
+            <w:pPr>
+              <w:pStyle w:val="Compact"/>
+            </w:pPr>
+            <w:r>
+              <w:rPr>
+                <w:b/>
+                <w:bCs/>
+              </w:rPr>
+              <w:t xml:space="preserve">Middleware</w:t>
+            </w:r>
+          </w:p>
+        </w:tc>
+        <w:tc>
+          <w:tcPr/>
+          <w:p>
+            <w:pPr>
+              <w:pStyle w:val="Compact"/>
+            </w:pPr>
+            <w:r>
+              <w:t xml:space="preserve">Código que se ejecuta en todos los pedidos HTTP (ej. la sesión).</w:t>
+            </w:r>
+          </w:p>
+        </w:tc>
+      </w:tr>
+      <w:tr>
+        <w:tc>
+          <w:tcPr/>
+          <w:p>
+            <w:pPr>
+              <w:pStyle w:val="Compact"/>
+            </w:pPr>
+            <w:r>
+              <w:rPr>
+                <w:b/>
+                <w:bCs/>
+              </w:rPr>
+              <w:t xml:space="preserve">Token</w:t>
+            </w:r>
+          </w:p>
+        </w:tc>
+        <w:tc>
+          <w:tcPr/>
+          <w:p>
+            <w:pPr>
+              <w:pStyle w:val="Compact"/>
+            </w:pPr>
+            <w:r>
+              <w:t xml:space="preserve">Texto firmado que identifica al usuario en la API (</w:t>
+            </w:r>
+            <w:r>
+              <w:rPr>
+                <w:rStyle w:val="VerbatimChar"/>
+              </w:rPr>
+              <w:t xml:space="preserve">Bearer</w:t>
+            </w:r>
+            <w:r>
+              <w:t xml:space="preserve">).</w:t>
+            </w:r>
+          </w:p>
+        </w:tc>
+      </w:tr>
+      <w:tr>
+        <w:tc>
+          <w:tcPr/>
+          <w:p>
+            <w:pPr>
+              <w:pStyle w:val="Compact"/>
+            </w:pPr>
+            <w:r>
+              <w:rPr>
+                <w:b/>
+                <w:bCs/>
+              </w:rPr>
+              <w:t xml:space="preserve">401 / 403</w:t>
+            </w:r>
+          </w:p>
+        </w:tc>
+        <w:tc>
+          <w:tcPr/>
+          <w:p>
+            <w:pPr>
+              <w:pStyle w:val="Compact"/>
+            </w:pPr>
+            <w:r>
+              <w:t xml:space="preserve">Sin identificar / identificado pero sin permiso.</w:t>
+            </w:r>
+          </w:p>
+        </w:tc>
+      </w:tr>
+      <w:tr>
+        <w:tc>
+          <w:tcPr/>
+          <w:p>
+            <w:pPr>
+              <w:pStyle w:val="Compact"/>
+            </w:pPr>
+            <w:r>
+              <w:rPr>
+                <w:b/>
+                <w:bCs/>
+              </w:rPr>
+              <w:t xml:space="preserve">Auditoría</w:t>
+            </w:r>
+          </w:p>
+        </w:tc>
+        <w:tc>
+          <w:tcPr/>
+          <w:p>
+            <w:pPr>
+              <w:pStyle w:val="Compact"/>
+            </w:pPr>
+            <w:r>
+              <w:t xml:space="preserve">Registro de quién cambió qué, cuándo, antes y después (RF-55).</w:t>
+            </w:r>
+          </w:p>
+        </w:tc>
+      </w:tr>
     </w:tbl>
     <w:p>
       <w:r>
@@ -12431,8 +13827,8 @@
         </w:pict>
       </w:r>
     </w:p>
-    <w:bookmarkEnd w:id="49"/>
-    <w:bookmarkStart w:id="50" w:name="Xa60fcdd724add25c352553ef36901c63604edfb"/>
+    <w:bookmarkEnd w:id="51"/>
+    <w:bookmarkStart w:id="52" w:name="Xa60fcdd724add25c352553ef36901c63604edfb"/>
     <w:p>
       <w:pPr>
         <w:pStyle w:val="Heading1"/>
@@ -12873,6 +14269,72 @@
           </w:p>
         </w:tc>
       </w:tr>
+      <w:tr>
+        <w:tc>
+          <w:tcPr/>
+          <w:p>
+            <w:pPr>
+              <w:pStyle w:val="Compact"/>
+            </w:pPr>
+            <w:r>
+              <w:t xml:space="preserve">2026-10-26</w:t>
+            </w:r>
+          </w:p>
+        </w:tc>
+        <w:tc>
+          <w:tcPr/>
+          <w:p>
+            <w:pPr>
+              <w:pStyle w:val="Compact"/>
+            </w:pPr>
+            <w:r>
+              <w:rPr>
+                <w:b/>
+                <w:bCs/>
+              </w:rPr>
+              <w:t xml:space="preserve">Sesión 6</w:t>
+            </w:r>
+            <w:r>
+              <w:t xml:space="preserve">: módulo</w:t>
+            </w:r>
+            <w:r>
+              <w:t xml:space="preserve"> </w:t>
+            </w:r>
+            <w:r>
+              <w:rPr>
+                <w:rStyle w:val="VerbatimChar"/>
+              </w:rPr>
+              <w:t xml:space="preserve">usuarios</w:t>
+            </w:r>
+            <w:r>
+              <w:t xml:space="preserve"> </w:t>
+            </w:r>
+            <w:r>
+              <w:t xml:space="preserve">(roles ROL-01 a ROL-07, permisos por módulo, login, token de API) y auditoría (RF-55); HTMX en alertas. Conceptos: hash Argon2, middleware, cookies firmadas, dependencias encadenadas, objetos llamables (</w:t>
+            </w:r>
+            <w:r>
+              <w:rPr>
+                <w:rStyle w:val="VerbatimChar"/>
+              </w:rPr>
+              <w:t xml:space="preserve">__call__</w:t>
+            </w:r>
+            <w:r>
+              <w:t xml:space="preserve">).</w:t>
+            </w:r>
+          </w:p>
+        </w:tc>
+        <w:tc>
+          <w:tcPr/>
+          <w:p>
+            <w:pPr>
+              <w:pStyle w:val="Compact"/>
+            </w:pPr>
+            <w:r>
+              <w:t xml:space="preserve">1, 4.8, 4.9, 5, 8, 12</w:t>
+            </w:r>
+          </w:p>
+        </w:tc>
+      </w:tr>
     </w:tbl>
     <w:p>
       <w:pPr>
@@ -12903,10 +14365,16 @@
         <w:t xml:space="preserve"> </w:t>
       </w:r>
       <w:r>
-        <w:t xml:space="preserve">05 · Moneda, alertas y eventos</w:t>
-      </w:r>
-    </w:p>
-    <w:bookmarkEnd w:id="50"/>
+        <w:t xml:space="preserve">05 · Moneda, alertas y eventos ·</w:t>
+      </w:r>
+      <w:r>
+        <w:t xml:space="preserve"> </w:t>
+      </w:r>
+      <w:r>
+        <w:t xml:space="preserve">06 · Usuarios, roles y auditoría</w:t>
+      </w:r>
+    </w:p>
+    <w:bookmarkEnd w:id="52"/>
     <w:sectPr>
       <w:footerReference r:id="rIdPieHidalgo" w:type="default"/>
       <w:footnotePr>
@@ -13423,34 +14891,7 @@
     <w:abstractNumId w:val="991"/>
   </w:num>
   <w:num w:numId="1016">
-    <w:abstractNumId w:val="99411"/>
-    <w:lvlOverride w:ilvl="0">
-      <w:startOverride w:val="1"/>
-    </w:lvlOverride>
-    <w:lvlOverride w:ilvl="1">
-      <w:startOverride w:val="1"/>
-    </w:lvlOverride>
-    <w:lvlOverride w:ilvl="2">
-      <w:startOverride w:val="1"/>
-    </w:lvlOverride>
-    <w:lvlOverride w:ilvl="3">
-      <w:startOverride w:val="1"/>
-    </w:lvlOverride>
-    <w:lvlOverride w:ilvl="4">
-      <w:startOverride w:val="1"/>
-    </w:lvlOverride>
-    <w:lvlOverride w:ilvl="5">
-      <w:startOverride w:val="1"/>
-    </w:lvlOverride>
-    <w:lvlOverride w:ilvl="6">
-      <w:startOverride w:val="1"/>
-    </w:lvlOverride>
-    <w:lvlOverride w:ilvl="7">
-      <w:startOverride w:val="1"/>
-    </w:lvlOverride>
-    <w:lvlOverride w:ilvl="8">
-      <w:startOverride w:val="1"/>
-    </w:lvlOverride>
+    <w:abstractNumId w:val="991"/>
   </w:num>
   <w:num w:numId="1017">
     <w:abstractNumId w:val="99411"/>
@@ -13483,9 +14924,6 @@
     </w:lvlOverride>
   </w:num>
   <w:num w:numId="1018">
-    <w:abstractNumId w:val="991"/>
-  </w:num>
-  <w:num w:numId="1019">
     <w:abstractNumId w:val="99411"/>
     <w:lvlOverride w:ilvl="0">
       <w:startOverride w:val="1"/>
@@ -13514,6 +14952,9 @@
     <w:lvlOverride w:ilvl="8">
       <w:startOverride w:val="1"/>
     </w:lvlOverride>
+  </w:num>
+  <w:num w:numId="1019">
+    <w:abstractNumId w:val="991"/>
   </w:num>
   <w:num w:numId="1020">
     <w:abstractNumId w:val="99411"/>
@@ -13576,6 +15017,36 @@
     </w:lvlOverride>
   </w:num>
   <w:num w:numId="1022">
+    <w:abstractNumId w:val="99411"/>
+    <w:lvlOverride w:ilvl="0">
+      <w:startOverride w:val="1"/>
+    </w:lvlOverride>
+    <w:lvlOverride w:ilvl="1">
+      <w:startOverride w:val="1"/>
+    </w:lvlOverride>
+    <w:lvlOverride w:ilvl="2">
+      <w:startOverride w:val="1"/>
+    </w:lvlOverride>
+    <w:lvlOverride w:ilvl="3">
+      <w:startOverride w:val="1"/>
+    </w:lvlOverride>
+    <w:lvlOverride w:ilvl="4">
+      <w:startOverride w:val="1"/>
+    </w:lvlOverride>
+    <w:lvlOverride w:ilvl="5">
+      <w:startOverride w:val="1"/>
+    </w:lvlOverride>
+    <w:lvlOverride w:ilvl="6">
+      <w:startOverride w:val="1"/>
+    </w:lvlOverride>
+    <w:lvlOverride w:ilvl="7">
+      <w:startOverride w:val="1"/>
+    </w:lvlOverride>
+    <w:lvlOverride w:ilvl="8">
+      <w:startOverride w:val="1"/>
+    </w:lvlOverride>
+  </w:num>
+  <w:num w:numId="1023">
     <w:abstractNumId w:val="991"/>
   </w:num>
 </w:numbering>

</xml_diff>

<commit_message>
Sesión 7: tickets (comprobantes), validación y anulación de cargas
CU-02 · RF-02, RF-04, RF-06, RF-07, RF-08 · MOD-03

- Módulo comprobantes: foto o PDF del ticket como entidad propia (pendiente,
  procesado, descartado); la carga se crea al validar, en una sola
  transacción, y queda vinculada a su comprobante.
- Puerto AlmacenArchivos con adaptador en disco (nombres generados por el
  sistema, defensa contra path traversal, sólo imágenes/PDF de hasta 10 MB).
- Panel: página Tickets, revisión con la imagen al lado del formulario,
  descarte con motivo; anular cargas desde la tabla de combustible.
- Cargas: estado de validación (validada / validada por IA / anulada),
  fecha no futura, criterio de duplicados del documento (RF-08).
- Evento CargaAnulada: alertas recalcula el viaje.
- Migración probada en PostgreSQL y SQLite. Tests: de 112 a 125.

Co-Authored-By: Claude Opus 5.5 <noreply@anthropic.com>
</commit_message>
<xml_diff>
--- a/docs/word/Guia-tecnica.docx
+++ b/docs/word/Guia-tecnica.docx
@@ -537,6 +537,15 @@
         <w:rPr>
           <w:rStyle w:val="VerbatimChar"/>
         </w:rPr>
+        <w:t xml:space="preserve">    ├── comprobantes/     MOD-03/14 Fotos y PDF de tickets: recepción, validación y respaldo</w:t>
+      </w:r>
+      <w:r>
+        <w:br/>
+      </w:r>
+      <w:r>
+        <w:rPr>
+          <w:rStyle w:val="VerbatimChar"/>
+        </w:rPr>
         <w:t xml:space="preserve">    ├── alertas/          MOD-05 Alertas con estado y resolución; reaccionan a eventos</w:t>
       </w:r>
       <w:r>
@@ -6260,7 +6269,7 @@
     </w:p>
     <w:bookmarkEnd w:id="29"/>
     <w:bookmarkEnd w:id="30"/>
-    <w:bookmarkStart w:id="40" w:name="X6c7afff8b1a7319f42942bf1ba28a411de11d76"/>
+    <w:bookmarkStart w:id="41" w:name="X6c7afff8b1a7319f42942bf1ba28a411de11d76"/>
     <w:p>
       <w:pPr>
         <w:pStyle w:val="Heading1"/>
@@ -9208,6 +9217,450 @@
         <w:t xml:space="preserve">Post/Redirect/Get. Es la decisión 4.1 del análisis de brechas: interactividad sin React.</w:t>
       </w:r>
     </w:p>
+    <w:bookmarkEnd w:id="39"/>
+    <w:bookmarkStart w:id="40" w:name="Xf0d3953ea981d145685ae5b45a1d784a60e88cd"/>
+    <w:p>
+      <w:pPr>
+        <w:pStyle w:val="Heading2"/>
+      </w:pPr>
+      <w:r>
+        <w:t xml:space="preserve">4.10 Archivos subidos:</w:t>
+      </w:r>
+      <w:r>
+        <w:t xml:space="preserve"> </w:t>
+      </w:r>
+      <w:r>
+        <w:rPr>
+          <w:rStyle w:val="VerbatimChar"/>
+        </w:rPr>
+        <w:t xml:space="preserve">UploadFile</w:t>
+      </w:r>
+      <w:r>
+        <w:t xml:space="preserve">,</w:t>
+      </w:r>
+      <w:r>
+        <w:t xml:space="preserve"> </w:t>
+      </w:r>
+      <w:r>
+        <w:rPr>
+          <w:rStyle w:val="VerbatimChar"/>
+        </w:rPr>
+        <w:t xml:space="preserve">async def</w:t>
+      </w:r>
+      <w:r>
+        <w:t xml:space="preserve"> </w:t>
+      </w:r>
+      <w:r>
+        <w:t xml:space="preserve">y respuestas binarias</w:t>
+      </w:r>
+    </w:p>
+    <w:p>
+      <w:pPr>
+        <w:pStyle w:val="FirstParagraph"/>
+      </w:pPr>
+      <w:r>
+        <w:t xml:space="preserve">En comprobantes/presentation/web.py:</w:t>
+      </w:r>
+    </w:p>
+    <w:p>
+      <w:pPr>
+        <w:pStyle w:val="SourceCode"/>
+      </w:pPr>
+      <w:r>
+        <w:rPr>
+          <w:rStyle w:val="AttributeTok"/>
+        </w:rPr>
+        <w:t xml:space="preserve">@router.post</w:t>
+      </w:r>
+      <w:r>
+        <w:rPr>
+          <w:rStyle w:val="NormalTok"/>
+        </w:rPr>
+        <w:t xml:space="preserve">(</w:t>
+      </w:r>
+      <w:r>
+        <w:rPr>
+          <w:rStyle w:val="StringTok"/>
+        </w:rPr>
+        <w:t xml:space="preserve">"/comprobantes"</w:t>
+      </w:r>
+      <w:r>
+        <w:rPr>
+          <w:rStyle w:val="NormalTok"/>
+        </w:rPr>
+        <w:t xml:space="preserve">)</w:t>
+      </w:r>
+      <w:r>
+        <w:br/>
+      </w:r>
+      <w:r>
+        <w:rPr>
+          <w:rStyle w:val="ControlFlowTok"/>
+        </w:rPr>
+        <w:t xml:space="preserve">async</w:t>
+      </w:r>
+      <w:r>
+        <w:rPr>
+          <w:rStyle w:val="NormalTok"/>
+        </w:rPr>
+        <w:t xml:space="preserve"> </w:t>
+      </w:r>
+      <w:r>
+        <w:rPr>
+          <w:rStyle w:val="KeywordTok"/>
+        </w:rPr>
+        <w:t xml:space="preserve">def</w:t>
+      </w:r>
+      <w:r>
+        <w:rPr>
+          <w:rStyle w:val="NormalTok"/>
+        </w:rPr>
+        <w:t xml:space="preserve"> subir(uow: UoW, almacen: Almacen, archivo: UploadFile):</w:t>
+      </w:r>
+      <w:r>
+        <w:br/>
+      </w:r>
+      <w:r>
+        <w:rPr>
+          <w:rStyle w:val="NormalTok"/>
+        </w:rPr>
+        <w:t xml:space="preserve">    recibido </w:t>
+      </w:r>
+      <w:r>
+        <w:rPr>
+          <w:rStyle w:val="OperatorTok"/>
+        </w:rPr>
+        <w:t xml:space="preserve">=</w:t>
+      </w:r>
+      <w:r>
+        <w:rPr>
+          <w:rStyle w:val="NormalTok"/>
+        </w:rPr>
+        <w:t xml:space="preserve"> ArchivoRecibido(</w:t>
+      </w:r>
+      <w:r>
+        <w:rPr>
+          <w:rStyle w:val="ControlFlowTok"/>
+        </w:rPr>
+        <w:t xml:space="preserve">await</w:t>
+      </w:r>
+      <w:r>
+        <w:rPr>
+          <w:rStyle w:val="NormalTok"/>
+        </w:rPr>
+        <w:t xml:space="preserve"> archivo.read(), archivo.content_type </w:t>
+      </w:r>
+      <w:r>
+        <w:rPr>
+          <w:rStyle w:val="KeywordTok"/>
+        </w:rPr>
+        <w:t xml:space="preserve">or</w:t>
+      </w:r>
+      <w:r>
+        <w:rPr>
+          <w:rStyle w:val="NormalTok"/>
+        </w:rPr>
+        <w:t xml:space="preserve"> </w:t>
+      </w:r>
+      <w:r>
+        <w:rPr>
+          <w:rStyle w:val="StringTok"/>
+        </w:rPr>
+        <w:t xml:space="preserve">""</w:t>
+      </w:r>
+      <w:r>
+        <w:rPr>
+          <w:rStyle w:val="NormalTok"/>
+        </w:rPr>
+        <w:t xml:space="preserve">)</w:t>
+      </w:r>
+    </w:p>
+    <w:p>
+      <w:pPr>
+        <w:pStyle w:val="Compact"/>
+        <w:numPr>
+          <w:ilvl w:val="0"/>
+          <w:numId w:val="1016"/>
+        </w:numPr>
+      </w:pPr>
+      <w:r>
+        <w:t xml:space="preserve">Un formulario con archivos se envía como</w:t>
+      </w:r>
+      <w:r>
+        <w:t xml:space="preserve"> </w:t>
+      </w:r>
+      <w:r>
+        <w:rPr>
+          <w:rStyle w:val="VerbatimChar"/>
+        </w:rPr>
+        <w:t xml:space="preserve">multipart/form-data</w:t>
+      </w:r>
+      <w:r>
+        <w:t xml:space="preserve"> </w:t>
+      </w:r>
+      <w:r>
+        <w:t xml:space="preserve">(</w:t>
+      </w:r>
+      <w:r>
+        <w:rPr>
+          <w:rStyle w:val="VerbatimChar"/>
+        </w:rPr>
+        <w:t xml:space="preserve">enctype</w:t>
+      </w:r>
+      <w:r>
+        <w:t xml:space="preserve"> </w:t>
+      </w:r>
+      <w:r>
+        <w:t xml:space="preserve">en el HTML);</w:t>
+      </w:r>
+      <w:r>
+        <w:t xml:space="preserve"> </w:t>
+      </w:r>
+      <w:r>
+        <w:t xml:space="preserve">FastAPI lo entrega como</w:t>
+      </w:r>
+      <w:r>
+        <w:t xml:space="preserve"> </w:t>
+      </w:r>
+      <w:r>
+        <w:rPr>
+          <w:rStyle w:val="VerbatimChar"/>
+        </w:rPr>
+        <w:t xml:space="preserve">UploadFile</w:t>
+      </w:r>
+      <w:r>
+        <w:t xml:space="preserve">.</w:t>
+      </w:r>
+    </w:p>
+    <w:p>
+      <w:pPr>
+        <w:pStyle w:val="Compact"/>
+        <w:numPr>
+          <w:ilvl w:val="0"/>
+          <w:numId w:val="1016"/>
+        </w:numPr>
+      </w:pPr>
+      <w:r>
+        <w:rPr>
+          <w:rStyle w:val="VerbatimChar"/>
+        </w:rPr>
+        <w:t xml:space="preserve">async def</w:t>
+      </w:r>
+      <w:r>
+        <w:t xml:space="preserve"> </w:t>
+      </w:r>
+      <w:r>
+        <w:t xml:space="preserve">/</w:t>
+      </w:r>
+      <w:r>
+        <w:t xml:space="preserve"> </w:t>
+      </w:r>
+      <w:r>
+        <w:rPr>
+          <w:rStyle w:val="VerbatimChar"/>
+        </w:rPr>
+        <w:t xml:space="preserve">await</w:t>
+      </w:r>
+      <w:r>
+        <w:t xml:space="preserve">: leer el archivo es una operación de entrada/salida; con</w:t>
+      </w:r>
+      <w:r>
+        <w:t xml:space="preserve"> </w:t>
+      </w:r>
+      <w:r>
+        <w:rPr>
+          <w:rStyle w:val="VerbatimChar"/>
+        </w:rPr>
+        <w:t xml:space="preserve">await</w:t>
+      </w:r>
+      <w:r>
+        <w:t xml:space="preserve"> </w:t>
+      </w:r>
+      <w:r>
+        <w:t xml:space="preserve">el</w:t>
+      </w:r>
+      <w:r>
+        <w:t xml:space="preserve"> </w:t>
+      </w:r>
+      <w:r>
+        <w:t xml:space="preserve">servidor puede atender otros pedidos mientras espera. Las demás rutas son</w:t>
+      </w:r>
+      <w:r>
+        <w:t xml:space="preserve"> </w:t>
+      </w:r>
+      <w:r>
+        <w:rPr>
+          <w:rStyle w:val="VerbatimChar"/>
+        </w:rPr>
+        <w:t xml:space="preserve">def</w:t>
+      </w:r>
+      <w:r>
+        <w:t xml:space="preserve"> </w:t>
+      </w:r>
+      <w:r>
+        <w:t xml:space="preserve">comunes:</w:t>
+      </w:r>
+      <w:r>
+        <w:t xml:space="preserve"> </w:t>
+      </w:r>
+      <w:r>
+        <w:t xml:space="preserve">FastAPI las corre en un hilo aparte, así que tampoco bloquean.</w:t>
+      </w:r>
+    </w:p>
+    <w:p>
+      <w:pPr>
+        <w:pStyle w:val="Compact"/>
+        <w:numPr>
+          <w:ilvl w:val="0"/>
+          <w:numId w:val="1016"/>
+        </w:numPr>
+      </w:pPr>
+      <w:r>
+        <w:t xml:space="preserve">Para devolver la imagen:</w:t>
+      </w:r>
+      <w:r>
+        <w:t xml:space="preserve"> </w:t>
+      </w:r>
+      <w:r>
+        <w:rPr>
+          <w:rStyle w:val="VerbatimChar"/>
+        </w:rPr>
+        <w:t xml:space="preserve">Response(contenido, media_type=tipo)</w:t>
+      </w:r>
+      <w:r>
+        <w:t xml:space="preserve">. El encabezado</w:t>
+      </w:r>
+      <w:r>
+        <w:t xml:space="preserve"> </w:t>
+      </w:r>
+      <w:r>
+        <w:rPr>
+          <w:rStyle w:val="VerbatimChar"/>
+        </w:rPr>
+        <w:t xml:space="preserve">X-Content-Type-Options: nosniff</w:t>
+      </w:r>
+      <w:r>
+        <w:t xml:space="preserve"> </w:t>
+      </w:r>
+      <w:r>
+        <w:t xml:space="preserve">impide que el navegador "adivine" otro tipo de archivo.</w:t>
+      </w:r>
+    </w:p>
+    <w:p>
+      <w:pPr>
+        <w:pStyle w:val="Compact"/>
+        <w:numPr>
+          <w:ilvl w:val="0"/>
+          <w:numId w:val="1016"/>
+        </w:numPr>
+      </w:pPr>
+      <w:r>
+        <w:rPr>
+          <w:rStyle w:val="VerbatimChar"/>
+        </w:rPr>
+        <w:t xml:space="preserve">capture="environment"</w:t>
+      </w:r>
+      <w:r>
+        <w:t xml:space="preserve"> </w:t>
+      </w:r>
+      <w:r>
+        <w:t xml:space="preserve">en el</w:t>
+      </w:r>
+      <w:r>
+        <w:t xml:space="preserve"> </w:t>
+      </w:r>
+      <w:r>
+        <w:rPr>
+          <w:rStyle w:val="VerbatimChar"/>
+        </w:rPr>
+        <w:t xml:space="preserve">&lt;input type="file"&gt;</w:t>
+      </w:r>
+      <w:r>
+        <w:t xml:space="preserve"> </w:t>
+      </w:r>
+      <w:r>
+        <w:t xml:space="preserve">abre la cámara trasera en el celular.</w:t>
+      </w:r>
+    </w:p>
+    <w:p>
+      <w:pPr>
+        <w:pStyle w:val="FirstParagraph"/>
+      </w:pPr>
+      <w:r>
+        <w:rPr>
+          <w:b/>
+          <w:bCs/>
+        </w:rPr>
+        <w:t xml:space="preserve">Seguridad al guardar archivos</w:t>
+      </w:r>
+      <w:r>
+        <w:t xml:space="preserve"> </w:t>
+      </w:r>
+      <w:r>
+        <w:t xml:space="preserve">(shared/infrastructure/archivos.py):</w:t>
+      </w:r>
+      <w:r>
+        <w:t xml:space="preserve"> </w:t>
+      </w:r>
+      <w:r>
+        <w:t xml:space="preserve">el nombre lo genera el sistema (un UUID), nunca el usuario, y</w:t>
+      </w:r>
+      <w:r>
+        <w:t xml:space="preserve"> </w:t>
+      </w:r>
+      <w:r>
+        <w:rPr>
+          <w:rStyle w:val="VerbatimChar"/>
+        </w:rPr>
+        <w:t xml:space="preserve">Path.is_relative_to</w:t>
+      </w:r>
+      <w:r>
+        <w:t xml:space="preserve"> </w:t>
+      </w:r>
+      <w:r>
+        <w:t xml:space="preserve">verifica que</w:t>
+      </w:r>
+      <w:r>
+        <w:t xml:space="preserve"> </w:t>
+      </w:r>
+      <w:r>
+        <w:t xml:space="preserve">la ruta final quede dentro de la carpeta: así un nombre como</w:t>
+      </w:r>
+      <w:r>
+        <w:t xml:space="preserve"> </w:t>
+      </w:r>
+      <w:r>
+        <w:rPr>
+          <w:rStyle w:val="VerbatimChar"/>
+        </w:rPr>
+        <w:t xml:space="preserve">../../config</w:t>
+      </w:r>
+      <w:r>
+        <w:t xml:space="preserve"> </w:t>
+      </w:r>
+      <w:r>
+        <w:t xml:space="preserve">no puede escribir</w:t>
+      </w:r>
+      <w:r>
+        <w:t xml:space="preserve"> </w:t>
+      </w:r>
+      <w:r>
+        <w:t xml:space="preserve">fuera (ataque de</w:t>
+      </w:r>
+      <w:r>
+        <w:t xml:space="preserve"> </w:t>
+      </w:r>
+      <w:r>
+        <w:rPr>
+          <w:i/>
+          <w:iCs/>
+        </w:rPr>
+        <w:t xml:space="preserve">path traversal</w:t>
+      </w:r>
+      <w:r>
+        <w:t xml:space="preserve">). Además se aceptan sólo JPG, PNG, WEBP y PDF de hasta 10 MB.</w:t>
+      </w:r>
+    </w:p>
     <w:p>
       <w:r>
         <w:pict>
@@ -9215,9 +9668,9 @@
         </w:pict>
       </w:r>
     </w:p>
-    <w:bookmarkEnd w:id="39"/>
     <w:bookmarkEnd w:id="40"/>
-    <w:bookmarkStart w:id="44" w:name="X344a4ce861fddb2bdbe703c388d899c32578c6d"/>
+    <w:bookmarkEnd w:id="41"/>
+    <w:bookmarkStart w:id="46" w:name="X344a4ce861fddb2bdbe703c388d899c32578c6d"/>
     <w:p>
       <w:pPr>
         <w:pStyle w:val="Heading1"/>
@@ -10491,8 +10944,65 @@
           </w:p>
         </w:tc>
       </w:tr>
+      <w:tr>
+        <w:tc>
+          <w:tcPr/>
+          <w:p>
+            <w:pPr>
+              <w:pStyle w:val="Compact"/>
+            </w:pPr>
+            <w:r>
+              <w:rPr>
+                <w:b/>
+                <w:bCs/>
+              </w:rPr>
+              <w:t xml:space="preserve">Límite de transacción</w:t>
+            </w:r>
+          </w:p>
+        </w:tc>
+        <w:tc>
+          <w:tcPr/>
+          <w:p>
+            <w:pPr>
+              <w:pStyle w:val="Compact"/>
+            </w:pPr>
+            <w:r>
+              <w:rPr>
+                <w:rStyle w:val="VerbatimChar"/>
+              </w:rPr>
+              <w:t xml:space="preserve">RegistrarCargaCombustible.registrar_en(uow, ...)</w:t>
+            </w:r>
+          </w:p>
+        </w:tc>
+        <w:tc>
+          <w:tcPr/>
+          <w:p>
+            <w:pPr>
+              <w:pStyle w:val="Compact"/>
+            </w:pPr>
+            <w:r>
+              <w:t xml:space="preserve">La lógica se separa del</w:t>
+            </w:r>
+            <w:r>
+              <w:t xml:space="preserve"> </w:t>
+            </w:r>
+            <w:r>
+              <w:rPr>
+                <w:rStyle w:val="VerbatimChar"/>
+              </w:rPr>
+              <w:t xml:space="preserve">commit</w:t>
+            </w:r>
+            <w:r>
+              <w:t xml:space="preserve"> </w:t>
+            </w:r>
+            <w:r>
+              <w:t xml:space="preserve">para combinar varios pasos en UNA transacción (todo o nada).</w:t>
+            </w:r>
+          </w:p>
+        </w:tc>
+      </w:tr>
     </w:tbl>
-    <w:bookmarkStart w:id="41" w:name="Xe5ed2e1e66776987859c3ac158c5e8db4558dd3"/>
+    <w:bookmarkStart w:id="42" w:name="Xe5ed2e1e66776987859c3ac158c5e8db4558dd3"/>
     <w:p>
       <w:pPr>
         <w:pStyle w:val="Heading2"/>
@@ -10537,185 +11047,6 @@
           <w:rStyle w:val="VerbatimChar"/>
         </w:rPr>
         <w:t xml:space="preserve">                                   BusEventos ──► alertas: EvaluarAlertasViaje (su propia transacción)</w:t>
-      </w:r>
-    </w:p>
-    <w:p>
-      <w:pPr>
-        <w:pStyle w:val="Compact"/>
-        <w:numPr>
-          <w:ilvl w:val="0"/>
-          <w:numId w:val="1016"/>
-        </w:numPr>
-      </w:pPr>
-      <w:r>
-        <w:t xml:space="preserve">El caso de uso</w:t>
-      </w:r>
-      <w:r>
-        <w:t xml:space="preserve"> </w:t>
-      </w:r>
-      <w:r>
-        <w:rPr>
-          <w:b/>
-          <w:bCs/>
-        </w:rPr>
-        <w:t xml:space="preserve">registra</w:t>
-      </w:r>
-      <w:r>
-        <w:t xml:space="preserve"> </w:t>
-      </w:r>
-      <w:r>
-        <w:t xml:space="preserve">el evento en la unidad de trabajo (</w:t>
-      </w:r>
-      <w:r>
-        <w:rPr>
-          <w:rStyle w:val="VerbatimChar"/>
-        </w:rPr>
-        <w:t xml:space="preserve">uow.registrar_evento(...)</w:t>
-      </w:r>
-      <w:r>
-        <w:t xml:space="preserve">).</w:t>
-      </w:r>
-    </w:p>
-    <w:p>
-      <w:pPr>
-        <w:pStyle w:val="Compact"/>
-        <w:numPr>
-          <w:ilvl w:val="0"/>
-          <w:numId w:val="1016"/>
-        </w:numPr>
-      </w:pPr>
-      <w:r>
-        <w:rPr>
-          <w:rStyle w:val="VerbatimChar"/>
-        </w:rPr>
-        <w:t xml:space="preserve">commit()</w:t>
-      </w:r>
-      <w:r>
-        <w:t xml:space="preserve"> </w:t>
-      </w:r>
-      <w:r>
-        <w:t xml:space="preserve">confirma la transacción y</w:t>
-      </w:r>
-      <w:r>
-        <w:t xml:space="preserve"> </w:t>
-      </w:r>
-      <w:r>
-        <w:rPr>
-          <w:b/>
-          <w:bCs/>
-        </w:rPr>
-        <w:t xml:space="preserve">recién después</w:t>
-      </w:r>
-      <w:r>
-        <w:t xml:space="preserve"> </w:t>
-      </w:r>
-      <w:r>
-        <w:t xml:space="preserve">publica los eventos: si algo falla antes</w:t>
-      </w:r>
-      <w:r>
-        <w:t xml:space="preserve"> </w:t>
-      </w:r>
-      <w:r>
-        <w:t xml:space="preserve">del commit, no se avisa nada que no ocurrió.</w:t>
-      </w:r>
-    </w:p>
-    <w:p>
-      <w:pPr>
-        <w:pStyle w:val="Compact"/>
-        <w:numPr>
-          <w:ilvl w:val="0"/>
-          <w:numId w:val="1016"/>
-        </w:numPr>
-      </w:pPr>
-      <w:r>
-        <w:t xml:space="preserve">bootstrap.py arma el bus y suscribe los manejadores de cada módulo.</w:t>
-      </w:r>
-    </w:p>
-    <w:p>
-      <w:pPr>
-        <w:pStyle w:val="Compact"/>
-        <w:numPr>
-          <w:ilvl w:val="0"/>
-          <w:numId w:val="1016"/>
-        </w:numPr>
-      </w:pPr>
-      <w:r>
-        <w:t xml:space="preserve">Si un manejador falla, el error se registra y la operación original igual queda guardada.</w:t>
-      </w:r>
-    </w:p>
-    <w:p>
-      <w:pPr>
-        <w:pStyle w:val="Compact"/>
-        <w:numPr>
-          <w:ilvl w:val="0"/>
-          <w:numId w:val="1016"/>
-        </w:numPr>
-      </w:pPr>
-      <w:r>
-        <w:t xml:space="preserve">Así</w:t>
-      </w:r>
-      <w:r>
-        <w:t xml:space="preserve"> </w:t>
-      </w:r>
-      <w:r>
-        <w:rPr>
-          <w:rStyle w:val="VerbatimChar"/>
-        </w:rPr>
-        <w:t xml:space="preserve">viajes</w:t>
-      </w:r>
-      <w:r>
-        <w:t xml:space="preserve"> </w:t>
-      </w:r>
-      <w:r>
-        <w:t xml:space="preserve">y</w:t>
-      </w:r>
-      <w:r>
-        <w:t xml:space="preserve"> </w:t>
-      </w:r>
-      <w:r>
-        <w:rPr>
-          <w:rStyle w:val="VerbatimChar"/>
-        </w:rPr>
-        <w:t xml:space="preserve">combustible</w:t>
-      </w:r>
-      <w:r>
-        <w:t xml:space="preserve"> </w:t>
-      </w:r>
-      <w:r>
-        <w:t xml:space="preserve">no importan a</w:t>
-      </w:r>
-      <w:r>
-        <w:t xml:space="preserve"> </w:t>
-      </w:r>
-      <w:r>
-        <w:rPr>
-          <w:rStyle w:val="VerbatimChar"/>
-        </w:rPr>
-        <w:t xml:space="preserve">alertas</w:t>
-      </w:r>
-      <w:r>
-        <w:t xml:space="preserve"> </w:t>
-      </w:r>
-      <w:r>
-        <w:t xml:space="preserve">(que depende de ellos): no hay ciclos.</w:t>
-      </w:r>
-    </w:p>
-    <w:bookmarkEnd w:id="41"/>
-    <w:bookmarkStart w:id="42" w:name="X935b6c72f65704dddf0099554b6692ef1b815da"/>
-    <w:p>
-      <w:pPr>
-        <w:pStyle w:val="Heading2"/>
-      </w:pPr>
-      <w:r>
-        <w:t xml:space="preserve">Regla de negocio destacada: referencia de consumo (RF-11, RF-13, RF-16)</w:t>
-      </w:r>
-    </w:p>
-    <w:p>
-      <w:pPr>
-        <w:pStyle w:val="FirstParagraph"/>
-      </w:pPr>
-      <w:r>
-        <w:t xml:space="preserve">Para cada tramo, consumo.py elige la referencia así:</w:t>
       </w:r>
     </w:p>
     <w:p>
@@ -10727,7 +11058,7 @@
         </w:numPr>
       </w:pPr>
       <w:r>
-        <w:t xml:space="preserve">la</w:t>
+        <w:t xml:space="preserve">El caso de uso</w:t>
       </w:r>
       <w:r>
         <w:t xml:space="preserve"> </w:t>
@@ -10737,13 +11068,22 @@
           <w:b/>
           <w:bCs/>
         </w:rPr>
-        <w:t xml:space="preserve">configurada en la ruta</w:t>
-      </w:r>
-      <w:r>
-        <w:t xml:space="preserve"> </w:t>
-      </w:r>
-      <w:r>
-        <w:t xml:space="preserve">para ese estado de carga;</w:t>
+        <w:t xml:space="preserve">registra</w:t>
+      </w:r>
+      <w:r>
+        <w:t xml:space="preserve"> </w:t>
+      </w:r>
+      <w:r>
+        <w:t xml:space="preserve">el evento en la unidad de trabajo (</w:t>
+      </w:r>
+      <w:r>
+        <w:rPr>
+          <w:rStyle w:val="VerbatimChar"/>
+        </w:rPr>
+        <w:t xml:space="preserve">uow.registrar_evento(...)</w:t>
+      </w:r>
+      <w:r>
+        <w:t xml:space="preserve">).</w:t>
       </w:r>
     </w:p>
     <w:p>
@@ -10755,7 +11095,16 @@
         </w:numPr>
       </w:pPr>
       <w:r>
-        <w:t xml:space="preserve">si no hay, el</w:t>
+        <w:rPr>
+          <w:rStyle w:val="VerbatimChar"/>
+        </w:rPr>
+        <w:t xml:space="preserve">commit()</w:t>
+      </w:r>
+      <w:r>
+        <w:t xml:space="preserve"> </w:t>
+      </w:r>
+      <w:r>
+        <w:t xml:space="preserve">confirma la transacción y</w:t>
       </w:r>
       <w:r>
         <w:t xml:space="preserve"> </w:t>
@@ -10765,13 +11114,19 @@
           <w:b/>
           <w:bCs/>
         </w:rPr>
-        <w:t xml:space="preserve">promedio histórico</w:t>
-      </w:r>
-      <w:r>
-        <w:t xml:space="preserve"> </w:t>
-      </w:r>
-      <w:r>
-        <w:t xml:space="preserve">de la ruta (con 3 viajes o más);</w:t>
+        <w:t xml:space="preserve">recién después</w:t>
+      </w:r>
+      <w:r>
+        <w:t xml:space="preserve"> </w:t>
+      </w:r>
+      <w:r>
+        <w:t xml:space="preserve">publica los eventos: si algo falla antes</w:t>
+      </w:r>
+      <w:r>
+        <w:t xml:space="preserve"> </w:t>
+      </w:r>
+      <w:r>
+        <w:t xml:space="preserve">del commit, no se avisa nada que no ocurrió.</w:t>
       </w:r>
     </w:p>
     <w:p>
@@ -10783,23 +11138,86 @@
         </w:numPr>
       </w:pPr>
       <w:r>
-        <w:t xml:space="preserve">si tampoco, la</w:t>
-      </w:r>
-      <w:r>
-        <w:t xml:space="preserve"> </w:t>
-      </w:r>
-      <w:r>
-        <w:rPr>
-          <w:b/>
-          <w:bCs/>
-        </w:rPr>
-        <w:t xml:space="preserve">referencia general del camión</w:t>
-      </w:r>
-      <w:r>
-        <w:t xml:space="preserve"> </w:t>
-      </w:r>
-      <w:r>
-        <w:t xml:space="preserve">(respaldo).</w:t>
+        <w:t xml:space="preserve">bootstrap.py arma el bus y suscribe los manejadores de cada módulo.</w:t>
+      </w:r>
+    </w:p>
+    <w:p>
+      <w:pPr>
+        <w:pStyle w:val="Compact"/>
+        <w:numPr>
+          <w:ilvl w:val="0"/>
+          <w:numId w:val="1017"/>
+        </w:numPr>
+      </w:pPr>
+      <w:r>
+        <w:t xml:space="preserve">Si un manejador falla, el error se registra y la operación original igual queda guardada.</w:t>
+      </w:r>
+    </w:p>
+    <w:p>
+      <w:pPr>
+        <w:pStyle w:val="Compact"/>
+        <w:numPr>
+          <w:ilvl w:val="0"/>
+          <w:numId w:val="1017"/>
+        </w:numPr>
+      </w:pPr>
+      <w:r>
+        <w:t xml:space="preserve">Así</w:t>
+      </w:r>
+      <w:r>
+        <w:t xml:space="preserve"> </w:t>
+      </w:r>
+      <w:r>
+        <w:rPr>
+          <w:rStyle w:val="VerbatimChar"/>
+        </w:rPr>
+        <w:t xml:space="preserve">viajes</w:t>
+      </w:r>
+      <w:r>
+        <w:t xml:space="preserve"> </w:t>
+      </w:r>
+      <w:r>
+        <w:t xml:space="preserve">y</w:t>
+      </w:r>
+      <w:r>
+        <w:t xml:space="preserve"> </w:t>
+      </w:r>
+      <w:r>
+        <w:rPr>
+          <w:rStyle w:val="VerbatimChar"/>
+        </w:rPr>
+        <w:t xml:space="preserve">combustible</w:t>
+      </w:r>
+      <w:r>
+        <w:t xml:space="preserve"> </w:t>
+      </w:r>
+      <w:r>
+        <w:t xml:space="preserve">no importan a</w:t>
+      </w:r>
+      <w:r>
+        <w:t xml:space="preserve"> </w:t>
+      </w:r>
+      <w:r>
+        <w:rPr>
+          <w:rStyle w:val="VerbatimChar"/>
+        </w:rPr>
+        <w:t xml:space="preserve">alertas</w:t>
+      </w:r>
+      <w:r>
+        <w:t xml:space="preserve"> </w:t>
+      </w:r>
+      <w:r>
+        <w:t xml:space="preserve">(que depende de ellos): no hay ciclos.</w:t>
+      </w:r>
+    </w:p>
+    <w:bookmarkEnd w:id="42"/>
+    <w:bookmarkStart w:id="43" w:name="una-sola-transacción-para-varios-pasos"/>
+    <w:p>
+      <w:pPr>
+        <w:pStyle w:val="Heading2"/>
+      </w:pPr>
+      <w:r>
+        <w:t xml:space="preserve">Una sola transacción para varios pasos</w:t>
       </w:r>
     </w:p>
     <w:p>
@@ -10807,141 +11225,34 @@
         <w:pStyle w:val="FirstParagraph"/>
       </w:pPr>
       <w:r>
-        <w:t xml:space="preserve">Hay alerta si el consumo supera la referencia en más del umbral (15 %),</w:t>
-      </w:r>
-      <w:r>
-        <w:t xml:space="preserve"> </w:t>
-      </w:r>
-      <w:r>
-        <w:rPr>
-          <w:b/>
-          <w:bCs/>
-        </w:rPr>
-        <w:t xml:space="preserve">sólo</w:t>
-      </w:r>
-      <w:r>
-        <w:t xml:space="preserve"> </w:t>
-      </w:r>
-      <w:r>
-        <w:t xml:space="preserve">si la referencia</w:t>
-      </w:r>
-      <w:r>
-        <w:t xml:space="preserve"> </w:t>
-      </w:r>
-      <w:r>
-        <w:t xml:space="preserve">es de la ruta: la del camión es una sola para cargado y vacío y daría falsas alarmas.</w:t>
-      </w:r>
-    </w:p>
-    <w:bookmarkEnd w:id="42"/>
-    <w:bookmarkStart w:id="43" w:name="Xd0b75b0b0fd54070363d0e8077ffa2c9531a50b"/>
-    <w:p>
-      <w:pPr>
-        <w:pStyle w:val="Heading2"/>
-      </w:pPr>
-      <w:r>
-        <w:t xml:space="preserve">Regla de negocio destacada: conversión de moneda (RF-40, RF-41)</w:t>
-      </w:r>
-    </w:p>
-    <w:p>
-      <w:pPr>
-        <w:pStyle w:val="FirstParagraph"/>
-      </w:pPr>
-      <w:r>
-        <w:t xml:space="preserve">monedas/domain/entidades.py,</w:t>
-      </w:r>
-      <w:r>
-        <w:t xml:space="preserve"> </w:t>
-      </w:r>
-      <w:r>
-        <w:rPr>
-          <w:rStyle w:val="VerbatimChar"/>
-        </w:rPr>
-        <w:t xml:space="preserve">convertir_a_pesos</w:t>
-      </w:r>
-      <w:r>
-        <w:t xml:space="preserve">:</w:t>
-      </w:r>
-      <w:r>
-        <w:t xml:space="preserve"> </w:t>
-      </w:r>
-      <w:r>
-        <w:t xml:space="preserve">un gasto en CLP se convierte con la cotización de</w:t>
-      </w:r>
-      <w:r>
-        <w:t xml:space="preserve"> </w:t>
-      </w:r>
-      <w:r>
-        <w:rPr>
-          <w:b/>
-          <w:bCs/>
-        </w:rPr>
-        <w:t xml:space="preserve">su fecha</w:t>
-      </w:r>
-      <w:r>
-        <w:t xml:space="preserve">; si no hay, con la última anterior y</w:t>
-      </w:r>
-      <w:r>
-        <w:t xml:space="preserve"> </w:t>
-      </w:r>
-      <w:r>
-        <w:t xml:space="preserve">el gasto queda marcado "a revisar". El gasto guarda la cotización aplicada: corregir la tabla de</w:t>
-      </w:r>
-      <w:r>
-        <w:t xml:space="preserve"> </w:t>
-      </w:r>
-      <w:r>
-        <w:t xml:space="preserve">tipos de cambio después</w:t>
-      </w:r>
-      <w:r>
-        <w:t xml:space="preserve"> </w:t>
-      </w:r>
-      <w:r>
-        <w:rPr>
-          <w:b/>
-          <w:bCs/>
-        </w:rPr>
-        <w:t xml:space="preserve">no</w:t>
-      </w:r>
-      <w:r>
-        <w:t xml:space="preserve"> </w:t>
-      </w:r>
-      <w:r>
-        <w:t xml:space="preserve">cambia gastos ya registrados.</w:t>
-      </w:r>
-    </w:p>
-    <w:p>
-      <w:r>
-        <w:pict>
-          <v:rect style="width:0;height:1.5pt" o:hralign="center" o:hrstd="t" o:hr="t"/>
-        </w:pict>
-      </w:r>
-    </w:p>
-    <w:bookmarkEnd w:id="43"/>
-    <w:bookmarkEnd w:id="44"/>
-    <w:bookmarkStart w:id="45" w:name="X4b46113437fd9dd95b2987ab9030b35bc89b010"/>
-    <w:p>
-      <w:pPr>
-        <w:pStyle w:val="Heading1"/>
-      </w:pPr>
-      <w:r>
-        <w:t xml:space="preserve">6. Recorrido de una petición de punta a punta</w:t>
-      </w:r>
-    </w:p>
-    <w:p>
-      <w:pPr>
-        <w:pStyle w:val="FirstParagraph"/>
-      </w:pPr>
-      <w:r>
-        <w:rPr>
-          <w:rStyle w:val="VerbatimChar"/>
-        </w:rPr>
-        <w:t xml:space="preserve">POST /api/v1/viajes/{id}/tramos</w:t>
-      </w:r>
-      <w:r>
-        <w:t xml:space="preserve"> </w:t>
-      </w:r>
-      <w:r>
-        <w:t xml:space="preserve">(registrar la descarga: empieza el regreso vacío):</w:t>
+        <w:t xml:space="preserve">Validar un ticket hace dos cosas: registrar la carga y marcar el comprobante como procesado.</w:t>
+      </w:r>
+      <w:r>
+        <w:t xml:space="preserve"> </w:t>
+      </w:r>
+      <w:r>
+        <w:t xml:space="preserve">Si se hicieran en dos transacciones y la segunda fallara, quedaría una carga con su ticket todavía</w:t>
+      </w:r>
+      <w:r>
+        <w:t xml:space="preserve"> </w:t>
+      </w:r>
+      <w:r>
+        <w:t xml:space="preserve">"pendiente". Por eso</w:t>
+      </w:r>
+      <w:r>
+        <w:t xml:space="preserve"> </w:t>
+      </w:r>
+      <w:r>
+        <w:rPr>
+          <w:rStyle w:val="VerbatimChar"/>
+        </w:rPr>
+        <w:t xml:space="preserve">RegistrarCargaCombustible</w:t>
+      </w:r>
+      <w:r>
+        <w:t xml:space="preserve"> </w:t>
+      </w:r>
+      <w:r>
+        <w:t xml:space="preserve">tiene dos métodos:</w:t>
       </w:r>
     </w:p>
     <w:p>
@@ -10954,29 +11265,28 @@
       </w:pPr>
       <w:r>
         <w:rPr>
+          <w:rStyle w:val="VerbatimChar"/>
+        </w:rPr>
+        <w:t xml:space="preserve">registrar_en(uow, datos)</w:t>
+      </w:r>
+      <w:r>
+        <w:t xml:space="preserve">: aplica todas las reglas y guarda,</w:t>
+      </w:r>
+      <w:r>
+        <w:t xml:space="preserve"> </w:t>
+      </w:r>
+      <w:r>
+        <w:rPr>
           <w:b/>
           <w:bCs/>
         </w:rPr>
-        <w:t xml:space="preserve">Uvicorn</w:t>
-      </w:r>
-      <w:r>
-        <w:t xml:space="preserve"> </w:t>
-      </w:r>
-      <w:r>
-        <w:t xml:space="preserve">recibe el HTTP y se lo pasa a</w:t>
-      </w:r>
-      <w:r>
-        <w:t xml:space="preserve"> </w:t>
-      </w:r>
-      <w:r>
-        <w:rPr>
-          <w:b/>
-          <w:bCs/>
-        </w:rPr>
-        <w:t xml:space="preserve">FastAPI</w:t>
-      </w:r>
-      <w:r>
-        <w:t xml:space="preserve">.</w:t>
+        <w:t xml:space="preserve">sin</w:t>
+      </w:r>
+      <w:r>
+        <w:t xml:space="preserve"> </w:t>
+      </w:r>
+      <w:r>
+        <w:t xml:space="preserve">confirmar;</w:t>
       </w:r>
     </w:p>
     <w:p>
@@ -10989,25 +11299,96 @@
       </w:pPr>
       <w:r>
         <w:rPr>
+          <w:rStyle w:val="VerbatimChar"/>
+        </w:rPr>
+        <w:t xml:space="preserve">ejecutar(datos)</w:t>
+      </w:r>
+      <w:r>
+        <w:t xml:space="preserve">: abre la transacción, llama a</w:t>
+      </w:r>
+      <w:r>
+        <w:t xml:space="preserve"> </w:t>
+      </w:r>
+      <w:r>
+        <w:rPr>
+          <w:rStyle w:val="VerbatimChar"/>
+        </w:rPr>
+        <w:t xml:space="preserve">registrar_en</w:t>
+      </w:r>
+      <w:r>
+        <w:t xml:space="preserve"> </w:t>
+      </w:r>
+      <w:r>
+        <w:t xml:space="preserve">y confirma.</w:t>
+      </w:r>
+    </w:p>
+    <w:p>
+      <w:pPr>
+        <w:pStyle w:val="FirstParagraph"/>
+      </w:pPr>
+      <w:r>
+        <w:rPr>
+          <w:rStyle w:val="VerbatimChar"/>
+        </w:rPr>
+        <w:t xml:space="preserve">ValidarComprobanteCombustible</w:t>
+      </w:r>
+      <w:r>
+        <w:t xml:space="preserve"> </w:t>
+      </w:r>
+      <w:r>
+        <w:t xml:space="preserve">abre</w:t>
+      </w:r>
+      <w:r>
+        <w:t xml:space="preserve"> </w:t>
+      </w:r>
+      <w:r>
+        <w:rPr>
           <w:b/>
           <w:bCs/>
         </w:rPr>
-        <w:t xml:space="preserve">Pydantic</w:t>
-      </w:r>
-      <w:r>
-        <w:t xml:space="preserve"> </w:t>
-      </w:r>
-      <w:r>
-        <w:t xml:space="preserve">(</w:t>
-      </w:r>
-      <w:r>
-        <w:rPr>
-          <w:rStyle w:val="VerbatimChar"/>
-        </w:rPr>
-        <w:t xml:space="preserve">CambioEstadoCarga</w:t>
-      </w:r>
-      <w:r>
-        <w:t xml:space="preserve">) valida el JSON: fecha, km y nuevo estado.</w:t>
+        <w:t xml:space="preserve">una</w:t>
+      </w:r>
+      <w:r>
+        <w:t xml:space="preserve"> </w:t>
+      </w:r>
+      <w:r>
+        <w:t xml:space="preserve">transacción, llama a</w:t>
+      </w:r>
+      <w:r>
+        <w:t xml:space="preserve"> </w:t>
+      </w:r>
+      <w:r>
+        <w:rPr>
+          <w:rStyle w:val="VerbatimChar"/>
+        </w:rPr>
+        <w:t xml:space="preserve">registrar_en</w:t>
+      </w:r>
+      <w:r>
+        <w:t xml:space="preserve">, marca el</w:t>
+      </w:r>
+      <w:r>
+        <w:t xml:space="preserve"> </w:t>
+      </w:r>
+      <w:r>
+        <w:t xml:space="preserve">comprobante y recién ahí confirma: o se guardan las dos cosas, o ninguna.</w:t>
+      </w:r>
+    </w:p>
+    <w:bookmarkEnd w:id="43"/>
+    <w:bookmarkStart w:id="44" w:name="X935b6c72f65704dddf0099554b6692ef1b815da"/>
+    <w:p>
+      <w:pPr>
+        <w:pStyle w:val="Heading2"/>
+      </w:pPr>
+      <w:r>
+        <w:t xml:space="preserve">Regla de negocio destacada: referencia de consumo (RF-11, RF-13, RF-16)</w:t>
+      </w:r>
+    </w:p>
+    <w:p>
+      <w:pPr>
+        <w:pStyle w:val="FirstParagraph"/>
+      </w:pPr>
+      <w:r>
+        <w:t xml:space="preserve">Para cada tramo, consumo.py elige la referencia así:</w:t>
       </w:r>
     </w:p>
     <w:p>
@@ -11015,20 +11396,11 @@
         <w:pStyle w:val="Compact"/>
         <w:numPr>
           <w:ilvl w:val="0"/>
-          <w:numId w:val="1018"/>
+          <w:numId w:val="1019"/>
         </w:numPr>
       </w:pPr>
       <w:r>
-        <w:rPr>
-          <w:rStyle w:val="VerbatimChar"/>
-        </w:rPr>
-        <w:t xml:space="preserve">Depends</w:t>
-      </w:r>
-      <w:r>
-        <w:t xml:space="preserve"> </w:t>
-      </w:r>
-      <w:r>
-        <w:t xml:space="preserve">arma la</w:t>
+        <w:t xml:space="preserve">la</w:t>
       </w:r>
       <w:r>
         <w:t xml:space="preserve"> </w:t>
@@ -11038,25 +11410,13 @@
           <w:b/>
           <w:bCs/>
         </w:rPr>
-        <w:t xml:space="preserve">unidad de trabajo</w:t>
-      </w:r>
-      <w:r>
-        <w:t xml:space="preserve"> </w:t>
-      </w:r>
-      <w:r>
-        <w:t xml:space="preserve">real (vía</w:t>
-      </w:r>
-      <w:r>
-        <w:t xml:space="preserve"> </w:t>
-      </w:r>
-      <w:r>
-        <w:rPr>
-          <w:rStyle w:val="VerbatimChar"/>
-        </w:rPr>
-        <w:t xml:space="preserve">bootstrap.py</w:t>
-      </w:r>
-      <w:r>
-        <w:t xml:space="preserve">).</w:t>
+        <w:t xml:space="preserve">configurada en la ruta</w:t>
+      </w:r>
+      <w:r>
+        <w:t xml:space="preserve"> </w:t>
+      </w:r>
+      <w:r>
+        <w:t xml:space="preserve">para ese estado de carga;</w:t>
       </w:r>
     </w:p>
     <w:p>
@@ -11064,26 +11424,27 @@
         <w:pStyle w:val="Compact"/>
         <w:numPr>
           <w:ilvl w:val="0"/>
-          <w:numId w:val="1018"/>
+          <w:numId w:val="1019"/>
         </w:numPr>
       </w:pPr>
       <w:r>
-        <w:t xml:space="preserve">La ruta llama a</w:t>
-      </w:r>
-      <w:r>
-        <w:t xml:space="preserve"> </w:t>
-      </w:r>
-      <w:r>
-        <w:rPr>
-          <w:rStyle w:val="VerbatimChar"/>
-        </w:rPr>
-        <w:t xml:space="preserve">CambiarEstadoCarga(uow).ejecutar(...)</w:t>
-      </w:r>
-      <w:r>
-        <w:t xml:space="preserve"> </w:t>
-      </w:r>
-      <w:r>
-        <w:t xml:space="preserve">(viajes/application/casos_de_uso.py).</w:t>
+        <w:t xml:space="preserve">si no hay, el</w:t>
+      </w:r>
+      <w:r>
+        <w:t xml:space="preserve"> </w:t>
+      </w:r>
+      <w:r>
+        <w:rPr>
+          <w:b/>
+          <w:bCs/>
+        </w:rPr>
+        <w:t xml:space="preserve">promedio histórico</w:t>
+      </w:r>
+      <w:r>
+        <w:t xml:space="preserve"> </w:t>
+      </w:r>
+      <w:r>
+        <w:t xml:space="preserve">de la ruta (con 3 viajes o más);</w:t>
       </w:r>
     </w:p>
     <w:p>
@@ -11091,11 +11452,11 @@
         <w:pStyle w:val="Compact"/>
         <w:numPr>
           <w:ilvl w:val="0"/>
-          <w:numId w:val="1018"/>
+          <w:numId w:val="1019"/>
         </w:numPr>
       </w:pPr>
       <w:r>
-        <w:t xml:space="preserve">El caso de uso lee el viaje (con sus tramos) y le pide a la</w:t>
+        <w:t xml:space="preserve">si tampoco, la</w:t>
       </w:r>
       <w:r>
         <w:t xml:space="preserve"> </w:t>
@@ -11105,61 +11466,155 @@
           <w:b/>
           <w:bCs/>
         </w:rPr>
-        <w:t xml:space="preserve">entidad</w:t>
-      </w:r>
-      <w:r>
-        <w:t xml:space="preserve"> </w:t>
-      </w:r>
-      <w:r>
-        <w:t xml:space="preserve">que cambie de estado:</w:t>
-      </w:r>
-      <w:r>
-        <w:t xml:space="preserve"> </w:t>
-      </w:r>
-      <w:r>
-        <w:rPr>
-          <w:rStyle w:val="VerbatimChar"/>
-        </w:rPr>
-        <w:t xml:space="preserve">viaje.cambiar_estado_carga(...)</w:t>
-      </w:r>
-      <w:r>
-        <w:t xml:space="preserve"> </w:t>
-      </w:r>
-      <w:r>
-        <w:t xml:space="preserve">cierra el tramo cargado y abre uno vacío. Si el viaje ya terminó</w:t>
-      </w:r>
-      <w:r>
-        <w:t xml:space="preserve"> </w:t>
-      </w:r>
-      <w:r>
-        <w:t xml:space="preserve">o el odómetro no avanza, la entidad lanza</w:t>
-      </w:r>
-      <w:r>
-        <w:t xml:space="preserve"> </w:t>
-      </w:r>
-      <w:r>
-        <w:rPr>
-          <w:rStyle w:val="VerbatimChar"/>
-        </w:rPr>
-        <w:t xml:space="preserve">ReglaNegocioViolada</w:t>
-      </w:r>
-      <w:r>
-        <w:t xml:space="preserve"> </w:t>
-      </w:r>
-      <w:r>
-        <w:t xml:space="preserve">/</w:t>
-      </w:r>
-      <w:r>
-        <w:t xml:space="preserve"> </w:t>
-      </w:r>
-      <w:r>
-        <w:rPr>
-          <w:rStyle w:val="VerbatimChar"/>
-        </w:rPr>
-        <w:t xml:space="preserve">DatosInvalidos</w:t>
-      </w:r>
-      <w:r>
-        <w:t xml:space="preserve">.</w:t>
+        <w:t xml:space="preserve">referencia general del camión</w:t>
+      </w:r>
+      <w:r>
+        <w:t xml:space="preserve"> </w:t>
+      </w:r>
+      <w:r>
+        <w:t xml:space="preserve">(respaldo).</w:t>
+      </w:r>
+    </w:p>
+    <w:p>
+      <w:pPr>
+        <w:pStyle w:val="FirstParagraph"/>
+      </w:pPr>
+      <w:r>
+        <w:t xml:space="preserve">Hay alerta si el consumo supera la referencia en más del umbral (15 %),</w:t>
+      </w:r>
+      <w:r>
+        <w:t xml:space="preserve"> </w:t>
+      </w:r>
+      <w:r>
+        <w:rPr>
+          <w:b/>
+          <w:bCs/>
+        </w:rPr>
+        <w:t xml:space="preserve">sólo</w:t>
+      </w:r>
+      <w:r>
+        <w:t xml:space="preserve"> </w:t>
+      </w:r>
+      <w:r>
+        <w:t xml:space="preserve">si la referencia</w:t>
+      </w:r>
+      <w:r>
+        <w:t xml:space="preserve"> </w:t>
+      </w:r>
+      <w:r>
+        <w:t xml:space="preserve">es de la ruta: la del camión es una sola para cargado y vacío y daría falsas alarmas.</w:t>
+      </w:r>
+    </w:p>
+    <w:bookmarkEnd w:id="44"/>
+    <w:bookmarkStart w:id="45" w:name="Xd0b75b0b0fd54070363d0e8077ffa2c9531a50b"/>
+    <w:p>
+      <w:pPr>
+        <w:pStyle w:val="Heading2"/>
+      </w:pPr>
+      <w:r>
+        <w:t xml:space="preserve">Regla de negocio destacada: conversión de moneda (RF-40, RF-41)</w:t>
+      </w:r>
+    </w:p>
+    <w:p>
+      <w:pPr>
+        <w:pStyle w:val="FirstParagraph"/>
+      </w:pPr>
+      <w:r>
+        <w:t xml:space="preserve">monedas/domain/entidades.py,</w:t>
+      </w:r>
+      <w:r>
+        <w:t xml:space="preserve"> </w:t>
+      </w:r>
+      <w:r>
+        <w:rPr>
+          <w:rStyle w:val="VerbatimChar"/>
+        </w:rPr>
+        <w:t xml:space="preserve">convertir_a_pesos</w:t>
+      </w:r>
+      <w:r>
+        <w:t xml:space="preserve">:</w:t>
+      </w:r>
+      <w:r>
+        <w:t xml:space="preserve"> </w:t>
+      </w:r>
+      <w:r>
+        <w:t xml:space="preserve">un gasto en CLP se convierte con la cotización de</w:t>
+      </w:r>
+      <w:r>
+        <w:t xml:space="preserve"> </w:t>
+      </w:r>
+      <w:r>
+        <w:rPr>
+          <w:b/>
+          <w:bCs/>
+        </w:rPr>
+        <w:t xml:space="preserve">su fecha</w:t>
+      </w:r>
+      <w:r>
+        <w:t xml:space="preserve">; si no hay, con la última anterior y</w:t>
+      </w:r>
+      <w:r>
+        <w:t xml:space="preserve"> </w:t>
+      </w:r>
+      <w:r>
+        <w:t xml:space="preserve">el gasto queda marcado "a revisar". El gasto guarda la cotización aplicada: corregir la tabla de</w:t>
+      </w:r>
+      <w:r>
+        <w:t xml:space="preserve"> </w:t>
+      </w:r>
+      <w:r>
+        <w:t xml:space="preserve">tipos de cambio después</w:t>
+      </w:r>
+      <w:r>
+        <w:t xml:space="preserve"> </w:t>
+      </w:r>
+      <w:r>
+        <w:rPr>
+          <w:b/>
+          <w:bCs/>
+        </w:rPr>
+        <w:t xml:space="preserve">no</w:t>
+      </w:r>
+      <w:r>
+        <w:t xml:space="preserve"> </w:t>
+      </w:r>
+      <w:r>
+        <w:t xml:space="preserve">cambia gastos ya registrados.</w:t>
+      </w:r>
+    </w:p>
+    <w:p>
+      <w:r>
+        <w:pict>
+          <v:rect style="width:0;height:1.5pt" o:hralign="center" o:hrstd="t" o:hr="t"/>
+        </w:pict>
+      </w:r>
+    </w:p>
+    <w:bookmarkEnd w:id="45"/>
+    <w:bookmarkEnd w:id="46"/>
+    <w:bookmarkStart w:id="47" w:name="X4b46113437fd9dd95b2987ab9030b35bc89b010"/>
+    <w:p>
+      <w:pPr>
+        <w:pStyle w:val="Heading1"/>
+      </w:pPr>
+      <w:r>
+        <w:t xml:space="preserve">6. Recorrido de una petición de punta a punta</w:t>
+      </w:r>
+    </w:p>
+    <w:p>
+      <w:pPr>
+        <w:pStyle w:val="FirstParagraph"/>
+      </w:pPr>
+      <w:r>
+        <w:rPr>
+          <w:rStyle w:val="VerbatimChar"/>
+        </w:rPr>
+        <w:t xml:space="preserve">POST /api/v1/viajes/{id}/tramos</w:t>
+      </w:r>
+      <w:r>
+        <w:t xml:space="preserve"> </w:t>
+      </w:r>
+      <w:r>
+        <w:t xml:space="preserve">(registrar la descarga: empieza el regreso vacío):</w:t>
       </w:r>
     </w:p>
     <w:p>
@@ -11167,83 +11622,34 @@
         <w:pStyle w:val="Compact"/>
         <w:numPr>
           <w:ilvl w:val="0"/>
-          <w:numId w:val="1018"/>
+          <w:numId w:val="1020"/>
         </w:numPr>
       </w:pPr>
       <w:r>
-        <w:t xml:space="preserve">El repositorio convierte</w:t>
-      </w:r>
-      <w:r>
-        <w:t xml:space="preserve"> </w:t>
-      </w:r>
-      <w:r>
-        <w:rPr>
-          <w:rStyle w:val="VerbatimChar"/>
-        </w:rPr>
-        <w:t xml:space="preserve">Viaje</w:t>
-      </w:r>
-      <w:r>
-        <w:t xml:space="preserve"> </w:t>
-      </w:r>
-      <w:r>
-        <w:t xml:space="preserve">→</w:t>
-      </w:r>
-      <w:r>
-        <w:t xml:space="preserve"> </w:t>
-      </w:r>
-      <w:r>
-        <w:rPr>
-          <w:rStyle w:val="VerbatimChar"/>
-        </w:rPr>
-        <w:t xml:space="preserve">ViajeModel</w:t>
-      </w:r>
-      <w:r>
-        <w:t xml:space="preserve"> </w:t>
-      </w:r>
-      <w:r>
-        <w:t xml:space="preserve">(+</w:t>
-      </w:r>
-      <w:r>
-        <w:t xml:space="preserve"> </w:t>
-      </w:r>
-      <w:r>
-        <w:rPr>
-          <w:rStyle w:val="VerbatimChar"/>
-        </w:rPr>
-        <w:t xml:space="preserve">TramoViajeModel</w:t>
-      </w:r>
-      <w:r>
-        <w:t xml:space="preserve">) y SQLAlchemy hace el</w:t>
-      </w:r>
-      <w:r>
-        <w:t xml:space="preserve"> </w:t>
-      </w:r>
-      <w:r>
-        <w:rPr>
-          <w:rStyle w:val="VerbatimChar"/>
-        </w:rPr>
-        <w:t xml:space="preserve">UPDATE</w:t>
-      </w:r>
-      <w:r>
-        <w:t xml:space="preserve"> </w:t>
-      </w:r>
-      <w:r>
-        <w:t xml:space="preserve">del viaje y el</w:t>
-      </w:r>
-      <w:r>
-        <w:t xml:space="preserve"> </w:t>
-      </w:r>
-      <w:r>
-        <w:rPr>
-          <w:rStyle w:val="VerbatimChar"/>
-        </w:rPr>
-        <w:t xml:space="preserve">INSERT</w:t>
-      </w:r>
-      <w:r>
-        <w:t xml:space="preserve"> </w:t>
-      </w:r>
-      <w:r>
-        <w:t xml:space="preserve">del tramo nuevo.</w:t>
+        <w:rPr>
+          <w:b/>
+          <w:bCs/>
+        </w:rPr>
+        <w:t xml:space="preserve">Uvicorn</w:t>
+      </w:r>
+      <w:r>
+        <w:t xml:space="preserve"> </w:t>
+      </w:r>
+      <w:r>
+        <w:t xml:space="preserve">recibe el HTTP y se lo pasa a</w:t>
+      </w:r>
+      <w:r>
+        <w:t xml:space="preserve"> </w:t>
+      </w:r>
+      <w:r>
+        <w:rPr>
+          <w:b/>
+          <w:bCs/>
+        </w:rPr>
+        <w:t xml:space="preserve">FastAPI</w:t>
+      </w:r>
+      <w:r>
+        <w:t xml:space="preserve">.</w:t>
       </w:r>
     </w:p>
     <w:p>
@@ -11251,7 +11657,274 @@
         <w:pStyle w:val="Compact"/>
         <w:numPr>
           <w:ilvl w:val="0"/>
-          <w:numId w:val="1018"/>
+          <w:numId w:val="1020"/>
+        </w:numPr>
+      </w:pPr>
+      <w:r>
+        <w:rPr>
+          <w:b/>
+          <w:bCs/>
+        </w:rPr>
+        <w:t xml:space="preserve">Pydantic</w:t>
+      </w:r>
+      <w:r>
+        <w:t xml:space="preserve"> </w:t>
+      </w:r>
+      <w:r>
+        <w:t xml:space="preserve">(</w:t>
+      </w:r>
+      <w:r>
+        <w:rPr>
+          <w:rStyle w:val="VerbatimChar"/>
+        </w:rPr>
+        <w:t xml:space="preserve">CambioEstadoCarga</w:t>
+      </w:r>
+      <w:r>
+        <w:t xml:space="preserve">) valida el JSON: fecha, km y nuevo estado.</w:t>
+      </w:r>
+    </w:p>
+    <w:p>
+      <w:pPr>
+        <w:pStyle w:val="Compact"/>
+        <w:numPr>
+          <w:ilvl w:val="0"/>
+          <w:numId w:val="1020"/>
+        </w:numPr>
+      </w:pPr>
+      <w:r>
+        <w:rPr>
+          <w:rStyle w:val="VerbatimChar"/>
+        </w:rPr>
+        <w:t xml:space="preserve">Depends</w:t>
+      </w:r>
+      <w:r>
+        <w:t xml:space="preserve"> </w:t>
+      </w:r>
+      <w:r>
+        <w:t xml:space="preserve">arma la</w:t>
+      </w:r>
+      <w:r>
+        <w:t xml:space="preserve"> </w:t>
+      </w:r>
+      <w:r>
+        <w:rPr>
+          <w:b/>
+          <w:bCs/>
+        </w:rPr>
+        <w:t xml:space="preserve">unidad de trabajo</w:t>
+      </w:r>
+      <w:r>
+        <w:t xml:space="preserve"> </w:t>
+      </w:r>
+      <w:r>
+        <w:t xml:space="preserve">real (vía</w:t>
+      </w:r>
+      <w:r>
+        <w:t xml:space="preserve"> </w:t>
+      </w:r>
+      <w:r>
+        <w:rPr>
+          <w:rStyle w:val="VerbatimChar"/>
+        </w:rPr>
+        <w:t xml:space="preserve">bootstrap.py</w:t>
+      </w:r>
+      <w:r>
+        <w:t xml:space="preserve">).</w:t>
+      </w:r>
+    </w:p>
+    <w:p>
+      <w:pPr>
+        <w:pStyle w:val="Compact"/>
+        <w:numPr>
+          <w:ilvl w:val="0"/>
+          <w:numId w:val="1020"/>
+        </w:numPr>
+      </w:pPr>
+      <w:r>
+        <w:t xml:space="preserve">La ruta llama a</w:t>
+      </w:r>
+      <w:r>
+        <w:t xml:space="preserve"> </w:t>
+      </w:r>
+      <w:r>
+        <w:rPr>
+          <w:rStyle w:val="VerbatimChar"/>
+        </w:rPr>
+        <w:t xml:space="preserve">CambiarEstadoCarga(uow).ejecutar(...)</w:t>
+      </w:r>
+      <w:r>
+        <w:t xml:space="preserve"> </w:t>
+      </w:r>
+      <w:r>
+        <w:t xml:space="preserve">(viajes/application/casos_de_uso.py).</w:t>
+      </w:r>
+    </w:p>
+    <w:p>
+      <w:pPr>
+        <w:pStyle w:val="Compact"/>
+        <w:numPr>
+          <w:ilvl w:val="0"/>
+          <w:numId w:val="1020"/>
+        </w:numPr>
+      </w:pPr>
+      <w:r>
+        <w:t xml:space="preserve">El caso de uso lee el viaje (con sus tramos) y le pide a la</w:t>
+      </w:r>
+      <w:r>
+        <w:t xml:space="preserve"> </w:t>
+      </w:r>
+      <w:r>
+        <w:rPr>
+          <w:b/>
+          <w:bCs/>
+        </w:rPr>
+        <w:t xml:space="preserve">entidad</w:t>
+      </w:r>
+      <w:r>
+        <w:t xml:space="preserve"> </w:t>
+      </w:r>
+      <w:r>
+        <w:t xml:space="preserve">que cambie de estado:</w:t>
+      </w:r>
+      <w:r>
+        <w:t xml:space="preserve"> </w:t>
+      </w:r>
+      <w:r>
+        <w:rPr>
+          <w:rStyle w:val="VerbatimChar"/>
+        </w:rPr>
+        <w:t xml:space="preserve">viaje.cambiar_estado_carga(...)</w:t>
+      </w:r>
+      <w:r>
+        <w:t xml:space="preserve"> </w:t>
+      </w:r>
+      <w:r>
+        <w:t xml:space="preserve">cierra el tramo cargado y abre uno vacío. Si el viaje ya terminó</w:t>
+      </w:r>
+      <w:r>
+        <w:t xml:space="preserve"> </w:t>
+      </w:r>
+      <w:r>
+        <w:t xml:space="preserve">o el odómetro no avanza, la entidad lanza</w:t>
+      </w:r>
+      <w:r>
+        <w:t xml:space="preserve"> </w:t>
+      </w:r>
+      <w:r>
+        <w:rPr>
+          <w:rStyle w:val="VerbatimChar"/>
+        </w:rPr>
+        <w:t xml:space="preserve">ReglaNegocioViolada</w:t>
+      </w:r>
+      <w:r>
+        <w:t xml:space="preserve"> </w:t>
+      </w:r>
+      <w:r>
+        <w:t xml:space="preserve">/</w:t>
+      </w:r>
+      <w:r>
+        <w:t xml:space="preserve"> </w:t>
+      </w:r>
+      <w:r>
+        <w:rPr>
+          <w:rStyle w:val="VerbatimChar"/>
+        </w:rPr>
+        <w:t xml:space="preserve">DatosInvalidos</w:t>
+      </w:r>
+      <w:r>
+        <w:t xml:space="preserve">.</w:t>
+      </w:r>
+    </w:p>
+    <w:p>
+      <w:pPr>
+        <w:pStyle w:val="Compact"/>
+        <w:numPr>
+          <w:ilvl w:val="0"/>
+          <w:numId w:val="1020"/>
+        </w:numPr>
+      </w:pPr>
+      <w:r>
+        <w:t xml:space="preserve">El repositorio convierte</w:t>
+      </w:r>
+      <w:r>
+        <w:t xml:space="preserve"> </w:t>
+      </w:r>
+      <w:r>
+        <w:rPr>
+          <w:rStyle w:val="VerbatimChar"/>
+        </w:rPr>
+        <w:t xml:space="preserve">Viaje</w:t>
+      </w:r>
+      <w:r>
+        <w:t xml:space="preserve"> </w:t>
+      </w:r>
+      <w:r>
+        <w:t xml:space="preserve">→</w:t>
+      </w:r>
+      <w:r>
+        <w:t xml:space="preserve"> </w:t>
+      </w:r>
+      <w:r>
+        <w:rPr>
+          <w:rStyle w:val="VerbatimChar"/>
+        </w:rPr>
+        <w:t xml:space="preserve">ViajeModel</w:t>
+      </w:r>
+      <w:r>
+        <w:t xml:space="preserve"> </w:t>
+      </w:r>
+      <w:r>
+        <w:t xml:space="preserve">(+</w:t>
+      </w:r>
+      <w:r>
+        <w:t xml:space="preserve"> </w:t>
+      </w:r>
+      <w:r>
+        <w:rPr>
+          <w:rStyle w:val="VerbatimChar"/>
+        </w:rPr>
+        <w:t xml:space="preserve">TramoViajeModel</w:t>
+      </w:r>
+      <w:r>
+        <w:t xml:space="preserve">) y SQLAlchemy hace el</w:t>
+      </w:r>
+      <w:r>
+        <w:t xml:space="preserve"> </w:t>
+      </w:r>
+      <w:r>
+        <w:rPr>
+          <w:rStyle w:val="VerbatimChar"/>
+        </w:rPr>
+        <w:t xml:space="preserve">UPDATE</w:t>
+      </w:r>
+      <w:r>
+        <w:t xml:space="preserve"> </w:t>
+      </w:r>
+      <w:r>
+        <w:t xml:space="preserve">del viaje y el</w:t>
+      </w:r>
+      <w:r>
+        <w:t xml:space="preserve"> </w:t>
+      </w:r>
+      <w:r>
+        <w:rPr>
+          <w:rStyle w:val="VerbatimChar"/>
+        </w:rPr>
+        <w:t xml:space="preserve">INSERT</w:t>
+      </w:r>
+      <w:r>
+        <w:t xml:space="preserve"> </w:t>
+      </w:r>
+      <w:r>
+        <w:t xml:space="preserve">del tramo nuevo.</w:t>
+      </w:r>
+    </w:p>
+    <w:p>
+      <w:pPr>
+        <w:pStyle w:val="Compact"/>
+        <w:numPr>
+          <w:ilvl w:val="0"/>
+          <w:numId w:val="1020"/>
         </w:numPr>
       </w:pPr>
       <w:r>
@@ -11301,8 +11974,8 @@
         </w:pict>
       </w:r>
     </w:p>
-    <w:bookmarkEnd w:id="45"/>
-    <w:bookmarkStart w:id="46" w:name="X057e0a70ef2db6a0c901b7c96dcf81059b975fc"/>
+    <w:bookmarkEnd w:id="47"/>
+    <w:bookmarkStart w:id="48" w:name="X057e0a70ef2db6a0c901b7c96dcf81059b975fc"/>
     <w:p>
       <w:pPr>
         <w:pStyle w:val="Heading1"/>
@@ -11471,7 +12144,7 @@
         <w:pStyle w:val="Compact"/>
         <w:numPr>
           <w:ilvl w:val="0"/>
-          <w:numId w:val="1019"/>
+          <w:numId w:val="1021"/>
         </w:numPr>
       </w:pPr>
       <w:r>
@@ -11516,967 +12189,6 @@
       </w:r>
       <w:r>
         <w:t xml:space="preserve">), para que cada test muestre sólo lo que importa.</w:t>
-      </w:r>
-    </w:p>
-    <w:p>
-      <w:pPr>
-        <w:pStyle w:val="Compact"/>
-        <w:numPr>
-          <w:ilvl w:val="0"/>
-          <w:numId w:val="1019"/>
-        </w:numPr>
-      </w:pPr>
-      <w:r>
-        <w:rPr>
-          <w:b/>
-          <w:bCs/>
-        </w:rPr>
-        <w:t xml:space="preserve">Fixtures</w:t>
-      </w:r>
-      <w:r>
-        <w:t xml:space="preserve"> </w:t>
-      </w:r>
-      <w:r>
-        <w:t xml:space="preserve">(</w:t>
-      </w:r>
-      <w:r>
-        <w:rPr>
-          <w:rStyle w:val="VerbatimChar"/>
-        </w:rPr>
-        <w:t xml:space="preserve">@pytest.fixture</w:t>
-      </w:r>
-      <w:r>
-        <w:t xml:space="preserve">): objetos que pytest prepara y entrega a cada test que los pide por nombre.</w:t>
-      </w:r>
-    </w:p>
-    <w:p>
-      <w:pPr>
-        <w:pStyle w:val="Compact"/>
-        <w:numPr>
-          <w:ilvl w:val="0"/>
-          <w:numId w:val="1019"/>
-        </w:numPr>
-      </w:pPr>
-      <w:r>
-        <w:t xml:space="preserve">Los nombres de los tests describen la regla:</w:t>
-      </w:r>
-      <w:r>
-        <w:t xml:space="preserve"> </w:t>
-      </w:r>
-      <w:r>
-        <w:rPr>
-          <w:rStyle w:val="VerbatimChar"/>
-        </w:rPr>
-        <w:t xml:space="preserve">test_la_referencia_del_camion_informa_el_desvio_pero_no_alerta</w:t>
-      </w:r>
-      <w:r>
-        <w:t xml:space="preserve">.</w:t>
-      </w:r>
-    </w:p>
-    <w:p>
-      <w:pPr>
-        <w:pStyle w:val="SourceCode"/>
-      </w:pPr>
-      <w:r>
-        <w:rPr>
-          <w:rStyle w:val="NormalTok"/>
-        </w:rPr>
-        <w:t xml:space="preserve">uv run pytest              </w:t>
-      </w:r>
-      <w:r>
-        <w:rPr>
-          <w:rStyle w:val="CommentTok"/>
-        </w:rPr>
-        <w:t xml:space="preserve"># todos</w:t>
-      </w:r>
-      <w:r>
-        <w:br/>
-      </w:r>
-      <w:r>
-        <w:rPr>
-          <w:rStyle w:val="NormalTok"/>
-        </w:rPr>
-        <w:t xml:space="preserve">uv run pytest tests</w:t>
-      </w:r>
-      <w:r>
-        <w:rPr>
-          <w:rStyle w:val="OperatorTok"/>
-        </w:rPr>
-        <w:t xml:space="preserve">/</w:t>
-      </w:r>
-      <w:r>
-        <w:rPr>
-          <w:rStyle w:val="NormalTok"/>
-        </w:rPr>
-        <w:t xml:space="preserve">unit   </w:t>
-      </w:r>
-      <w:r>
-        <w:rPr>
-          <w:rStyle w:val="CommentTok"/>
-        </w:rPr>
-        <w:t xml:space="preserve"># sólo unitarios</w:t>
-      </w:r>
-      <w:r>
-        <w:br/>
-      </w:r>
-      <w:r>
-        <w:rPr>
-          <w:rStyle w:val="NormalTok"/>
-        </w:rPr>
-        <w:t xml:space="preserve">uv run pytest </w:t>
-      </w:r>
-      <w:r>
-        <w:rPr>
-          <w:rStyle w:val="OperatorTok"/>
-        </w:rPr>
-        <w:t xml:space="preserve">-</w:t>
-      </w:r>
-      <w:r>
-        <w:rPr>
-          <w:rStyle w:val="NormalTok"/>
-        </w:rPr>
-        <w:t xml:space="preserve">k tramo     </w:t>
-      </w:r>
-      <w:r>
-        <w:rPr>
-          <w:rStyle w:val="CommentTok"/>
-        </w:rPr>
-        <w:t xml:space="preserve"># sólo los que contienen "tramo" en el nombre</w:t>
-      </w:r>
-      <w:r>
-        <w:br/>
-      </w:r>
-      <w:r>
-        <w:rPr>
-          <w:rStyle w:val="NormalTok"/>
-        </w:rPr>
-        <w:t xml:space="preserve">uv run pytest </w:t>
-      </w:r>
-      <w:r>
-        <w:rPr>
-          <w:rStyle w:val="OperatorTok"/>
-        </w:rPr>
-        <w:t xml:space="preserve">-</w:t>
-      </w:r>
-      <w:r>
-        <w:rPr>
-          <w:rStyle w:val="NormalTok"/>
-        </w:rPr>
-        <w:t xml:space="preserve">x </w:t>
-      </w:r>
-      <w:r>
-        <w:rPr>
-          <w:rStyle w:val="OperatorTok"/>
-        </w:rPr>
-        <w:t xml:space="preserve">-</w:t>
-      </w:r>
-      <w:r>
-        <w:rPr>
-          <w:rStyle w:val="NormalTok"/>
-        </w:rPr>
-        <w:t xml:space="preserve">v        </w:t>
-      </w:r>
-      <w:r>
-        <w:rPr>
-          <w:rStyle w:val="CommentTok"/>
-        </w:rPr>
-        <w:t xml:space="preserve"># detenerse en el primer fallo, con detalle</w:t>
-      </w:r>
-    </w:p>
-    <w:p>
-      <w:r>
-        <w:pict>
-          <v:rect style="width:0;height:1.5pt" o:hralign="center" o:hrstd="t" o:hr="t"/>
-        </w:pict>
-      </w:r>
-    </w:p>
-    <w:bookmarkEnd w:id="46"/>
-    <w:bookmarkStart w:id="47" w:name="Xe5b9ca0edd62c85c4b69fc58d4dbf323c98dc91"/>
-    <w:p>
-      <w:pPr>
-        <w:pStyle w:val="Heading1"/>
-      </w:pPr>
-      <w:r>
-        <w:t xml:space="preserve">8. Ejecutar el proyecto en local</w:t>
-      </w:r>
-    </w:p>
-    <w:p>
-      <w:pPr>
-        <w:pStyle w:val="FirstParagraph"/>
-      </w:pPr>
-      <w:r>
-        <w:t xml:space="preserve">Desde la Sesión 6 el panel pide</w:t>
-      </w:r>
-      <w:r>
-        <w:t xml:space="preserve"> </w:t>
-      </w:r>
-      <w:r>
-        <w:rPr>
-          <w:b/>
-          <w:bCs/>
-        </w:rPr>
-        <w:t xml:space="preserve">usuario y contraseña</w:t>
-      </w:r>
-      <w:r>
-        <w:t xml:space="preserve">. Para empezar hay que crear el primer</w:t>
-      </w:r>
-      <w:r>
-        <w:t xml:space="preserve"> </w:t>
-      </w:r>
-      <w:r>
-        <w:t xml:space="preserve">Administrador de sistema (</w:t>
-      </w:r>
-      <w:r>
-        <w:rPr>
-          <w:rStyle w:val="VerbatimChar"/>
-        </w:rPr>
-        <w:t xml:space="preserve">flota crear-usuario</w:t>
-      </w:r>
-      <w:r>
-        <w:t xml:space="preserve">), o cargar los datos de ejemplo, que traen un</w:t>
-      </w:r>
-      <w:r>
-        <w:t xml:space="preserve"> </w:t>
-      </w:r>
-      <w:r>
-        <w:t xml:space="preserve">usuario por rol con la contraseña</w:t>
-      </w:r>
-      <w:r>
-        <w:t xml:space="preserve"> </w:t>
-      </w:r>
-      <w:r>
-        <w:rPr>
-          <w:rStyle w:val="VerbatimChar"/>
-        </w:rPr>
-        <w:t xml:space="preserve">demo1234</w:t>
-      </w:r>
-      <w:r>
-        <w:t xml:space="preserve"> </w:t>
-      </w:r>
-      <w:r>
-        <w:t xml:space="preserve">(</w:t>
-      </w:r>
-      <w:r>
-        <w:rPr>
-          <w:rStyle w:val="VerbatimChar"/>
-        </w:rPr>
-        <w:t xml:space="preserve">admin@hidalgo.demo</w:t>
-      </w:r>
-      <w:r>
-        <w:t xml:space="preserve">,</w:t>
-      </w:r>
-      <w:r>
-        <w:t xml:space="preserve"> </w:t>
-      </w:r>
-      <w:r>
-        <w:rPr>
-          <w:rStyle w:val="VerbatimChar"/>
-        </w:rPr>
-        <w:t xml:space="preserve">gerencia@hidalgo.demo</w:t>
-      </w:r>
-      <w:r>
-        <w:t xml:space="preserve">, …).</w:t>
-      </w:r>
-    </w:p>
-    <w:p>
-      <w:pPr>
-        <w:pStyle w:val="BodyText"/>
-      </w:pPr>
-      <w:r>
-        <w:rPr>
-          <w:b/>
-          <w:bCs/>
-        </w:rPr>
-        <w:t xml:space="preserve">Con PostgreSQL</w:t>
-      </w:r>
-      <w:r>
-        <w:t xml:space="preserve"> </w:t>
-      </w:r>
-      <w:r>
-        <w:t xml:space="preserve">(requiere</w:t>
-      </w:r>
-      <w:r>
-        <w:t xml:space="preserve"> </w:t>
-      </w:r>
-      <w:r>
-        <w:rPr>
-          <w:rStyle w:val="VerbatimChar"/>
-        </w:rPr>
-        <w:t xml:space="preserve">DB_PASSWORD</w:t>
-      </w:r>
-      <w:r>
-        <w:t xml:space="preserve"> </w:t>
-      </w:r>
-      <w:r>
-        <w:t xml:space="preserve">y</w:t>
-      </w:r>
-      <w:r>
-        <w:t xml:space="preserve"> </w:t>
-      </w:r>
-      <w:r>
-        <w:rPr>
-          <w:rStyle w:val="VerbatimChar"/>
-        </w:rPr>
-        <w:t xml:space="preserve">SECRET_KEY</w:t>
-      </w:r>
-      <w:r>
-        <w:t xml:space="preserve"> </w:t>
-      </w:r>
-      <w:r>
-        <w:t xml:space="preserve">en</w:t>
-      </w:r>
-      <w:r>
-        <w:t xml:space="preserve"> </w:t>
-      </w:r>
-      <w:r>
-        <w:rPr>
-          <w:rStyle w:val="VerbatimChar"/>
-        </w:rPr>
-        <w:t xml:space="preserve">.env</w:t>
-      </w:r>
-      <w:r>
-        <w:t xml:space="preserve">):</w:t>
-      </w:r>
-    </w:p>
-    <w:p>
-      <w:pPr>
-        <w:pStyle w:val="SourceCode"/>
-      </w:pPr>
-      <w:r>
-        <w:rPr>
-          <w:rStyle w:val="NormalTok"/>
-        </w:rPr>
-        <w:t xml:space="preserve">uv run flota crear-db</w:t>
-      </w:r>
-      <w:r>
-        <w:br/>
-      </w:r>
-      <w:r>
-        <w:rPr>
-          <w:rStyle w:val="NormalTok"/>
-        </w:rPr>
-        <w:t xml:space="preserve">uv run alembic upgrade head</w:t>
-      </w:r>
-      <w:r>
-        <w:br/>
-      </w:r>
-      <w:r>
-        <w:rPr>
-          <w:rStyle w:val="NormalTok"/>
-        </w:rPr>
-        <w:t xml:space="preserve">uv run flota crear-usuario admin@empresa</w:t>
-      </w:r>
-      <w:r>
-        <w:rPr>
-          <w:rStyle w:val="OperatorTok"/>
-        </w:rPr>
-        <w:t xml:space="preserve">.</w:t>
-      </w:r>
-      <w:r>
-        <w:rPr>
-          <w:rStyle w:val="FunctionTok"/>
-        </w:rPr>
-        <w:t xml:space="preserve">com</w:t>
-      </w:r>
-      <w:r>
-        <w:rPr>
-          <w:rStyle w:val="NormalTok"/>
-        </w:rPr>
-        <w:t xml:space="preserve"> </w:t>
-      </w:r>
-      <w:r>
-        <w:rPr>
-          <w:rStyle w:val="StringTok"/>
-        </w:rPr>
-        <w:t xml:space="preserve">"Nombre"</w:t>
-      </w:r>
-      <w:r>
-        <w:rPr>
-          <w:rStyle w:val="NormalTok"/>
-        </w:rPr>
-        <w:t xml:space="preserve">   </w:t>
-      </w:r>
-      <w:r>
-        <w:rPr>
-          <w:rStyle w:val="CommentTok"/>
-        </w:rPr>
-        <w:t xml:space="preserve"># pide la contraseña (ROL-07)</w:t>
-      </w:r>
-      <w:r>
-        <w:br/>
-      </w:r>
-      <w:r>
-        <w:rPr>
-          <w:rStyle w:val="NormalTok"/>
-        </w:rPr>
-        <w:t xml:space="preserve">uv run flota datos-demo        </w:t>
-      </w:r>
-      <w:r>
-        <w:rPr>
-          <w:rStyle w:val="CommentTok"/>
-        </w:rPr>
-        <w:t xml:space="preserve"># opcional: 2 camiones, 2 rutas, 8 viajes ida cargado / regreso vacío</w:t>
-      </w:r>
-      <w:r>
-        <w:br/>
-      </w:r>
-      <w:r>
-        <w:rPr>
-          <w:rStyle w:val="NormalTok"/>
-        </w:rPr>
-        <w:t xml:space="preserve">uv run flota servidor          </w:t>
-      </w:r>
-      <w:r>
-        <w:rPr>
-          <w:rStyle w:val="CommentTok"/>
-        </w:rPr>
-        <w:t xml:space="preserve"># http://127.0.0.1:8000 · API en /docs</w:t>
-      </w:r>
-    </w:p>
-    <w:p>
-      <w:pPr>
-        <w:pStyle w:val="FirstParagraph"/>
-      </w:pPr>
-      <w:r>
-        <w:rPr>
-          <w:b/>
-          <w:bCs/>
-        </w:rPr>
-        <w:t xml:space="preserve">Con SQLite, para probar rápido</w:t>
-      </w:r>
-      <w:r>
-        <w:t xml:space="preserve"> </w:t>
-      </w:r>
-      <w:r>
-        <w:t xml:space="preserve">(sin contraseña, base en un archivo):</w:t>
-      </w:r>
-    </w:p>
-    <w:p>
-      <w:pPr>
-        <w:pStyle w:val="SourceCode"/>
-      </w:pPr>
-      <w:r>
-        <w:rPr>
-          <w:rStyle w:val="VariableTok"/>
-        </w:rPr>
-        <w:t xml:space="preserve">$env</w:t>
-      </w:r>
-      <w:r>
-        <w:rPr>
-          <w:rStyle w:val="OperatorTok"/>
-        </w:rPr>
-        <w:t xml:space="preserve">:</w:t>
-      </w:r>
-      <w:r>
-        <w:rPr>
-          <w:rStyle w:val="VariableTok"/>
-        </w:rPr>
-        <w:t xml:space="preserve">DATABASE_URL</w:t>
-      </w:r>
-      <w:r>
-        <w:rPr>
-          <w:rStyle w:val="NormalTok"/>
-        </w:rPr>
-        <w:t xml:space="preserve"> </w:t>
-      </w:r>
-      <w:r>
-        <w:rPr>
-          <w:rStyle w:val="OperatorTok"/>
-        </w:rPr>
-        <w:t xml:space="preserve">=</w:t>
-      </w:r>
-      <w:r>
-        <w:rPr>
-          <w:rStyle w:val="NormalTok"/>
-        </w:rPr>
-        <w:t xml:space="preserve"> </w:t>
-      </w:r>
-      <w:r>
-        <w:rPr>
-          <w:rStyle w:val="StringTok"/>
-        </w:rPr>
-        <w:t xml:space="preserve">"sqlite:///flota-prueba.db"</w:t>
-      </w:r>
-      <w:r>
-        <w:br/>
-      </w:r>
-      <w:r>
-        <w:rPr>
-          <w:rStyle w:val="NormalTok"/>
-        </w:rPr>
-        <w:t xml:space="preserve">uv run alembic upgrade head</w:t>
-      </w:r>
-      <w:r>
-        <w:br/>
-      </w:r>
-      <w:r>
-        <w:rPr>
-          <w:rStyle w:val="NormalTok"/>
-        </w:rPr>
-        <w:t xml:space="preserve">uv run flota datos-demo</w:t>
-      </w:r>
-      <w:r>
-        <w:br/>
-      </w:r>
-      <w:r>
-        <w:rPr>
-          <w:rStyle w:val="NormalTok"/>
-        </w:rPr>
-        <w:t xml:space="preserve">uv run flota servidor</w:t>
-      </w:r>
-    </w:p>
-    <w:p>
-      <w:pPr>
-        <w:pStyle w:val="BlockText"/>
-      </w:pPr>
-      <w:r>
-        <w:t xml:space="preserve">El archivo</w:t>
-      </w:r>
-      <w:r>
-        <w:t xml:space="preserve"> </w:t>
-      </w:r>
-      <w:r>
-        <w:rPr>
-          <w:rStyle w:val="VerbatimChar"/>
-        </w:rPr>
-        <w:t xml:space="preserve">.db</w:t>
-      </w:r>
-      <w:r>
-        <w:t xml:space="preserve"> </w:t>
-      </w:r>
-      <w:r>
-        <w:t xml:space="preserve">está en</w:t>
-      </w:r>
-      <w:r>
-        <w:t xml:space="preserve"> </w:t>
-      </w:r>
-      <w:r>
-        <w:rPr>
-          <w:rStyle w:val="VerbatimChar"/>
-        </w:rPr>
-        <w:t xml:space="preserve">.gitignore</w:t>
-      </w:r>
-      <w:r>
-        <w:t xml:space="preserve"> </w:t>
-      </w:r>
-      <w:r>
-        <w:t xml:space="preserve">(no se sube). Los datos de SQLite no pasan a PostgreSQL.</w:t>
-      </w:r>
-    </w:p>
-    <w:p>
-      <w:r>
-        <w:pict>
-          <v:rect style="width:0;height:1.5pt" o:hralign="center" o:hrstd="t" o:hr="t"/>
-        </w:pict>
-      </w:r>
-    </w:p>
-    <w:bookmarkEnd w:id="47"/>
-    <w:bookmarkStart w:id="48" w:name="X56571861d2af40b24359ed2f824d150b144acc0"/>
-    <w:p>
-      <w:pPr>
-        <w:pStyle w:val="Heading1"/>
-      </w:pPr>
-      <w:r>
-        <w:t xml:space="preserve">9. Cómo agregar una funcionalidad nueva</w:t>
-      </w:r>
-    </w:p>
-    <w:p>
-      <w:pPr>
-        <w:pStyle w:val="FirstParagraph"/>
-      </w:pPr>
-      <w:r>
-        <w:t xml:space="preserve">Casi todo requerimiento sigue el mismo camino, de adentro hacia afuera,</w:t>
-      </w:r>
-      <w:r>
-        <w:t xml:space="preserve"> </w:t>
-      </w:r>
-      <w:r>
-        <w:rPr>
-          <w:b/>
-          <w:bCs/>
-        </w:rPr>
-        <w:t xml:space="preserve">dentro de su módulo</w:t>
-      </w:r>
-      <w:r>
-        <w:t xml:space="preserve">:</w:t>
-      </w:r>
-    </w:p>
-    <w:p>
-      <w:pPr>
-        <w:pStyle w:val="Compact"/>
-        <w:numPr>
-          <w:ilvl w:val="0"/>
-          <w:numId w:val="1020"/>
-        </w:numPr>
-      </w:pPr>
-      <w:r>
-        <w:rPr>
-          <w:b/>
-          <w:bCs/>
-        </w:rPr>
-        <w:t xml:space="preserve">Dominio</w:t>
-      </w:r>
-      <w:r>
-        <w:t xml:space="preserve"> </w:t>
-      </w:r>
-      <w:r>
-        <w:t xml:space="preserve">(</w:t>
-      </w:r>
-      <w:r>
-        <w:rPr>
-          <w:rStyle w:val="VerbatimChar"/>
-        </w:rPr>
-        <w:t xml:space="preserve">&lt;modulo&gt;/domain/</w:t>
-      </w:r>
-      <w:r>
-        <w:t xml:space="preserve">): entidad, campo o regla + test unitario.</w:t>
-      </w:r>
-    </w:p>
-    <w:p>
-      <w:pPr>
-        <w:pStyle w:val="Compact"/>
-        <w:numPr>
-          <w:ilvl w:val="0"/>
-          <w:numId w:val="1020"/>
-        </w:numPr>
-      </w:pPr>
-      <w:r>
-        <w:rPr>
-          <w:b/>
-          <w:bCs/>
-        </w:rPr>
-        <w:t xml:space="preserve">Aplicación</w:t>
-      </w:r>
-      <w:r>
-        <w:t xml:space="preserve"> </w:t>
-      </w:r>
-      <w:r>
-        <w:t xml:space="preserve">(</w:t>
-      </w:r>
-      <w:r>
-        <w:rPr>
-          <w:rStyle w:val="VerbatimChar"/>
-        </w:rPr>
-        <w:t xml:space="preserve">&lt;modulo&gt;/application/</w:t>
-      </w:r>
-      <w:r>
-        <w:t xml:space="preserve">): caso de uso (con su código CU/RF en el docstring) +</w:t>
-      </w:r>
-      <w:r>
-        <w:t xml:space="preserve"> </w:t>
-      </w:r>
-      <w:r>
-        <w:t xml:space="preserve">test con fakes. Si necesita un repositorio nuevo, agregarlo al</w:t>
-      </w:r>
-      <w:r>
-        <w:t xml:space="preserve"> </w:t>
-      </w:r>
-      <w:r>
-        <w:rPr>
-          <w:rStyle w:val="VerbatimChar"/>
-        </w:rPr>
-        <w:t xml:space="preserve">UoW&lt;Modulo&gt;</w:t>
-      </w:r>
-      <w:r>
-        <w:t xml:space="preserve"> </w:t>
-      </w:r>
-      <w:r>
-        <w:t xml:space="preserve">del módulo.</w:t>
-      </w:r>
-      <w:r>
-        <w:t xml:space="preserve"> </w:t>
-      </w:r>
-      <w:r>
-        <w:t xml:space="preserve">Si otro módulo tiene que reaccionar, publicar un</w:t>
-      </w:r>
-      <w:r>
-        <w:t xml:space="preserve"> </w:t>
-      </w:r>
-      <w:r>
-        <w:rPr>
-          <w:b/>
-          <w:bCs/>
-        </w:rPr>
-        <w:t xml:space="preserve">evento</w:t>
-      </w:r>
-      <w:r>
-        <w:t xml:space="preserve"> </w:t>
-      </w:r>
-      <w:r>
-        <w:t xml:space="preserve">(</w:t>
-      </w:r>
-      <w:r>
-        <w:rPr>
-          <w:rStyle w:val="VerbatimChar"/>
-        </w:rPr>
-        <w:t xml:space="preserve">uow.registrar_evento(...)</w:t>
-      </w:r>
-      <w:r>
-        <w:t xml:space="preserve">) en</w:t>
-      </w:r>
-      <w:r>
-        <w:t xml:space="preserve"> </w:t>
-      </w:r>
-      <w:r>
-        <w:t xml:space="preserve">lugar de llamarlo directamente, y suscribir el manejador en</w:t>
-      </w:r>
-      <w:r>
-        <w:t xml:space="preserve"> </w:t>
-      </w:r>
-      <w:r>
-        <w:rPr>
-          <w:rStyle w:val="VerbatimChar"/>
-        </w:rPr>
-        <w:t xml:space="preserve">bootstrap.py</w:t>
-      </w:r>
-      <w:r>
-        <w:t xml:space="preserve">.</w:t>
-      </w:r>
-    </w:p>
-    <w:p>
-      <w:pPr>
-        <w:pStyle w:val="Compact"/>
-        <w:numPr>
-          <w:ilvl w:val="0"/>
-          <w:numId w:val="1020"/>
-        </w:numPr>
-      </w:pPr>
-      <w:r>
-        <w:rPr>
-          <w:b/>
-          <w:bCs/>
-        </w:rPr>
-        <w:t xml:space="preserve">Infraestructura</w:t>
-      </w:r>
-      <w:r>
-        <w:t xml:space="preserve"> </w:t>
-      </w:r>
-      <w:r>
-        <w:t xml:space="preserve">(</w:t>
-      </w:r>
-      <w:r>
-        <w:rPr>
-          <w:rStyle w:val="VerbatimChar"/>
-        </w:rPr>
-        <w:t xml:space="preserve">&lt;modulo&gt;/infrastructure/</w:t>
-      </w:r>
-      <w:r>
-        <w:t xml:space="preserve">): tabla en</w:t>
-      </w:r>
-      <w:r>
-        <w:t xml:space="preserve"> </w:t>
-      </w:r>
-      <w:r>
-        <w:rPr>
-          <w:rStyle w:val="VerbatimChar"/>
-        </w:rPr>
-        <w:t xml:space="preserve">modelos.py</w:t>
-      </w:r>
-      <w:r>
-        <w:t xml:space="preserve">, repositorio SQL; registrarlo</w:t>
-      </w:r>
-      <w:r>
-        <w:t xml:space="preserve"> </w:t>
-      </w:r>
-      <w:r>
-        <w:t xml:space="preserve">en unidad_de_trabajo.py y el módulo de modelos en</w:t>
-      </w:r>
-      <w:r>
-        <w:t xml:space="preserve"> </w:t>
-      </w:r>
-      <w:r>
-        <w:t xml:space="preserve">modelos.py. Migración con Alembic (revisar el borrador; probar</w:t>
-      </w:r>
-      <w:r>
-        <w:t xml:space="preserve"> </w:t>
-      </w:r>
-      <w:r>
-        <w:rPr>
-          <w:rStyle w:val="VerbatimChar"/>
-        </w:rPr>
-        <w:t xml:space="preserve">upgrade</w:t>
-      </w:r>
-      <w:r>
-        <w:t xml:space="preserve">,</w:t>
-      </w:r>
-      <w:r>
-        <w:t xml:space="preserve"> </w:t>
-      </w:r>
-      <w:r>
-        <w:rPr>
-          <w:rStyle w:val="VerbatimChar"/>
-        </w:rPr>
-        <w:t xml:space="preserve">downgrade</w:t>
-      </w:r>
-      <w:r>
-        <w:t xml:space="preserve"> </w:t>
-      </w:r>
-      <w:r>
-        <w:t xml:space="preserve">y</w:t>
-      </w:r>
-      <w:r>
-        <w:t xml:space="preserve"> </w:t>
-      </w:r>
-      <w:r>
-        <w:rPr>
-          <w:rStyle w:val="VerbatimChar"/>
-        </w:rPr>
-        <w:t xml:space="preserve">check</w:t>
-      </w:r>
-      <w:r>
-        <w:t xml:space="preserve">).</w:t>
-      </w:r>
-    </w:p>
-    <w:p>
-      <w:pPr>
-        <w:pStyle w:val="Compact"/>
-        <w:numPr>
-          <w:ilvl w:val="0"/>
-          <w:numId w:val="1020"/>
-        </w:numPr>
-      </w:pPr>
-      <w:r>
-        <w:rPr>
-          <w:b/>
-          <w:bCs/>
-        </w:rPr>
-        <w:t xml:space="preserve">Presentación</w:t>
-      </w:r>
-      <w:r>
-        <w:t xml:space="preserve"> </w:t>
-      </w:r>
-      <w:r>
-        <w:t xml:space="preserve">(</w:t>
-      </w:r>
-      <w:r>
-        <w:rPr>
-          <w:rStyle w:val="VerbatimChar"/>
-        </w:rPr>
-        <w:t xml:space="preserve">&lt;modulo&gt;/presentation/</w:t>
-      </w:r>
-      <w:r>
-        <w:t xml:space="preserve">): esquema Pydantic +</w:t>
-      </w:r>
-      <w:r>
-        <w:t xml:space="preserve"> </w:t>
-      </w:r>
-      <w:r>
-        <w:rPr>
-          <w:rStyle w:val="VerbatimChar"/>
-        </w:rPr>
-        <w:t xml:space="preserve">api.py</w:t>
-      </w:r>
-      <w:r>
-        <w:t xml:space="preserve"> </w:t>
-      </w:r>
-      <w:r>
-        <w:t xml:space="preserve">y/o</w:t>
-      </w:r>
-      <w:r>
-        <w:t xml:space="preserve"> </w:t>
-      </w:r>
-      <w:r>
-        <w:rPr>
-          <w:rStyle w:val="VerbatimChar"/>
-        </w:rPr>
-        <w:t xml:space="preserve">web.py</w:t>
-      </w:r>
-      <w:r>
-        <w:t xml:space="preserve">; registrar</w:t>
-      </w:r>
-      <w:r>
-        <w:t xml:space="preserve"> </w:t>
-      </w:r>
-      <w:r>
-        <w:t xml:space="preserve">el router en main.py + test de integración.</w:t>
-      </w:r>
-    </w:p>
-    <w:p>
-      <w:pPr>
-        <w:pStyle w:val="Compact"/>
-        <w:numPr>
-          <w:ilvl w:val="0"/>
-          <w:numId w:val="1020"/>
-        </w:numPr>
-      </w:pPr>
-      <w:r>
-        <w:rPr>
-          <w:rStyle w:val="VerbatimChar"/>
-        </w:rPr>
-        <w:t xml:space="preserve">uv run pytest</w:t>
-      </w:r>
-      <w:r>
-        <w:t xml:space="preserve"> </w:t>
-      </w:r>
-      <w:r>
-        <w:t xml:space="preserve">y</w:t>
-      </w:r>
-      <w:r>
-        <w:t xml:space="preserve"> </w:t>
-      </w:r>
-      <w:r>
-        <w:rPr>
-          <w:rStyle w:val="VerbatimChar"/>
-        </w:rPr>
-        <w:t xml:space="preserve">uv run ruff check .</w:t>
-      </w:r>
-      <w:r>
-        <w:t xml:space="preserve"> </w:t>
-      </w:r>
-      <w:r>
-        <w:t xml:space="preserve">en verde; nota de la sesión en</w:t>
-      </w:r>
-      <w:r>
-        <w:t xml:space="preserve"> </w:t>
-      </w:r>
-      <w:r>
-        <w:rPr>
-          <w:rStyle w:val="VerbatimChar"/>
-        </w:rPr>
-        <w:t xml:space="preserve">docs/sesiones/</w:t>
-      </w:r>
-      <w:r>
-        <w:t xml:space="preserve">; actualizar</w:t>
-      </w:r>
-      <w:r>
-        <w:t xml:space="preserve"> </w:t>
-      </w:r>
-      <w:r>
-        <w:t xml:space="preserve">esta guía y regenerar los Word (</w:t>
-      </w:r>
-      <w:r>
-        <w:rPr>
-          <w:rStyle w:val="VerbatimChar"/>
-        </w:rPr>
-        <w:t xml:space="preserve">uv run python scripts/generar_word.py</w:t>
-      </w:r>
-      <w:r>
-        <w:t xml:space="preserve">).</w:t>
-      </w:r>
-    </w:p>
-    <w:p>
-      <w:r>
-        <w:pict>
-          <v:rect style="width:0;height:1.5pt" o:hralign="center" o:hrstd="t" o:hr="t"/>
-        </w:pict>
-      </w:r>
-    </w:p>
-    <w:bookmarkEnd w:id="48"/>
-    <w:bookmarkStart w:id="49" w:name="X09bcc076eb5122c50326e7c228eb7775fb4a6ab"/>
-    <w:p>
-      <w:pPr>
-        <w:pStyle w:val="Heading1"/>
-      </w:pPr>
-      <w:r>
-        <w:t xml:space="preserve">10. Ruta de estudio sugerida</w:t>
-      </w:r>
-    </w:p>
-    <w:p>
-      <w:pPr>
-        <w:pStyle w:val="FirstParagraph"/>
-      </w:pPr>
-      <w:r>
-        <w:t xml:space="preserve">De lo más puro a lo más técnico:</w:t>
       </w:r>
     </w:p>
     <w:p>
@@ -12488,7 +12200,26 @@
         </w:numPr>
       </w:pPr>
       <w:r>
-        <w:t xml:space="preserve">shared/domain/ → catalogo/domain/entidades.py</w:t>
+        <w:rPr>
+          <w:b/>
+          <w:bCs/>
+        </w:rPr>
+        <w:t xml:space="preserve">Fixtures</w:t>
+      </w:r>
+      <w:r>
+        <w:t xml:space="preserve"> </w:t>
+      </w:r>
+      <w:r>
+        <w:t xml:space="preserve">(</w:t>
+      </w:r>
+      <w:r>
+        <w:rPr>
+          <w:rStyle w:val="VerbatimChar"/>
+        </w:rPr>
+        <w:t xml:space="preserve">@pytest.fixture</w:t>
+      </w:r>
+      <w:r>
+        <w:t xml:space="preserve">): objetos que pytest prepara y entrega a cada test que los pide por nombre.</w:t>
       </w:r>
     </w:p>
     <w:p>
@@ -12500,7 +12231,547 @@
         </w:numPr>
       </w:pPr>
       <w:r>
-        <w:t xml:space="preserve">viajes/domain/entidades.py (agregado viaje + tramos) y su test test_viajes.py</w:t>
+        <w:t xml:space="preserve">Los nombres de los tests describen la regla:</w:t>
+      </w:r>
+      <w:r>
+        <w:t xml:space="preserve"> </w:t>
+      </w:r>
+      <w:r>
+        <w:rPr>
+          <w:rStyle w:val="VerbatimChar"/>
+        </w:rPr>
+        <w:t xml:space="preserve">test_la_referencia_del_camion_informa_el_desvio_pero_no_alerta</w:t>
+      </w:r>
+      <w:r>
+        <w:t xml:space="preserve">.</w:t>
+      </w:r>
+    </w:p>
+    <w:p>
+      <w:pPr>
+        <w:pStyle w:val="SourceCode"/>
+      </w:pPr>
+      <w:r>
+        <w:rPr>
+          <w:rStyle w:val="NormalTok"/>
+        </w:rPr>
+        <w:t xml:space="preserve">uv run pytest              </w:t>
+      </w:r>
+      <w:r>
+        <w:rPr>
+          <w:rStyle w:val="CommentTok"/>
+        </w:rPr>
+        <w:t xml:space="preserve"># todos</w:t>
+      </w:r>
+      <w:r>
+        <w:br/>
+      </w:r>
+      <w:r>
+        <w:rPr>
+          <w:rStyle w:val="NormalTok"/>
+        </w:rPr>
+        <w:t xml:space="preserve">uv run pytest tests</w:t>
+      </w:r>
+      <w:r>
+        <w:rPr>
+          <w:rStyle w:val="OperatorTok"/>
+        </w:rPr>
+        <w:t xml:space="preserve">/</w:t>
+      </w:r>
+      <w:r>
+        <w:rPr>
+          <w:rStyle w:val="NormalTok"/>
+        </w:rPr>
+        <w:t xml:space="preserve">unit   </w:t>
+      </w:r>
+      <w:r>
+        <w:rPr>
+          <w:rStyle w:val="CommentTok"/>
+        </w:rPr>
+        <w:t xml:space="preserve"># sólo unitarios</w:t>
+      </w:r>
+      <w:r>
+        <w:br/>
+      </w:r>
+      <w:r>
+        <w:rPr>
+          <w:rStyle w:val="NormalTok"/>
+        </w:rPr>
+        <w:t xml:space="preserve">uv run pytest </w:t>
+      </w:r>
+      <w:r>
+        <w:rPr>
+          <w:rStyle w:val="OperatorTok"/>
+        </w:rPr>
+        <w:t xml:space="preserve">-</w:t>
+      </w:r>
+      <w:r>
+        <w:rPr>
+          <w:rStyle w:val="NormalTok"/>
+        </w:rPr>
+        <w:t xml:space="preserve">k tramo     </w:t>
+      </w:r>
+      <w:r>
+        <w:rPr>
+          <w:rStyle w:val="CommentTok"/>
+        </w:rPr>
+        <w:t xml:space="preserve"># sólo los que contienen "tramo" en el nombre</w:t>
+      </w:r>
+      <w:r>
+        <w:br/>
+      </w:r>
+      <w:r>
+        <w:rPr>
+          <w:rStyle w:val="NormalTok"/>
+        </w:rPr>
+        <w:t xml:space="preserve">uv run pytest </w:t>
+      </w:r>
+      <w:r>
+        <w:rPr>
+          <w:rStyle w:val="OperatorTok"/>
+        </w:rPr>
+        <w:t xml:space="preserve">-</w:t>
+      </w:r>
+      <w:r>
+        <w:rPr>
+          <w:rStyle w:val="NormalTok"/>
+        </w:rPr>
+        <w:t xml:space="preserve">x </w:t>
+      </w:r>
+      <w:r>
+        <w:rPr>
+          <w:rStyle w:val="OperatorTok"/>
+        </w:rPr>
+        <w:t xml:space="preserve">-</w:t>
+      </w:r>
+      <w:r>
+        <w:rPr>
+          <w:rStyle w:val="NormalTok"/>
+        </w:rPr>
+        <w:t xml:space="preserve">v        </w:t>
+      </w:r>
+      <w:r>
+        <w:rPr>
+          <w:rStyle w:val="CommentTok"/>
+        </w:rPr>
+        <w:t xml:space="preserve"># detenerse en el primer fallo, con detalle</w:t>
+      </w:r>
+    </w:p>
+    <w:p>
+      <w:r>
+        <w:pict>
+          <v:rect style="width:0;height:1.5pt" o:hralign="center" o:hrstd="t" o:hr="t"/>
+        </w:pict>
+      </w:r>
+    </w:p>
+    <w:bookmarkEnd w:id="48"/>
+    <w:bookmarkStart w:id="49" w:name="Xe5b9ca0edd62c85c4b69fc58d4dbf323c98dc91"/>
+    <w:p>
+      <w:pPr>
+        <w:pStyle w:val="Heading1"/>
+      </w:pPr>
+      <w:r>
+        <w:t xml:space="preserve">8. Ejecutar el proyecto en local</w:t>
+      </w:r>
+    </w:p>
+    <w:p>
+      <w:pPr>
+        <w:pStyle w:val="FirstParagraph"/>
+      </w:pPr>
+      <w:r>
+        <w:t xml:space="preserve">Desde la Sesión 6 el panel pide</w:t>
+      </w:r>
+      <w:r>
+        <w:t xml:space="preserve"> </w:t>
+      </w:r>
+      <w:r>
+        <w:rPr>
+          <w:b/>
+          <w:bCs/>
+        </w:rPr>
+        <w:t xml:space="preserve">usuario y contraseña</w:t>
+      </w:r>
+      <w:r>
+        <w:t xml:space="preserve">. Para empezar hay que crear el primer</w:t>
+      </w:r>
+      <w:r>
+        <w:t xml:space="preserve"> </w:t>
+      </w:r>
+      <w:r>
+        <w:t xml:space="preserve">Administrador de sistema (</w:t>
+      </w:r>
+      <w:r>
+        <w:rPr>
+          <w:rStyle w:val="VerbatimChar"/>
+        </w:rPr>
+        <w:t xml:space="preserve">flota crear-usuario</w:t>
+      </w:r>
+      <w:r>
+        <w:t xml:space="preserve">), o cargar los datos de ejemplo, que traen un</w:t>
+      </w:r>
+      <w:r>
+        <w:t xml:space="preserve"> </w:t>
+      </w:r>
+      <w:r>
+        <w:t xml:space="preserve">usuario por rol con la contraseña</w:t>
+      </w:r>
+      <w:r>
+        <w:t xml:space="preserve"> </w:t>
+      </w:r>
+      <w:r>
+        <w:rPr>
+          <w:rStyle w:val="VerbatimChar"/>
+        </w:rPr>
+        <w:t xml:space="preserve">demo1234</w:t>
+      </w:r>
+      <w:r>
+        <w:t xml:space="preserve"> </w:t>
+      </w:r>
+      <w:r>
+        <w:t xml:space="preserve">(</w:t>
+      </w:r>
+      <w:r>
+        <w:rPr>
+          <w:rStyle w:val="VerbatimChar"/>
+        </w:rPr>
+        <w:t xml:space="preserve">admin@hidalgo.demo</w:t>
+      </w:r>
+      <w:r>
+        <w:t xml:space="preserve">,</w:t>
+      </w:r>
+      <w:r>
+        <w:t xml:space="preserve"> </w:t>
+      </w:r>
+      <w:r>
+        <w:rPr>
+          <w:rStyle w:val="VerbatimChar"/>
+        </w:rPr>
+        <w:t xml:space="preserve">gerencia@hidalgo.demo</w:t>
+      </w:r>
+      <w:r>
+        <w:t xml:space="preserve">, …).</w:t>
+      </w:r>
+    </w:p>
+    <w:p>
+      <w:pPr>
+        <w:pStyle w:val="BodyText"/>
+      </w:pPr>
+      <w:r>
+        <w:rPr>
+          <w:b/>
+          <w:bCs/>
+        </w:rPr>
+        <w:t xml:space="preserve">Con PostgreSQL</w:t>
+      </w:r>
+      <w:r>
+        <w:t xml:space="preserve"> </w:t>
+      </w:r>
+      <w:r>
+        <w:t xml:space="preserve">(requiere</w:t>
+      </w:r>
+      <w:r>
+        <w:t xml:space="preserve"> </w:t>
+      </w:r>
+      <w:r>
+        <w:rPr>
+          <w:rStyle w:val="VerbatimChar"/>
+        </w:rPr>
+        <w:t xml:space="preserve">DB_PASSWORD</w:t>
+      </w:r>
+      <w:r>
+        <w:t xml:space="preserve"> </w:t>
+      </w:r>
+      <w:r>
+        <w:t xml:space="preserve">y</w:t>
+      </w:r>
+      <w:r>
+        <w:t xml:space="preserve"> </w:t>
+      </w:r>
+      <w:r>
+        <w:rPr>
+          <w:rStyle w:val="VerbatimChar"/>
+        </w:rPr>
+        <w:t xml:space="preserve">SECRET_KEY</w:t>
+      </w:r>
+      <w:r>
+        <w:t xml:space="preserve"> </w:t>
+      </w:r>
+      <w:r>
+        <w:t xml:space="preserve">en</w:t>
+      </w:r>
+      <w:r>
+        <w:t xml:space="preserve"> </w:t>
+      </w:r>
+      <w:r>
+        <w:rPr>
+          <w:rStyle w:val="VerbatimChar"/>
+        </w:rPr>
+        <w:t xml:space="preserve">.env</w:t>
+      </w:r>
+      <w:r>
+        <w:t xml:space="preserve">):</w:t>
+      </w:r>
+    </w:p>
+    <w:p>
+      <w:pPr>
+        <w:pStyle w:val="SourceCode"/>
+      </w:pPr>
+      <w:r>
+        <w:rPr>
+          <w:rStyle w:val="NormalTok"/>
+        </w:rPr>
+        <w:t xml:space="preserve">uv run flota crear-db</w:t>
+      </w:r>
+      <w:r>
+        <w:br/>
+      </w:r>
+      <w:r>
+        <w:rPr>
+          <w:rStyle w:val="NormalTok"/>
+        </w:rPr>
+        <w:t xml:space="preserve">uv run alembic upgrade head</w:t>
+      </w:r>
+      <w:r>
+        <w:br/>
+      </w:r>
+      <w:r>
+        <w:rPr>
+          <w:rStyle w:val="NormalTok"/>
+        </w:rPr>
+        <w:t xml:space="preserve">uv run flota crear-usuario admin@empresa</w:t>
+      </w:r>
+      <w:r>
+        <w:rPr>
+          <w:rStyle w:val="OperatorTok"/>
+        </w:rPr>
+        <w:t xml:space="preserve">.</w:t>
+      </w:r>
+      <w:r>
+        <w:rPr>
+          <w:rStyle w:val="FunctionTok"/>
+        </w:rPr>
+        <w:t xml:space="preserve">com</w:t>
+      </w:r>
+      <w:r>
+        <w:rPr>
+          <w:rStyle w:val="NormalTok"/>
+        </w:rPr>
+        <w:t xml:space="preserve"> </w:t>
+      </w:r>
+      <w:r>
+        <w:rPr>
+          <w:rStyle w:val="StringTok"/>
+        </w:rPr>
+        <w:t xml:space="preserve">"Nombre"</w:t>
+      </w:r>
+      <w:r>
+        <w:rPr>
+          <w:rStyle w:val="NormalTok"/>
+        </w:rPr>
+        <w:t xml:space="preserve">   </w:t>
+      </w:r>
+      <w:r>
+        <w:rPr>
+          <w:rStyle w:val="CommentTok"/>
+        </w:rPr>
+        <w:t xml:space="preserve"># pide la contraseña (ROL-07)</w:t>
+      </w:r>
+      <w:r>
+        <w:br/>
+      </w:r>
+      <w:r>
+        <w:rPr>
+          <w:rStyle w:val="NormalTok"/>
+        </w:rPr>
+        <w:t xml:space="preserve">uv run flota datos-demo        </w:t>
+      </w:r>
+      <w:r>
+        <w:rPr>
+          <w:rStyle w:val="CommentTok"/>
+        </w:rPr>
+        <w:t xml:space="preserve"># opcional: 2 camiones, 2 rutas, 8 viajes ida cargado / regreso vacío</w:t>
+      </w:r>
+      <w:r>
+        <w:br/>
+      </w:r>
+      <w:r>
+        <w:rPr>
+          <w:rStyle w:val="NormalTok"/>
+        </w:rPr>
+        <w:t xml:space="preserve">uv run flota servidor          </w:t>
+      </w:r>
+      <w:r>
+        <w:rPr>
+          <w:rStyle w:val="CommentTok"/>
+        </w:rPr>
+        <w:t xml:space="preserve"># http://127.0.0.1:8000 · API en /docs</w:t>
+      </w:r>
+    </w:p>
+    <w:p>
+      <w:pPr>
+        <w:pStyle w:val="FirstParagraph"/>
+      </w:pPr>
+      <w:r>
+        <w:rPr>
+          <w:b/>
+          <w:bCs/>
+        </w:rPr>
+        <w:t xml:space="preserve">Con SQLite, para probar rápido</w:t>
+      </w:r>
+      <w:r>
+        <w:t xml:space="preserve"> </w:t>
+      </w:r>
+      <w:r>
+        <w:t xml:space="preserve">(sin contraseña, base en un archivo):</w:t>
+      </w:r>
+    </w:p>
+    <w:p>
+      <w:pPr>
+        <w:pStyle w:val="SourceCode"/>
+      </w:pPr>
+      <w:r>
+        <w:rPr>
+          <w:rStyle w:val="VariableTok"/>
+        </w:rPr>
+        <w:t xml:space="preserve">$env</w:t>
+      </w:r>
+      <w:r>
+        <w:rPr>
+          <w:rStyle w:val="OperatorTok"/>
+        </w:rPr>
+        <w:t xml:space="preserve">:</w:t>
+      </w:r>
+      <w:r>
+        <w:rPr>
+          <w:rStyle w:val="VariableTok"/>
+        </w:rPr>
+        <w:t xml:space="preserve">DATABASE_URL</w:t>
+      </w:r>
+      <w:r>
+        <w:rPr>
+          <w:rStyle w:val="NormalTok"/>
+        </w:rPr>
+        <w:t xml:space="preserve"> </w:t>
+      </w:r>
+      <w:r>
+        <w:rPr>
+          <w:rStyle w:val="OperatorTok"/>
+        </w:rPr>
+        <w:t xml:space="preserve">=</w:t>
+      </w:r>
+      <w:r>
+        <w:rPr>
+          <w:rStyle w:val="NormalTok"/>
+        </w:rPr>
+        <w:t xml:space="preserve"> </w:t>
+      </w:r>
+      <w:r>
+        <w:rPr>
+          <w:rStyle w:val="StringTok"/>
+        </w:rPr>
+        <w:t xml:space="preserve">"sqlite:///flota-prueba.db"</w:t>
+      </w:r>
+      <w:r>
+        <w:br/>
+      </w:r>
+      <w:r>
+        <w:rPr>
+          <w:rStyle w:val="NormalTok"/>
+        </w:rPr>
+        <w:t xml:space="preserve">uv run alembic upgrade head</w:t>
+      </w:r>
+      <w:r>
+        <w:br/>
+      </w:r>
+      <w:r>
+        <w:rPr>
+          <w:rStyle w:val="NormalTok"/>
+        </w:rPr>
+        <w:t xml:space="preserve">uv run flota datos-demo</w:t>
+      </w:r>
+      <w:r>
+        <w:br/>
+      </w:r>
+      <w:r>
+        <w:rPr>
+          <w:rStyle w:val="NormalTok"/>
+        </w:rPr>
+        <w:t xml:space="preserve">uv run flota servidor</w:t>
+      </w:r>
+    </w:p>
+    <w:p>
+      <w:pPr>
+        <w:pStyle w:val="BlockText"/>
+      </w:pPr>
+      <w:r>
+        <w:t xml:space="preserve">El archivo</w:t>
+      </w:r>
+      <w:r>
+        <w:t xml:space="preserve"> </w:t>
+      </w:r>
+      <w:r>
+        <w:rPr>
+          <w:rStyle w:val="VerbatimChar"/>
+        </w:rPr>
+        <w:t xml:space="preserve">.db</w:t>
+      </w:r>
+      <w:r>
+        <w:t xml:space="preserve"> </w:t>
+      </w:r>
+      <w:r>
+        <w:t xml:space="preserve">está en</w:t>
+      </w:r>
+      <w:r>
+        <w:t xml:space="preserve"> </w:t>
+      </w:r>
+      <w:r>
+        <w:rPr>
+          <w:rStyle w:val="VerbatimChar"/>
+        </w:rPr>
+        <w:t xml:space="preserve">.gitignore</w:t>
+      </w:r>
+      <w:r>
+        <w:t xml:space="preserve"> </w:t>
+      </w:r>
+      <w:r>
+        <w:t xml:space="preserve">(no se sube). Los datos de SQLite no pasan a PostgreSQL.</w:t>
+      </w:r>
+    </w:p>
+    <w:p>
+      <w:r>
+        <w:pict>
+          <v:rect style="width:0;height:1.5pt" o:hralign="center" o:hrstd="t" o:hr="t"/>
+        </w:pict>
+      </w:r>
+    </w:p>
+    <w:bookmarkEnd w:id="49"/>
+    <w:bookmarkStart w:id="50" w:name="X56571861d2af40b24359ed2f824d150b144acc0"/>
+    <w:p>
+      <w:pPr>
+        <w:pStyle w:val="Heading1"/>
+      </w:pPr>
+      <w:r>
+        <w:t xml:space="preserve">9. Cómo agregar una funcionalidad nueva</w:t>
+      </w:r>
+    </w:p>
+    <w:p>
+      <w:pPr>
+        <w:pStyle w:val="FirstParagraph"/>
+      </w:pPr>
+      <w:r>
+        <w:t xml:space="preserve">Casi todo requerimiento sigue el mismo camino, de adentro hacia afuera,</w:t>
+      </w:r>
+      <w:r>
+        <w:t xml:space="preserve"> </w:t>
+      </w:r>
+      <w:r>
+        <w:rPr>
+          <w:b/>
+          <w:bCs/>
+        </w:rPr>
+        <w:t xml:space="preserve">dentro de su módulo</w:t>
+      </w:r>
+      <w:r>
+        <w:t xml:space="preserve">:</w:t>
       </w:r>
     </w:p>
     <w:p>
@@ -12508,11 +12779,30 @@
         <w:pStyle w:val="Compact"/>
         <w:numPr>
           <w:ilvl w:val="0"/>
-          <w:numId w:val="1021"/>
+          <w:numId w:val="1022"/>
         </w:numPr>
       </w:pPr>
       <w:r>
-        <w:t xml:space="preserve">combustible/domain/consumo.py y test_consumo.py</w:t>
+        <w:rPr>
+          <w:b/>
+          <w:bCs/>
+        </w:rPr>
+        <w:t xml:space="preserve">Dominio</w:t>
+      </w:r>
+      <w:r>
+        <w:t xml:space="preserve"> </w:t>
+      </w:r>
+      <w:r>
+        <w:t xml:space="preserve">(</w:t>
+      </w:r>
+      <w:r>
+        <w:rPr>
+          <w:rStyle w:val="VerbatimChar"/>
+        </w:rPr>
+        <w:t xml:space="preserve">&lt;modulo&gt;/domain/</w:t>
+      </w:r>
+      <w:r>
+        <w:t xml:space="preserve">): entidad, campo o regla + test unitario.</w:t>
       </w:r>
     </w:p>
     <w:p>
@@ -12520,11 +12810,100 @@
         <w:pStyle w:val="Compact"/>
         <w:numPr>
           <w:ilvl w:val="0"/>
-          <w:numId w:val="1021"/>
+          <w:numId w:val="1022"/>
         </w:numPr>
       </w:pPr>
       <w:r>
-        <w:t xml:space="preserve">viajes/application/casos_de_uso.py → fakes.py → escenarios.py</w:t>
+        <w:rPr>
+          <w:b/>
+          <w:bCs/>
+        </w:rPr>
+        <w:t xml:space="preserve">Aplicación</w:t>
+      </w:r>
+      <w:r>
+        <w:t xml:space="preserve"> </w:t>
+      </w:r>
+      <w:r>
+        <w:t xml:space="preserve">(</w:t>
+      </w:r>
+      <w:r>
+        <w:rPr>
+          <w:rStyle w:val="VerbatimChar"/>
+        </w:rPr>
+        <w:t xml:space="preserve">&lt;modulo&gt;/application/</w:t>
+      </w:r>
+      <w:r>
+        <w:t xml:space="preserve">): caso de uso (con su código CU/RF en el docstring) +</w:t>
+      </w:r>
+      <w:r>
+        <w:t xml:space="preserve"> </w:t>
+      </w:r>
+      <w:r>
+        <w:t xml:space="preserve">test con fakes. Si necesita un repositorio nuevo, agregarlo al</w:t>
+      </w:r>
+      <w:r>
+        <w:t xml:space="preserve"> </w:t>
+      </w:r>
+      <w:r>
+        <w:rPr>
+          <w:rStyle w:val="VerbatimChar"/>
+        </w:rPr>
+        <w:t xml:space="preserve">UoW&lt;Modulo&gt;</w:t>
+      </w:r>
+      <w:r>
+        <w:t xml:space="preserve"> </w:t>
+      </w:r>
+      <w:r>
+        <w:t xml:space="preserve">del módulo.</w:t>
+      </w:r>
+      <w:r>
+        <w:t xml:space="preserve"> </w:t>
+      </w:r>
+      <w:r>
+        <w:t xml:space="preserve">Si otro módulo tiene que reaccionar, publicar un</w:t>
+      </w:r>
+      <w:r>
+        <w:t xml:space="preserve"> </w:t>
+      </w:r>
+      <w:r>
+        <w:rPr>
+          <w:b/>
+          <w:bCs/>
+        </w:rPr>
+        <w:t xml:space="preserve">evento</w:t>
+      </w:r>
+      <w:r>
+        <w:t xml:space="preserve"> </w:t>
+      </w:r>
+      <w:r>
+        <w:t xml:space="preserve">(</w:t>
+      </w:r>
+      <w:r>
+        <w:rPr>
+          <w:rStyle w:val="VerbatimChar"/>
+        </w:rPr>
+        <w:t xml:space="preserve">uow.registrar_evento(...)</w:t>
+      </w:r>
+      <w:r>
+        <w:t xml:space="preserve">) en</w:t>
+      </w:r>
+      <w:r>
+        <w:t xml:space="preserve"> </w:t>
+      </w:r>
+      <w:r>
+        <w:t xml:space="preserve">lugar de llamarlo directamente, y suscribir el manejador en</w:t>
+      </w:r>
+      <w:r>
+        <w:t xml:space="preserve"> </w:t>
+      </w:r>
+      <w:r>
+        <w:rPr>
+          <w:rStyle w:val="VerbatimChar"/>
+        </w:rPr>
+        <w:t xml:space="preserve">bootstrap.py</w:t>
+      </w:r>
+      <w:r>
+        <w:t xml:space="preserve">.</w:t>
       </w:r>
     </w:p>
     <w:p>
@@ -12532,11 +12911,93 @@
         <w:pStyle w:val="Compact"/>
         <w:numPr>
           <w:ilvl w:val="0"/>
-          <w:numId w:val="1021"/>
+          <w:numId w:val="1022"/>
         </w:numPr>
       </w:pPr>
       <w:r>
-        <w:t xml:space="preserve">viajes/infrastructure/ y la migración de la Sesión 4</w:t>
+        <w:rPr>
+          <w:b/>
+          <w:bCs/>
+        </w:rPr>
+        <w:t xml:space="preserve">Infraestructura</w:t>
+      </w:r>
+      <w:r>
+        <w:t xml:space="preserve"> </w:t>
+      </w:r>
+      <w:r>
+        <w:t xml:space="preserve">(</w:t>
+      </w:r>
+      <w:r>
+        <w:rPr>
+          <w:rStyle w:val="VerbatimChar"/>
+        </w:rPr>
+        <w:t xml:space="preserve">&lt;modulo&gt;/infrastructure/</w:t>
+      </w:r>
+      <w:r>
+        <w:t xml:space="preserve">): tabla en</w:t>
+      </w:r>
+      <w:r>
+        <w:t xml:space="preserve"> </w:t>
+      </w:r>
+      <w:r>
+        <w:rPr>
+          <w:rStyle w:val="VerbatimChar"/>
+        </w:rPr>
+        <w:t xml:space="preserve">modelos.py</w:t>
+      </w:r>
+      <w:r>
+        <w:t xml:space="preserve">, repositorio SQL; registrarlo</w:t>
+      </w:r>
+      <w:r>
+        <w:t xml:space="preserve"> </w:t>
+      </w:r>
+      <w:r>
+        <w:t xml:space="preserve">en unidad_de_trabajo.py y el módulo de modelos en</w:t>
+      </w:r>
+      <w:r>
+        <w:t xml:space="preserve"> </w:t>
+      </w:r>
+      <w:r>
+        <w:t xml:space="preserve">modelos.py. Migración con Alembic (revisar el borrador; probar</w:t>
+      </w:r>
+      <w:r>
+        <w:t xml:space="preserve"> </w:t>
+      </w:r>
+      <w:r>
+        <w:rPr>
+          <w:rStyle w:val="VerbatimChar"/>
+        </w:rPr>
+        <w:t xml:space="preserve">upgrade</w:t>
+      </w:r>
+      <w:r>
+        <w:t xml:space="preserve">,</w:t>
+      </w:r>
+      <w:r>
+        <w:t xml:space="preserve"> </w:t>
+      </w:r>
+      <w:r>
+        <w:rPr>
+          <w:rStyle w:val="VerbatimChar"/>
+        </w:rPr>
+        <w:t xml:space="preserve">downgrade</w:t>
+      </w:r>
+      <w:r>
+        <w:t xml:space="preserve"> </w:t>
+      </w:r>
+      <w:r>
+        <w:t xml:space="preserve">y</w:t>
+      </w:r>
+      <w:r>
+        <w:t xml:space="preserve"> </w:t>
+      </w:r>
+      <w:r>
+        <w:rPr>
+          <w:rStyle w:val="VerbatimChar"/>
+        </w:rPr>
+        <w:t xml:space="preserve">check</w:t>
+      </w:r>
+      <w:r>
+        <w:t xml:space="preserve">).</w:t>
       </w:r>
     </w:p>
     <w:p>
@@ -12544,34 +13005,126 @@
         <w:pStyle w:val="Compact"/>
         <w:numPr>
           <w:ilvl w:val="0"/>
-          <w:numId w:val="1021"/>
+          <w:numId w:val="1022"/>
         </w:numPr>
       </w:pPr>
       <w:r>
-        <w:t xml:space="preserve">viajes/presentation/ → main.py → bootstrap.py</w:t>
-      </w:r>
-    </w:p>
-    <w:p>
-      <w:pPr>
-        <w:pStyle w:val="FirstParagraph"/>
-      </w:pPr>
-      <w:r>
-        <w:t xml:space="preserve">Ejercicio: cambiar un valor en un test, correr</w:t>
-      </w:r>
-      <w:r>
-        <w:t xml:space="preserve"> </w:t>
-      </w:r>
-      <w:r>
-        <w:rPr>
-          <w:rStyle w:val="VerbatimChar"/>
-        </w:rPr>
-        <w:t xml:space="preserve">pytest</w:t>
-      </w:r>
-      <w:r>
-        <w:t xml:space="preserve"> </w:t>
-      </w:r>
-      <w:r>
-        <w:t xml:space="preserve">y leer el error. Es la forma más rápida de entender cada pieza.</w:t>
+        <w:rPr>
+          <w:b/>
+          <w:bCs/>
+        </w:rPr>
+        <w:t xml:space="preserve">Presentación</w:t>
+      </w:r>
+      <w:r>
+        <w:t xml:space="preserve"> </w:t>
+      </w:r>
+      <w:r>
+        <w:t xml:space="preserve">(</w:t>
+      </w:r>
+      <w:r>
+        <w:rPr>
+          <w:rStyle w:val="VerbatimChar"/>
+        </w:rPr>
+        <w:t xml:space="preserve">&lt;modulo&gt;/presentation/</w:t>
+      </w:r>
+      <w:r>
+        <w:t xml:space="preserve">): esquema Pydantic +</w:t>
+      </w:r>
+      <w:r>
+        <w:t xml:space="preserve"> </w:t>
+      </w:r>
+      <w:r>
+        <w:rPr>
+          <w:rStyle w:val="VerbatimChar"/>
+        </w:rPr>
+        <w:t xml:space="preserve">api.py</w:t>
+      </w:r>
+      <w:r>
+        <w:t xml:space="preserve"> </w:t>
+      </w:r>
+      <w:r>
+        <w:t xml:space="preserve">y/o</w:t>
+      </w:r>
+      <w:r>
+        <w:t xml:space="preserve"> </w:t>
+      </w:r>
+      <w:r>
+        <w:rPr>
+          <w:rStyle w:val="VerbatimChar"/>
+        </w:rPr>
+        <w:t xml:space="preserve">web.py</w:t>
+      </w:r>
+      <w:r>
+        <w:t xml:space="preserve">; registrar</w:t>
+      </w:r>
+      <w:r>
+        <w:t xml:space="preserve"> </w:t>
+      </w:r>
+      <w:r>
+        <w:t xml:space="preserve">el router en main.py + test de integración.</w:t>
+      </w:r>
+    </w:p>
+    <w:p>
+      <w:pPr>
+        <w:pStyle w:val="Compact"/>
+        <w:numPr>
+          <w:ilvl w:val="0"/>
+          <w:numId w:val="1022"/>
+        </w:numPr>
+      </w:pPr>
+      <w:r>
+        <w:rPr>
+          <w:rStyle w:val="VerbatimChar"/>
+        </w:rPr>
+        <w:t xml:space="preserve">uv run pytest</w:t>
+      </w:r>
+      <w:r>
+        <w:t xml:space="preserve"> </w:t>
+      </w:r>
+      <w:r>
+        <w:t xml:space="preserve">y</w:t>
+      </w:r>
+      <w:r>
+        <w:t xml:space="preserve"> </w:t>
+      </w:r>
+      <w:r>
+        <w:rPr>
+          <w:rStyle w:val="VerbatimChar"/>
+        </w:rPr>
+        <w:t xml:space="preserve">uv run ruff check .</w:t>
+      </w:r>
+      <w:r>
+        <w:t xml:space="preserve"> </w:t>
+      </w:r>
+      <w:r>
+        <w:t xml:space="preserve">en verde; nota de la sesión en</w:t>
+      </w:r>
+      <w:r>
+        <w:t xml:space="preserve"> </w:t>
+      </w:r>
+      <w:r>
+        <w:rPr>
+          <w:rStyle w:val="VerbatimChar"/>
+        </w:rPr>
+        <w:t xml:space="preserve">docs/sesiones/</w:t>
+      </w:r>
+      <w:r>
+        <w:t xml:space="preserve">; actualizar</w:t>
+      </w:r>
+      <w:r>
+        <w:t xml:space="preserve"> </w:t>
+      </w:r>
+      <w:r>
+        <w:t xml:space="preserve">esta guía y regenerar los Word (</w:t>
+      </w:r>
+      <w:r>
+        <w:rPr>
+          <w:rStyle w:val="VerbatimChar"/>
+        </w:rPr>
+        <w:t xml:space="preserve">uv run python scripts/generar_word.py</w:t>
+      </w:r>
+      <w:r>
+        <w:t xml:space="preserve">).</w:t>
       </w:r>
     </w:p>
     <w:p>
@@ -12581,8 +13134,128 @@
         </w:pict>
       </w:r>
     </w:p>
-    <w:bookmarkEnd w:id="49"/>
-    <w:bookmarkStart w:id="50" w:name="Xaff99713d53c8dd2217ee2bf0bf411d6bf29f1a"/>
+    <w:bookmarkEnd w:id="50"/>
+    <w:bookmarkStart w:id="51" w:name="X09bcc076eb5122c50326e7c228eb7775fb4a6ab"/>
+    <w:p>
+      <w:pPr>
+        <w:pStyle w:val="Heading1"/>
+      </w:pPr>
+      <w:r>
+        <w:t xml:space="preserve">10. Ruta de estudio sugerida</w:t>
+      </w:r>
+    </w:p>
+    <w:p>
+      <w:pPr>
+        <w:pStyle w:val="FirstParagraph"/>
+      </w:pPr>
+      <w:r>
+        <w:t xml:space="preserve">De lo más puro a lo más técnico:</w:t>
+      </w:r>
+    </w:p>
+    <w:p>
+      <w:pPr>
+        <w:pStyle w:val="Compact"/>
+        <w:numPr>
+          <w:ilvl w:val="0"/>
+          <w:numId w:val="1023"/>
+        </w:numPr>
+      </w:pPr>
+      <w:r>
+        <w:t xml:space="preserve">shared/domain/ → catalogo/domain/entidades.py</w:t>
+      </w:r>
+    </w:p>
+    <w:p>
+      <w:pPr>
+        <w:pStyle w:val="Compact"/>
+        <w:numPr>
+          <w:ilvl w:val="0"/>
+          <w:numId w:val="1023"/>
+        </w:numPr>
+      </w:pPr>
+      <w:r>
+        <w:t xml:space="preserve">viajes/domain/entidades.py (agregado viaje + tramos) y su test test_viajes.py</w:t>
+      </w:r>
+    </w:p>
+    <w:p>
+      <w:pPr>
+        <w:pStyle w:val="Compact"/>
+        <w:numPr>
+          <w:ilvl w:val="0"/>
+          <w:numId w:val="1023"/>
+        </w:numPr>
+      </w:pPr>
+      <w:r>
+        <w:t xml:space="preserve">combustible/domain/consumo.py y test_consumo.py</w:t>
+      </w:r>
+    </w:p>
+    <w:p>
+      <w:pPr>
+        <w:pStyle w:val="Compact"/>
+        <w:numPr>
+          <w:ilvl w:val="0"/>
+          <w:numId w:val="1023"/>
+        </w:numPr>
+      </w:pPr>
+      <w:r>
+        <w:t xml:space="preserve">viajes/application/casos_de_uso.py → fakes.py → escenarios.py</w:t>
+      </w:r>
+    </w:p>
+    <w:p>
+      <w:pPr>
+        <w:pStyle w:val="Compact"/>
+        <w:numPr>
+          <w:ilvl w:val="0"/>
+          <w:numId w:val="1023"/>
+        </w:numPr>
+      </w:pPr>
+      <w:r>
+        <w:t xml:space="preserve">viajes/infrastructure/ y la migración de la Sesión 4</w:t>
+      </w:r>
+    </w:p>
+    <w:p>
+      <w:pPr>
+        <w:pStyle w:val="Compact"/>
+        <w:numPr>
+          <w:ilvl w:val="0"/>
+          <w:numId w:val="1023"/>
+        </w:numPr>
+      </w:pPr>
+      <w:r>
+        <w:t xml:space="preserve">viajes/presentation/ → main.py → bootstrap.py</w:t>
+      </w:r>
+    </w:p>
+    <w:p>
+      <w:pPr>
+        <w:pStyle w:val="FirstParagraph"/>
+      </w:pPr>
+      <w:r>
+        <w:t xml:space="preserve">Ejercicio: cambiar un valor en un test, correr</w:t>
+      </w:r>
+      <w:r>
+        <w:t xml:space="preserve"> </w:t>
+      </w:r>
+      <w:r>
+        <w:rPr>
+          <w:rStyle w:val="VerbatimChar"/>
+        </w:rPr>
+        <w:t xml:space="preserve">pytest</w:t>
+      </w:r>
+      <w:r>
+        <w:t xml:space="preserve"> </w:t>
+      </w:r>
+      <w:r>
+        <w:t xml:space="preserve">y leer el error. Es la forma más rápida de entender cada pieza.</w:t>
+      </w:r>
+    </w:p>
+    <w:p>
+      <w:r>
+        <w:pict>
+          <v:rect style="width:0;height:1.5pt" o:hralign="center" o:hrstd="t" o:hr="t"/>
+        </w:pict>
+      </w:r>
+    </w:p>
+    <w:bookmarkEnd w:id="51"/>
+    <w:bookmarkStart w:id="52" w:name="Xaff99713d53c8dd2217ee2bf0bf411d6bf29f1a"/>
     <w:p>
       <w:pPr>
         <w:pStyle w:val="Heading1"/>
@@ -12795,7 +13468,7 @@
         <w:pStyle w:val="Compact"/>
         <w:numPr>
           <w:ilvl w:val="0"/>
-          <w:numId w:val="1022"/>
+          <w:numId w:val="1024"/>
         </w:numPr>
       </w:pPr>
       <w:r>
@@ -12880,7 +13553,7 @@
         <w:pStyle w:val="Compact"/>
         <w:numPr>
           <w:ilvl w:val="0"/>
-          <w:numId w:val="1022"/>
+          <w:numId w:val="1024"/>
         </w:numPr>
       </w:pPr>
       <w:r>
@@ -12924,7 +13597,7 @@
         <w:pStyle w:val="Compact"/>
         <w:numPr>
           <w:ilvl w:val="0"/>
-          <w:numId w:val="1022"/>
+          <w:numId w:val="1024"/>
         </w:numPr>
       </w:pPr>
       <w:r>
@@ -12983,7 +13656,7 @@
         <w:pStyle w:val="Compact"/>
         <w:numPr>
           <w:ilvl w:val="0"/>
-          <w:numId w:val="1023"/>
+          <w:numId w:val="1025"/>
         </w:numPr>
       </w:pPr>
       <w:r>
@@ -13002,7 +13675,7 @@
         <w:pStyle w:val="Compact"/>
         <w:numPr>
           <w:ilvl w:val="0"/>
-          <w:numId w:val="1023"/>
+          <w:numId w:val="1025"/>
         </w:numPr>
       </w:pPr>
       <w:r>
@@ -13046,8 +13719,8 @@
         </w:pict>
       </w:r>
     </w:p>
-    <w:bookmarkEnd w:id="50"/>
-    <w:bookmarkStart w:id="51" w:name="X1d363b18720bb914512b1a76520b6e503abdb90"/>
+    <w:bookmarkEnd w:id="52"/>
+    <w:bookmarkStart w:id="53" w:name="X1d363b18720bb914512b1a76520b6e503abdb90"/>
     <w:p>
       <w:pPr>
         <w:pStyle w:val="Heading1"/>
@@ -13819,6 +14492,105 @@
           </w:p>
         </w:tc>
       </w:tr>
+      <w:tr>
+        <w:tc>
+          <w:tcPr/>
+          <w:p>
+            <w:pPr>
+              <w:pStyle w:val="Compact"/>
+            </w:pPr>
+            <w:r>
+              <w:rPr>
+                <w:b/>
+                <w:bCs/>
+              </w:rPr>
+              <w:t xml:space="preserve">Comprobante</w:t>
+            </w:r>
+          </w:p>
+        </w:tc>
+        <w:tc>
+          <w:tcPr/>
+          <w:p>
+            <w:pPr>
+              <w:pStyle w:val="Compact"/>
+            </w:pPr>
+            <w:r>
+              <w:t xml:space="preserve">La foto o PDF de un ticket tal como llegó; de él se crea la carga.</w:t>
+            </w:r>
+          </w:p>
+        </w:tc>
+      </w:tr>
+      <w:tr>
+        <w:tc>
+          <w:tcPr/>
+          <w:p>
+            <w:pPr>
+              <w:pStyle w:val="Compact"/>
+            </w:pPr>
+            <w:r>
+              <w:rPr>
+                <w:b/>
+                <w:bCs/>
+              </w:rPr>
+              <w:t xml:space="preserve">Transacción</w:t>
+            </w:r>
+          </w:p>
+        </w:tc>
+        <w:tc>
+          <w:tcPr/>
+          <w:p>
+            <w:pPr>
+              <w:pStyle w:val="Compact"/>
+            </w:pPr>
+            <w:r>
+              <w:t xml:space="preserve">Grupo de cambios que se guardan todos juntos o ninguno.</w:t>
+            </w:r>
+          </w:p>
+        </w:tc>
+      </w:tr>
+      <w:tr>
+        <w:tc>
+          <w:tcPr/>
+          <w:p>
+            <w:pPr>
+              <w:pStyle w:val="Compact"/>
+            </w:pPr>
+            <w:r>
+              <w:rPr>
+                <w:b/>
+                <w:bCs/>
+              </w:rPr>
+              <w:t xml:space="preserve">Path traversal</w:t>
+            </w:r>
+          </w:p>
+        </w:tc>
+        <w:tc>
+          <w:tcPr/>
+          <w:p>
+            <w:pPr>
+              <w:pStyle w:val="Compact"/>
+            </w:pPr>
+            <w:r>
+              <w:t xml:space="preserve">Ataque que usa</w:t>
+            </w:r>
+            <w:r>
+              <w:t xml:space="preserve"> </w:t>
+            </w:r>
+            <w:r>
+              <w:rPr>
+                <w:rStyle w:val="VerbatimChar"/>
+              </w:rPr>
+              <w:t xml:space="preserve">../</w:t>
+            </w:r>
+            <w:r>
+              <w:t xml:space="preserve"> </w:t>
+            </w:r>
+            <w:r>
+              <w:t xml:space="preserve">en un nombre de archivo para salir de la carpeta.</w:t>
+            </w:r>
+          </w:p>
+        </w:tc>
+      </w:tr>
     </w:tbl>
     <w:p>
       <w:r>
@@ -13827,8 +14599,8 @@
         </w:pict>
       </w:r>
     </w:p>
-    <w:bookmarkEnd w:id="51"/>
-    <w:bookmarkStart w:id="52" w:name="Xa60fcdd724add25c352553ef36901c63604edfb"/>
+    <w:bookmarkEnd w:id="53"/>
+    <w:bookmarkStart w:id="54" w:name="Xa60fcdd724add25c352553ef36901c63604edfb"/>
     <w:p>
       <w:pPr>
         <w:pStyle w:val="Heading1"/>
@@ -14335,6 +15107,109 @@
           </w:p>
         </w:tc>
       </w:tr>
+      <w:tr>
+        <w:tc>
+          <w:tcPr/>
+          <w:p>
+            <w:pPr>
+              <w:pStyle w:val="Compact"/>
+            </w:pPr>
+            <w:r>
+              <w:t xml:space="preserve">2026-10-26</w:t>
+            </w:r>
+          </w:p>
+        </w:tc>
+        <w:tc>
+          <w:tcPr/>
+          <w:p>
+            <w:pPr>
+              <w:pStyle w:val="Compact"/>
+            </w:pPr>
+            <w:r>
+              <w:rPr>
+                <w:b/>
+                <w:bCs/>
+              </w:rPr>
+              <w:t xml:space="preserve">Sesión 7</w:t>
+            </w:r>
+            <w:r>
+              <w:t xml:space="preserve">: módulo</w:t>
+            </w:r>
+            <w:r>
+              <w:t xml:space="preserve"> </w:t>
+            </w:r>
+            <w:r>
+              <w:rPr>
+                <w:rStyle w:val="VerbatimChar"/>
+              </w:rPr>
+              <w:t xml:space="preserve">comprobantes</w:t>
+            </w:r>
+            <w:r>
+              <w:t xml:space="preserve"> </w:t>
+            </w:r>
+            <w:r>
+              <w:t xml:space="preserve">(foto o PDF del ticket, pendientes, validación CU-02, descarte), almacenamiento de archivos, estado de validación y anulación de cargas, fecha no futura, duplicados (RF-08). Conceptos:</w:t>
+            </w:r>
+            <w:r>
+              <w:t xml:space="preserve"> </w:t>
+            </w:r>
+            <w:r>
+              <w:rPr>
+                <w:rStyle w:val="VerbatimChar"/>
+              </w:rPr>
+              <w:t xml:space="preserve">UploadFile</w:t>
+            </w:r>
+            <w:r>
+              <w:t xml:space="preserve">,</w:t>
+            </w:r>
+            <w:r>
+              <w:t xml:space="preserve"> </w:t>
+            </w:r>
+            <w:r>
+              <w:rPr>
+                <w:rStyle w:val="VerbatimChar"/>
+              </w:rPr>
+              <w:t xml:space="preserve">async</w:t>
+            </w:r>
+            <w:r>
+              <w:t xml:space="preserve">/</w:t>
+            </w:r>
+            <w:r>
+              <w:rPr>
+                <w:rStyle w:val="VerbatimChar"/>
+              </w:rPr>
+              <w:t xml:space="preserve">await</w:t>
+            </w:r>
+            <w:r>
+              <w:t xml:space="preserve">, respuestas binarias,</w:t>
+            </w:r>
+            <w:r>
+              <w:t xml:space="preserve"> </w:t>
+            </w:r>
+            <w:r>
+              <w:rPr>
+                <w:i/>
+                <w:iCs/>
+              </w:rPr>
+              <w:t xml:space="preserve">path traversal</w:t>
+            </w:r>
+            <w:r>
+              <w:t xml:space="preserve">, límites de transacción.</w:t>
+            </w:r>
+          </w:p>
+        </w:tc>
+        <w:tc>
+          <w:tcPr/>
+          <w:p>
+            <w:pPr>
+              <w:pStyle w:val="Compact"/>
+            </w:pPr>
+            <w:r>
+              <w:t xml:space="preserve">1, 4.10, 5, 12</w:t>
+            </w:r>
+          </w:p>
+        </w:tc>
+      </w:tr>
     </w:tbl>
     <w:p>
       <w:pPr>
@@ -14371,10 +15246,16 @@
         <w:t xml:space="preserve"> </w:t>
       </w:r>
       <w:r>
-        <w:t xml:space="preserve">06 · Usuarios, roles y auditoría</w:t>
-      </w:r>
-    </w:p>
-    <w:bookmarkEnd w:id="52"/>
+        <w:t xml:space="preserve">06 · Usuarios, roles y auditoría ·</w:t>
+      </w:r>
+      <w:r>
+        <w:t xml:space="preserve"> </w:t>
+      </w:r>
+      <w:r>
+        <w:t xml:space="preserve">07 · Tickets y validación</w:t>
+      </w:r>
+    </w:p>
+    <w:bookmarkEnd w:id="54"/>
     <w:sectPr>
       <w:footerReference r:id="rIdPieHidalgo" w:type="default"/>
       <w:footnotePr>
@@ -14894,6 +15775,12 @@
     <w:abstractNumId w:val="991"/>
   </w:num>
   <w:num w:numId="1017">
+    <w:abstractNumId w:val="991"/>
+  </w:num>
+  <w:num w:numId="1018">
+    <w:abstractNumId w:val="991"/>
+  </w:num>
+  <w:num w:numId="1019">
     <w:abstractNumId w:val="99411"/>
     <w:lvlOverride w:ilvl="0">
       <w:startOverride w:val="1"/>
@@ -14922,39 +15809,6 @@
     <w:lvlOverride w:ilvl="8">
       <w:startOverride w:val="1"/>
     </w:lvlOverride>
-  </w:num>
-  <w:num w:numId="1018">
-    <w:abstractNumId w:val="99411"/>
-    <w:lvlOverride w:ilvl="0">
-      <w:startOverride w:val="1"/>
-    </w:lvlOverride>
-    <w:lvlOverride w:ilvl="1">
-      <w:startOverride w:val="1"/>
-    </w:lvlOverride>
-    <w:lvlOverride w:ilvl="2">
-      <w:startOverride w:val="1"/>
-    </w:lvlOverride>
-    <w:lvlOverride w:ilvl="3">
-      <w:startOverride w:val="1"/>
-    </w:lvlOverride>
-    <w:lvlOverride w:ilvl="4">
-      <w:startOverride w:val="1"/>
-    </w:lvlOverride>
-    <w:lvlOverride w:ilvl="5">
-      <w:startOverride w:val="1"/>
-    </w:lvlOverride>
-    <w:lvlOverride w:ilvl="6">
-      <w:startOverride w:val="1"/>
-    </w:lvlOverride>
-    <w:lvlOverride w:ilvl="7">
-      <w:startOverride w:val="1"/>
-    </w:lvlOverride>
-    <w:lvlOverride w:ilvl="8">
-      <w:startOverride w:val="1"/>
-    </w:lvlOverride>
-  </w:num>
-  <w:num w:numId="1019">
-    <w:abstractNumId w:val="991"/>
   </w:num>
   <w:num w:numId="1020">
     <w:abstractNumId w:val="99411"/>
@@ -14987,34 +15841,7 @@
     </w:lvlOverride>
   </w:num>
   <w:num w:numId="1021">
-    <w:abstractNumId w:val="99411"/>
-    <w:lvlOverride w:ilvl="0">
-      <w:startOverride w:val="1"/>
-    </w:lvlOverride>
-    <w:lvlOverride w:ilvl="1">
-      <w:startOverride w:val="1"/>
-    </w:lvlOverride>
-    <w:lvlOverride w:ilvl="2">
-      <w:startOverride w:val="1"/>
-    </w:lvlOverride>
-    <w:lvlOverride w:ilvl="3">
-      <w:startOverride w:val="1"/>
-    </w:lvlOverride>
-    <w:lvlOverride w:ilvl="4">
-      <w:startOverride w:val="1"/>
-    </w:lvlOverride>
-    <w:lvlOverride w:ilvl="5">
-      <w:startOverride w:val="1"/>
-    </w:lvlOverride>
-    <w:lvlOverride w:ilvl="6">
-      <w:startOverride w:val="1"/>
-    </w:lvlOverride>
-    <w:lvlOverride w:ilvl="7">
-      <w:startOverride w:val="1"/>
-    </w:lvlOverride>
-    <w:lvlOverride w:ilvl="8">
-      <w:startOverride w:val="1"/>
-    </w:lvlOverride>
+    <w:abstractNumId w:val="991"/>
   </w:num>
   <w:num w:numId="1022">
     <w:abstractNumId w:val="99411"/>
@@ -15047,6 +15874,66 @@
     </w:lvlOverride>
   </w:num>
   <w:num w:numId="1023">
+    <w:abstractNumId w:val="99411"/>
+    <w:lvlOverride w:ilvl="0">
+      <w:startOverride w:val="1"/>
+    </w:lvlOverride>
+    <w:lvlOverride w:ilvl="1">
+      <w:startOverride w:val="1"/>
+    </w:lvlOverride>
+    <w:lvlOverride w:ilvl="2">
+      <w:startOverride w:val="1"/>
+    </w:lvlOverride>
+    <w:lvlOverride w:ilvl="3">
+      <w:startOverride w:val="1"/>
+    </w:lvlOverride>
+    <w:lvlOverride w:ilvl="4">
+      <w:startOverride w:val="1"/>
+    </w:lvlOverride>
+    <w:lvlOverride w:ilvl="5">
+      <w:startOverride w:val="1"/>
+    </w:lvlOverride>
+    <w:lvlOverride w:ilvl="6">
+      <w:startOverride w:val="1"/>
+    </w:lvlOverride>
+    <w:lvlOverride w:ilvl="7">
+      <w:startOverride w:val="1"/>
+    </w:lvlOverride>
+    <w:lvlOverride w:ilvl="8">
+      <w:startOverride w:val="1"/>
+    </w:lvlOverride>
+  </w:num>
+  <w:num w:numId="1024">
+    <w:abstractNumId w:val="99411"/>
+    <w:lvlOverride w:ilvl="0">
+      <w:startOverride w:val="1"/>
+    </w:lvlOverride>
+    <w:lvlOverride w:ilvl="1">
+      <w:startOverride w:val="1"/>
+    </w:lvlOverride>
+    <w:lvlOverride w:ilvl="2">
+      <w:startOverride w:val="1"/>
+    </w:lvlOverride>
+    <w:lvlOverride w:ilvl="3">
+      <w:startOverride w:val="1"/>
+    </w:lvlOverride>
+    <w:lvlOverride w:ilvl="4">
+      <w:startOverride w:val="1"/>
+    </w:lvlOverride>
+    <w:lvlOverride w:ilvl="5">
+      <w:startOverride w:val="1"/>
+    </w:lvlOverride>
+    <w:lvlOverride w:ilvl="6">
+      <w:startOverride w:val="1"/>
+    </w:lvlOverride>
+    <w:lvlOverride w:ilvl="7">
+      <w:startOverride w:val="1"/>
+    </w:lvlOverride>
+    <w:lvlOverride w:ilvl="8">
+      <w:startOverride w:val="1"/>
+    </w:lvlOverride>
+  </w:num>
+  <w:num w:numId="1025">
     <w:abstractNumId w:val="991"/>
   </w:num>
 </w:numbering>

</xml_diff>